<commit_message>
báo cáo chuẩn hóa dữ liệu
</commit_message>
<xml_diff>
--- a/File docs/Báo cáo dự án.docx
+++ b/File docs/Báo cáo dự án.docx
@@ -4873,7 +4873,1035 @@
         </w:rPr>
       </w:pPr>
     </w:p>
-    <w:p/>
+    <w:p>
+      <w:pPr>
+        <w:pStyle w:val="Heading1"/>
+        <w:rPr>
+          <w:rFonts w:cs="Times New Roman"/>
+          <w:lang w:val="vi-VN"/>
+        </w:rPr>
+      </w:pPr>
+      <w:r>
+        <w:rPr>
+          <w:rFonts w:cs="Times New Roman"/>
+        </w:rPr>
+        <w:t>CHƯƠNG</w:t>
+      </w:r>
+      <w:r>
+        <w:rPr>
+          <w:rFonts w:cs="Times New Roman"/>
+          <w:lang w:val="vi-VN"/>
+        </w:rPr>
+        <w:t xml:space="preserve"> 3:  QUY TRÌNH ELT VÀ MÔ HÌNH HÓA DỮ LIỆU </w:t>
+      </w:r>
+    </w:p>
+    <w:p>
+      <w:pPr>
+        <w:pStyle w:val="Heading2"/>
+        <w:rPr>
+          <w:rFonts w:cs="Times New Roman"/>
+          <w:lang w:val="vi-VN"/>
+        </w:rPr>
+      </w:pPr>
+      <w:r>
+        <w:rPr>
+          <w:rFonts w:cs="Times New Roman"/>
+          <w:lang w:val="vi-VN"/>
+        </w:rPr>
+        <w:t xml:space="preserve">3.1 TỔNG QUAN KIẾN TRÚC PIPELINE  XỬ LÍ DỮ LIỆU </w:t>
+      </w:r>
+    </w:p>
+    <w:p>
+      <w:pPr>
+        <w:pStyle w:val="Heading2"/>
+        <w:rPr>
+          <w:rFonts w:cs="Times New Roman"/>
+          <w:lang w:val="vi-VN"/>
+        </w:rPr>
+      </w:pPr>
+      <w:r>
+        <w:rPr>
+          <w:rFonts w:cs="Times New Roman"/>
+          <w:lang w:val="vi-VN"/>
+        </w:rPr>
+        <w:t>3.2 ĐÁNH GIÁ CHẤT LƯỢNG VÀ KHÁM PHÁ DỮ LIỆU (EDA)</w:t>
+      </w:r>
+    </w:p>
+    <w:p>
+      <w:pPr>
+        <w:pStyle w:val="Heading3"/>
+        <w:rPr>
+          <w:rFonts w:ascii="Times New Roman" w:hAnsi="Times New Roman" w:cs="Times New Roman"/>
+          <w:sz w:val="32"/>
+          <w:szCs w:val="32"/>
+          <w:lang w:val="vi-VN"/>
+        </w:rPr>
+      </w:pPr>
+      <w:r>
+        <w:rPr>
+          <w:rFonts w:ascii="Times New Roman" w:hAnsi="Times New Roman" w:cs="Times New Roman"/>
+          <w:sz w:val="32"/>
+          <w:szCs w:val="32"/>
+          <w:lang w:val="vi-VN"/>
+        </w:rPr>
+        <w:t xml:space="preserve">3.2.1  KIỂM TRA DỮ LIỆU THIẾU VÀ TRÙNG LẬP </w:t>
+      </w:r>
+    </w:p>
+    <w:p>
+      <w:pPr>
+        <w:pStyle w:val="Heading2"/>
+        <w:rPr>
+          <w:rFonts w:cs="Times New Roman"/>
+          <w:lang w:val="vi-VN"/>
+        </w:rPr>
+      </w:pPr>
+      <w:r>
+        <w:rPr>
+          <w:rFonts w:cs="Times New Roman"/>
+          <w:lang w:val="vi-VN"/>
+        </w:rPr>
+        <w:t xml:space="preserve">3.3  LÀM SẠCH CHUẨN HÓA DỮ LIỆU  </w:t>
+      </w:r>
+    </w:p>
+    <w:p>
+      <w:pPr>
+        <w:rPr>
+          <w:lang w:val="vi-VN"/>
+        </w:rPr>
+      </w:pPr>
+    </w:p>
+    <w:p>
+      <w:pPr>
+        <w:rPr>
+          <w:lang w:val="vi-VN"/>
+        </w:rPr>
+      </w:pPr>
+    </w:p>
+    <w:p>
+      <w:pPr>
+        <w:rPr>
+          <w:lang w:val="vi-VN"/>
+        </w:rPr>
+      </w:pPr>
+    </w:p>
+    <w:p>
+      <w:pPr>
+        <w:rPr>
+          <w:lang w:val="vi-VN"/>
+        </w:rPr>
+      </w:pPr>
+    </w:p>
+    <w:p>
+      <w:pPr>
+        <w:rPr>
+          <w:lang w:val="vi-VN"/>
+        </w:rPr>
+      </w:pPr>
+    </w:p>
+    <w:p>
+      <w:pPr>
+        <w:pStyle w:val="Heading3"/>
+        <w:rPr>
+          <w:rFonts w:ascii="Times New Roman" w:hAnsi="Times New Roman" w:cs="Times New Roman"/>
+          <w:sz w:val="32"/>
+          <w:szCs w:val="32"/>
+          <w:lang w:val="vi-VN"/>
+        </w:rPr>
+      </w:pPr>
+      <w:bookmarkStart w:id="0" w:name="_Toc227352022"/>
+      <w:r>
+        <w:rPr>
+          <w:rFonts w:ascii="Times New Roman" w:hAnsi="Times New Roman" w:cs="Times New Roman"/>
+          <w:sz w:val="32"/>
+          <w:szCs w:val="32"/>
+        </w:rPr>
+        <w:lastRenderedPageBreak/>
+        <w:t>3.3.1 CHUẨN HÓA CẤU TRÚC CỘT VÀ XỬ LÝ LỖI LOGIC</w:t>
+      </w:r>
+      <w:bookmarkEnd w:id="0"/>
+    </w:p>
+    <w:p>
+      <w:pPr>
+        <w:rPr>
+          <w:rFonts w:ascii="Times New Roman" w:hAnsi="Times New Roman" w:cs="Times New Roman"/>
+          <w:sz w:val="24"/>
+          <w:szCs w:val="24"/>
+          <w:lang w:val="vi-VN"/>
+        </w:rPr>
+      </w:pPr>
+      <w:r>
+        <w:rPr>
+          <w:rFonts w:ascii="Times New Roman" w:hAnsi="Times New Roman" w:cs="Times New Roman"/>
+          <w:sz w:val="24"/>
+          <w:szCs w:val="24"/>
+        </w:rPr>
+        <w:t>Sau khi đọc dữ liệu từ file CSV, hệ thống thực hiện chuẩn hóa tên cột nhằm đảm bảo tính nhất quán trong quá trình xử lý dữ liệu.</w:t>
+      </w:r>
+      <w:r>
+        <w:rPr>
+          <w:rFonts w:ascii="Times New Roman" w:hAnsi="Times New Roman" w:cs="Times New Roman"/>
+          <w:sz w:val="24"/>
+          <w:szCs w:val="24"/>
+          <w:lang w:val="vi-VN"/>
+        </w:rPr>
+        <w:t xml:space="preserve"> </w:t>
+      </w:r>
+    </w:p>
+    <w:p>
+      <w:pPr>
+        <w:rPr>
+          <w:rFonts w:ascii="Times New Roman" w:hAnsi="Times New Roman" w:cs="Times New Roman"/>
+          <w:lang w:val="vi-VN"/>
+        </w:rPr>
+      </w:pPr>
+      <w:r>
+        <w:rPr>
+          <w:rFonts w:ascii="Times New Roman" w:hAnsi="Times New Roman" w:cs="Times New Roman"/>
+          <w:lang w:val="vi-VN"/>
+        </w:rPr>
+        <w:drawing>
+          <wp:inline distT="0" distB="0" distL="0" distR="0" wp14:anchorId="4D4D01B5" wp14:editId="47C51806">
+            <wp:extent cx="5943600" cy="1504950"/>
+            <wp:effectExtent l="0" t="0" r="0" b="0"/>
+            <wp:docPr id="492780368" name="Picture 1"/>
+            <wp:cNvGraphicFramePr>
+              <a:graphicFrameLocks xmlns:a="http://schemas.openxmlformats.org/drawingml/2006/main" noChangeAspect="1"/>
+            </wp:cNvGraphicFramePr>
+            <a:graphic xmlns:a="http://schemas.openxmlformats.org/drawingml/2006/main">
+              <a:graphicData uri="http://schemas.openxmlformats.org/drawingml/2006/picture">
+                <pic:pic xmlns:pic="http://schemas.openxmlformats.org/drawingml/2006/picture">
+                  <pic:nvPicPr>
+                    <pic:cNvPr id="492780368" name=""/>
+                    <pic:cNvPicPr/>
+                  </pic:nvPicPr>
+                  <pic:blipFill>
+                    <a:blip r:embed="rId10"/>
+                    <a:stretch>
+                      <a:fillRect/>
+                    </a:stretch>
+                  </pic:blipFill>
+                  <pic:spPr>
+                    <a:xfrm>
+                      <a:off x="0" y="0"/>
+                      <a:ext cx="5943600" cy="1504950"/>
+                    </a:xfrm>
+                    <a:prstGeom prst="rect">
+                      <a:avLst/>
+                    </a:prstGeom>
+                  </pic:spPr>
+                </pic:pic>
+              </a:graphicData>
+            </a:graphic>
+          </wp:inline>
+        </w:drawing>
+      </w:r>
+    </w:p>
+    <w:p>
+      <w:pPr>
+        <w:rPr>
+          <w:rFonts w:ascii="Times New Roman" w:hAnsi="Times New Roman" w:cs="Times New Roman"/>
+          <w:lang w:val="vi-VN"/>
+        </w:rPr>
+      </w:pPr>
+    </w:p>
+    <w:p>
+      <w:pPr>
+        <w:rPr>
+          <w:rFonts w:ascii="Times New Roman" w:hAnsi="Times New Roman" w:cs="Times New Roman"/>
+          <w:lang w:val="vi-VN"/>
+        </w:rPr>
+      </w:pPr>
+    </w:p>
+    <w:p>
+      <w:pPr>
+        <w:rPr>
+          <w:rFonts w:ascii="Times New Roman" w:hAnsi="Times New Roman" w:cs="Times New Roman"/>
+          <w:sz w:val="24"/>
+          <w:szCs w:val="24"/>
+        </w:rPr>
+      </w:pPr>
+      <w:r>
+        <w:rPr>
+          <w:rFonts w:ascii="Times New Roman" w:hAnsi="Times New Roman" w:cs="Times New Roman"/>
+          <w:sz w:val="24"/>
+          <w:szCs w:val="24"/>
+        </w:rPr>
+        <w:t>Ví dụ:</w:t>
+      </w:r>
+    </w:p>
+    <w:p>
+      <w:pPr>
+        <w:numPr>
+          <w:ilvl w:val="0"/>
+          <w:numId w:val="40"/>
+        </w:numPr>
+        <w:rPr>
+          <w:rFonts w:ascii="Times New Roman" w:hAnsi="Times New Roman" w:cs="Times New Roman"/>
+          <w:sz w:val="24"/>
+          <w:szCs w:val="24"/>
+        </w:rPr>
+      </w:pPr>
+      <w:r>
+        <w:rPr>
+          <w:rFonts w:ascii="Times New Roman" w:hAnsi="Times New Roman" w:cs="Times New Roman"/>
+          <w:sz w:val="24"/>
+          <w:szCs w:val="24"/>
+        </w:rPr>
+        <w:t>Order Date → order_date</w:t>
+      </w:r>
+    </w:p>
+    <w:p>
+      <w:pPr>
+        <w:numPr>
+          <w:ilvl w:val="0"/>
+          <w:numId w:val="40"/>
+        </w:numPr>
+        <w:rPr>
+          <w:rFonts w:ascii="Times New Roman" w:hAnsi="Times New Roman" w:cs="Times New Roman"/>
+          <w:sz w:val="24"/>
+          <w:szCs w:val="24"/>
+        </w:rPr>
+      </w:pPr>
+      <w:r>
+        <w:rPr>
+          <w:rFonts w:ascii="Times New Roman" w:hAnsi="Times New Roman" w:cs="Times New Roman"/>
+          <w:sz w:val="24"/>
+          <w:szCs w:val="24"/>
+        </w:rPr>
+        <w:t>Ship Date → ship_date</w:t>
+      </w:r>
+    </w:p>
+    <w:p>
+      <w:pPr>
+        <w:numPr>
+          <w:ilvl w:val="0"/>
+          <w:numId w:val="40"/>
+        </w:numPr>
+        <w:rPr>
+          <w:rFonts w:ascii="Times New Roman" w:hAnsi="Times New Roman" w:cs="Times New Roman"/>
+          <w:sz w:val="24"/>
+          <w:szCs w:val="24"/>
+        </w:rPr>
+      </w:pPr>
+      <w:r>
+        <w:rPr>
+          <w:rFonts w:ascii="Times New Roman" w:hAnsi="Times New Roman" w:cs="Times New Roman"/>
+          <w:sz w:val="24"/>
+          <w:szCs w:val="24"/>
+        </w:rPr>
+        <w:t>Sub.Category → sub_category</w:t>
+      </w:r>
+    </w:p>
+    <w:p>
+      <w:pPr>
+        <w:rPr>
+          <w:rFonts w:ascii="Times New Roman" w:hAnsi="Times New Roman" w:cs="Times New Roman"/>
+          <w:sz w:val="24"/>
+          <w:szCs w:val="24"/>
+          <w:lang w:val="vi-VN"/>
+        </w:rPr>
+      </w:pPr>
+      <w:r>
+        <w:rPr>
+          <w:rFonts w:ascii="Times New Roman" w:hAnsi="Times New Roman" w:cs="Times New Roman"/>
+          <w:sz w:val="24"/>
+          <w:szCs w:val="24"/>
+        </w:rPr>
+        <w:t>Tiếp theo, hệ thống loại bỏ các cột không phục vụ cho mục đích phân tích như:</w:t>
+      </w:r>
+    </w:p>
+    <w:p>
+      <w:pPr>
+        <w:rPr>
+          <w:rFonts w:ascii="Times New Roman" w:hAnsi="Times New Roman" w:cs="Times New Roman"/>
+          <w:sz w:val="24"/>
+          <w:szCs w:val="24"/>
+          <w:lang w:val="vi-VN"/>
+        </w:rPr>
+      </w:pPr>
+      <w:r>
+        <w:rPr>
+          <w:rFonts w:ascii="Times New Roman" w:hAnsi="Times New Roman" w:cs="Times New Roman"/>
+          <w:sz w:val="24"/>
+          <w:szCs w:val="24"/>
+          <w:lang w:val="vi-VN"/>
+        </w:rPr>
+        <w:drawing>
+          <wp:inline distT="0" distB="0" distL="0" distR="0" wp14:anchorId="009BB98C" wp14:editId="3D31D415">
+            <wp:extent cx="5943600" cy="487680"/>
+            <wp:effectExtent l="0" t="0" r="0" b="7620"/>
+            <wp:docPr id="933999759" name="Picture 1"/>
+            <wp:cNvGraphicFramePr>
+              <a:graphicFrameLocks xmlns:a="http://schemas.openxmlformats.org/drawingml/2006/main" noChangeAspect="1"/>
+            </wp:cNvGraphicFramePr>
+            <a:graphic xmlns:a="http://schemas.openxmlformats.org/drawingml/2006/main">
+              <a:graphicData uri="http://schemas.openxmlformats.org/drawingml/2006/picture">
+                <pic:pic xmlns:pic="http://schemas.openxmlformats.org/drawingml/2006/picture">
+                  <pic:nvPicPr>
+                    <pic:cNvPr id="933999759" name=""/>
+                    <pic:cNvPicPr/>
+                  </pic:nvPicPr>
+                  <pic:blipFill>
+                    <a:blip r:embed="rId11"/>
+                    <a:stretch>
+                      <a:fillRect/>
+                    </a:stretch>
+                  </pic:blipFill>
+                  <pic:spPr>
+                    <a:xfrm>
+                      <a:off x="0" y="0"/>
+                      <a:ext cx="5943600" cy="487680"/>
+                    </a:xfrm>
+                    <a:prstGeom prst="rect">
+                      <a:avLst/>
+                    </a:prstGeom>
+                  </pic:spPr>
+                </pic:pic>
+              </a:graphicData>
+            </a:graphic>
+          </wp:inline>
+        </w:drawing>
+      </w:r>
+    </w:p>
+    <w:p>
+      <w:pPr>
+        <w:rPr>
+          <w:rFonts w:ascii="Times New Roman" w:hAnsi="Times New Roman" w:cs="Times New Roman"/>
+          <w:sz w:val="24"/>
+          <w:szCs w:val="24"/>
+          <w:lang w:val="vi-VN"/>
+        </w:rPr>
+      </w:pPr>
+      <w:r>
+        <w:rPr>
+          <w:rFonts w:ascii="Times New Roman" w:hAnsi="Times New Roman" w:cs="Times New Roman"/>
+          <w:sz w:val="24"/>
+          <w:szCs w:val="24"/>
+        </w:rPr>
+        <w:t>Dữ liệu ngày tháng được chuyển sang định dạng Datetime để phục vụ các phép tính thời gian.</w:t>
+      </w:r>
+    </w:p>
+    <w:p>
+      <w:pPr>
+        <w:rPr>
+          <w:rFonts w:ascii="Times New Roman" w:hAnsi="Times New Roman" w:cs="Times New Roman"/>
+          <w:sz w:val="24"/>
+          <w:szCs w:val="24"/>
+          <w:lang w:val="vi-VN"/>
+        </w:rPr>
+      </w:pPr>
+      <w:r>
+        <w:rPr>
+          <w:rFonts w:ascii="Times New Roman" w:hAnsi="Times New Roman" w:cs="Times New Roman"/>
+          <w:sz w:val="24"/>
+          <w:szCs w:val="24"/>
+          <w:lang w:val="vi-VN"/>
+        </w:rPr>
+        <w:drawing>
+          <wp:inline distT="0" distB="0" distL="0" distR="0" wp14:anchorId="6769178F" wp14:editId="69B5781B">
+            <wp:extent cx="5943600" cy="623570"/>
+            <wp:effectExtent l="0" t="0" r="0" b="5080"/>
+            <wp:docPr id="564267732" name="Picture 1"/>
+            <wp:cNvGraphicFramePr>
+              <a:graphicFrameLocks xmlns:a="http://schemas.openxmlformats.org/drawingml/2006/main" noChangeAspect="1"/>
+            </wp:cNvGraphicFramePr>
+            <a:graphic xmlns:a="http://schemas.openxmlformats.org/drawingml/2006/main">
+              <a:graphicData uri="http://schemas.openxmlformats.org/drawingml/2006/picture">
+                <pic:pic xmlns:pic="http://schemas.openxmlformats.org/drawingml/2006/picture">
+                  <pic:nvPicPr>
+                    <pic:cNvPr id="564267732" name=""/>
+                    <pic:cNvPicPr/>
+                  </pic:nvPicPr>
+                  <pic:blipFill>
+                    <a:blip r:embed="rId12"/>
+                    <a:stretch>
+                      <a:fillRect/>
+                    </a:stretch>
+                  </pic:blipFill>
+                  <pic:spPr>
+                    <a:xfrm>
+                      <a:off x="0" y="0"/>
+                      <a:ext cx="5943600" cy="623570"/>
+                    </a:xfrm>
+                    <a:prstGeom prst="rect">
+                      <a:avLst/>
+                    </a:prstGeom>
+                  </pic:spPr>
+                </pic:pic>
+              </a:graphicData>
+            </a:graphic>
+          </wp:inline>
+        </w:drawing>
+      </w:r>
+    </w:p>
+    <w:p>
+      <w:pPr>
+        <w:rPr>
+          <w:rFonts w:ascii="Times New Roman" w:hAnsi="Times New Roman" w:cs="Times New Roman"/>
+          <w:sz w:val="24"/>
+          <w:szCs w:val="24"/>
+          <w:lang w:val="vi-VN"/>
+        </w:rPr>
+      </w:pPr>
+    </w:p>
+    <w:p>
+      <w:pPr>
+        <w:rPr>
+          <w:rFonts w:ascii="Times New Roman" w:hAnsi="Times New Roman" w:cs="Times New Roman"/>
+          <w:sz w:val="24"/>
+          <w:szCs w:val="24"/>
+          <w:lang w:val="vi-VN"/>
+        </w:rPr>
+      </w:pPr>
+      <w:r>
+        <w:rPr>
+          <w:rFonts w:ascii="Times New Roman" w:hAnsi="Times New Roman" w:cs="Times New Roman"/>
+          <w:sz w:val="24"/>
+          <w:szCs w:val="24"/>
+        </w:rPr>
+        <w:t>Hệ thống đồng thời kiểm tra lỗi nghiệp vụ và loại bỏ các bản ghi có ngày giao hàng nhỏ hơn ngày đặt hàng.</w:t>
+      </w:r>
+    </w:p>
+    <w:p>
+      <w:pPr>
+        <w:rPr>
+          <w:rFonts w:ascii="Times New Roman" w:hAnsi="Times New Roman" w:cs="Times New Roman"/>
+          <w:sz w:val="24"/>
+          <w:szCs w:val="24"/>
+          <w:lang w:val="vi-VN"/>
+        </w:rPr>
+      </w:pPr>
+      <w:r>
+        <w:rPr>
+          <w:rFonts w:ascii="Times New Roman" w:hAnsi="Times New Roman" w:cs="Times New Roman"/>
+          <w:sz w:val="24"/>
+          <w:szCs w:val="24"/>
+        </w:rPr>
+        <w:t>Để xử lý dữ liệu trùng lặp, hệ thống sử dụng cặp khóa order_id và product_id, sau đó giữ lại bản ghi mới nhất.</w:t>
+      </w:r>
+    </w:p>
+    <w:p>
+      <w:pPr>
+        <w:rPr>
+          <w:rFonts w:ascii="Times New Roman" w:hAnsi="Times New Roman" w:cs="Times New Roman"/>
+          <w:lang w:val="vi-VN"/>
+        </w:rPr>
+      </w:pPr>
+      <w:r>
+        <w:rPr>
+          <w:rFonts w:ascii="Times New Roman" w:hAnsi="Times New Roman" w:cs="Times New Roman"/>
+          <w:lang w:val="vi-VN"/>
+        </w:rPr>
+        <w:lastRenderedPageBreak/>
+        <w:drawing>
+          <wp:inline distT="0" distB="0" distL="0" distR="0" wp14:anchorId="79E455A8" wp14:editId="5F75BD24">
+            <wp:extent cx="5943600" cy="940435"/>
+            <wp:effectExtent l="0" t="0" r="0" b="0"/>
+            <wp:docPr id="2107549152" name="Picture 1"/>
+            <wp:cNvGraphicFramePr>
+              <a:graphicFrameLocks xmlns:a="http://schemas.openxmlformats.org/drawingml/2006/main" noChangeAspect="1"/>
+            </wp:cNvGraphicFramePr>
+            <a:graphic xmlns:a="http://schemas.openxmlformats.org/drawingml/2006/main">
+              <a:graphicData uri="http://schemas.openxmlformats.org/drawingml/2006/picture">
+                <pic:pic xmlns:pic="http://schemas.openxmlformats.org/drawingml/2006/picture">
+                  <pic:nvPicPr>
+                    <pic:cNvPr id="2107549152" name=""/>
+                    <pic:cNvPicPr/>
+                  </pic:nvPicPr>
+                  <pic:blipFill>
+                    <a:blip r:embed="rId13"/>
+                    <a:stretch>
+                      <a:fillRect/>
+                    </a:stretch>
+                  </pic:blipFill>
+                  <pic:spPr>
+                    <a:xfrm>
+                      <a:off x="0" y="0"/>
+                      <a:ext cx="5943600" cy="940435"/>
+                    </a:xfrm>
+                    <a:prstGeom prst="rect">
+                      <a:avLst/>
+                    </a:prstGeom>
+                  </pic:spPr>
+                </pic:pic>
+              </a:graphicData>
+            </a:graphic>
+          </wp:inline>
+        </w:drawing>
+      </w:r>
+    </w:p>
+    <w:p>
+      <w:pPr>
+        <w:pStyle w:val="Heading3"/>
+        <w:rPr>
+          <w:rFonts w:ascii="Times New Roman" w:hAnsi="Times New Roman" w:cs="Times New Roman"/>
+          <w:sz w:val="32"/>
+          <w:szCs w:val="32"/>
+          <w:lang w:val="vi-VN"/>
+        </w:rPr>
+      </w:pPr>
+      <w:r>
+        <w:rPr>
+          <w:rFonts w:ascii="Times New Roman" w:hAnsi="Times New Roman" w:cs="Times New Roman"/>
+          <w:sz w:val="32"/>
+          <w:szCs w:val="32"/>
+        </w:rPr>
+        <w:t>3.3.2 Xử lý dữ liệu thiếu</w:t>
+      </w:r>
+    </w:p>
+    <w:p>
+      <w:pPr>
+        <w:rPr>
+          <w:rFonts w:ascii="Times New Roman" w:hAnsi="Times New Roman" w:cs="Times New Roman"/>
+          <w:sz w:val="24"/>
+          <w:szCs w:val="24"/>
+          <w:lang w:val="vi-VN"/>
+        </w:rPr>
+      </w:pPr>
+      <w:r>
+        <w:rPr>
+          <w:rFonts w:ascii="Times New Roman" w:hAnsi="Times New Roman" w:cs="Times New Roman"/>
+          <w:sz w:val="24"/>
+          <w:szCs w:val="24"/>
+        </w:rPr>
+        <w:t>Các giá trị thiếu trong cột postal_code được thay thế bằng mã mặc định "00000".</w:t>
+      </w:r>
+    </w:p>
+    <w:p>
+      <w:pPr>
+        <w:rPr>
+          <w:rFonts w:ascii="Times New Roman" w:hAnsi="Times New Roman" w:cs="Times New Roman"/>
+          <w:sz w:val="24"/>
+          <w:szCs w:val="24"/>
+          <w:lang w:val="vi-VN"/>
+        </w:rPr>
+      </w:pPr>
+      <w:r>
+        <w:rPr>
+          <w:rFonts w:ascii="Times New Roman" w:hAnsi="Times New Roman" w:cs="Times New Roman"/>
+          <w:sz w:val="24"/>
+          <w:szCs w:val="24"/>
+          <w:lang w:val="vi-VN"/>
+        </w:rPr>
+        <w:drawing>
+          <wp:inline distT="0" distB="0" distL="0" distR="0" wp14:anchorId="2ACD25BF" wp14:editId="0918F5BE">
+            <wp:extent cx="5943600" cy="572135"/>
+            <wp:effectExtent l="0" t="0" r="0" b="0"/>
+            <wp:docPr id="968934934" name="Picture 1"/>
+            <wp:cNvGraphicFramePr>
+              <a:graphicFrameLocks xmlns:a="http://schemas.openxmlformats.org/drawingml/2006/main" noChangeAspect="1"/>
+            </wp:cNvGraphicFramePr>
+            <a:graphic xmlns:a="http://schemas.openxmlformats.org/drawingml/2006/main">
+              <a:graphicData uri="http://schemas.openxmlformats.org/drawingml/2006/picture">
+                <pic:pic xmlns:pic="http://schemas.openxmlformats.org/drawingml/2006/picture">
+                  <pic:nvPicPr>
+                    <pic:cNvPr id="968934934" name=""/>
+                    <pic:cNvPicPr/>
+                  </pic:nvPicPr>
+                  <pic:blipFill>
+                    <a:blip r:embed="rId14"/>
+                    <a:stretch>
+                      <a:fillRect/>
+                    </a:stretch>
+                  </pic:blipFill>
+                  <pic:spPr>
+                    <a:xfrm>
+                      <a:off x="0" y="0"/>
+                      <a:ext cx="5943600" cy="572135"/>
+                    </a:xfrm>
+                    <a:prstGeom prst="rect">
+                      <a:avLst/>
+                    </a:prstGeom>
+                  </pic:spPr>
+                </pic:pic>
+              </a:graphicData>
+            </a:graphic>
+          </wp:inline>
+        </w:drawing>
+      </w:r>
+    </w:p>
+    <w:p>
+      <w:pPr>
+        <w:rPr>
+          <w:rFonts w:ascii="Times New Roman" w:hAnsi="Times New Roman" w:cs="Times New Roman"/>
+          <w:sz w:val="24"/>
+          <w:szCs w:val="24"/>
+        </w:rPr>
+      </w:pPr>
+      <w:r>
+        <w:rPr>
+          <w:rFonts w:ascii="Times New Roman" w:hAnsi="Times New Roman" w:cs="Times New Roman"/>
+          <w:sz w:val="24"/>
+          <w:szCs w:val="24"/>
+        </w:rPr>
+        <w:t>Đối với các cột số như:</w:t>
+      </w:r>
+    </w:p>
+    <w:p>
+      <w:pPr>
+        <w:numPr>
+          <w:ilvl w:val="0"/>
+          <w:numId w:val="42"/>
+        </w:numPr>
+        <w:rPr>
+          <w:rFonts w:ascii="Times New Roman" w:hAnsi="Times New Roman" w:cs="Times New Roman"/>
+          <w:sz w:val="24"/>
+          <w:szCs w:val="24"/>
+        </w:rPr>
+      </w:pPr>
+      <w:r>
+        <w:rPr>
+          <w:rFonts w:ascii="Times New Roman" w:hAnsi="Times New Roman" w:cs="Times New Roman"/>
+          <w:sz w:val="24"/>
+          <w:szCs w:val="24"/>
+        </w:rPr>
+        <w:t>sales</w:t>
+      </w:r>
+    </w:p>
+    <w:p>
+      <w:pPr>
+        <w:numPr>
+          <w:ilvl w:val="0"/>
+          <w:numId w:val="42"/>
+        </w:numPr>
+        <w:rPr>
+          <w:rFonts w:ascii="Times New Roman" w:hAnsi="Times New Roman" w:cs="Times New Roman"/>
+          <w:sz w:val="24"/>
+          <w:szCs w:val="24"/>
+        </w:rPr>
+      </w:pPr>
+      <w:r>
+        <w:rPr>
+          <w:rFonts w:ascii="Times New Roman" w:hAnsi="Times New Roman" w:cs="Times New Roman"/>
+          <w:sz w:val="24"/>
+          <w:szCs w:val="24"/>
+        </w:rPr>
+        <w:t>quantity</w:t>
+      </w:r>
+    </w:p>
+    <w:p>
+      <w:pPr>
+        <w:numPr>
+          <w:ilvl w:val="0"/>
+          <w:numId w:val="42"/>
+        </w:numPr>
+        <w:rPr>
+          <w:rFonts w:ascii="Times New Roman" w:hAnsi="Times New Roman" w:cs="Times New Roman"/>
+          <w:sz w:val="24"/>
+          <w:szCs w:val="24"/>
+        </w:rPr>
+      </w:pPr>
+      <w:r>
+        <w:rPr>
+          <w:rFonts w:ascii="Times New Roman" w:hAnsi="Times New Roman" w:cs="Times New Roman"/>
+          <w:sz w:val="24"/>
+          <w:szCs w:val="24"/>
+        </w:rPr>
+        <w:t>discount</w:t>
+      </w:r>
+    </w:p>
+    <w:p>
+      <w:pPr>
+        <w:numPr>
+          <w:ilvl w:val="0"/>
+          <w:numId w:val="42"/>
+        </w:numPr>
+        <w:rPr>
+          <w:rFonts w:ascii="Times New Roman" w:hAnsi="Times New Roman" w:cs="Times New Roman"/>
+          <w:sz w:val="24"/>
+          <w:szCs w:val="24"/>
+        </w:rPr>
+      </w:pPr>
+      <w:r>
+        <w:rPr>
+          <w:rFonts w:ascii="Times New Roman" w:hAnsi="Times New Roman" w:cs="Times New Roman"/>
+          <w:sz w:val="24"/>
+          <w:szCs w:val="24"/>
+        </w:rPr>
+        <w:t>profit</w:t>
+      </w:r>
+    </w:p>
+    <w:p>
+      <w:pPr>
+        <w:numPr>
+          <w:ilvl w:val="0"/>
+          <w:numId w:val="42"/>
+        </w:numPr>
+        <w:rPr>
+          <w:rFonts w:ascii="Times New Roman" w:hAnsi="Times New Roman" w:cs="Times New Roman"/>
+          <w:sz w:val="24"/>
+          <w:szCs w:val="24"/>
+        </w:rPr>
+      </w:pPr>
+      <w:r>
+        <w:rPr>
+          <w:rFonts w:ascii="Times New Roman" w:hAnsi="Times New Roman" w:cs="Times New Roman"/>
+          <w:sz w:val="24"/>
+          <w:szCs w:val="24"/>
+        </w:rPr>
+        <w:t>shipping_cost</w:t>
+      </w:r>
+    </w:p>
+    <w:p>
+      <w:pPr>
+        <w:ind w:left="360"/>
+        <w:rPr>
+          <w:rFonts w:ascii="Times New Roman" w:hAnsi="Times New Roman" w:cs="Times New Roman"/>
+          <w:sz w:val="24"/>
+          <w:szCs w:val="24"/>
+          <w:lang w:val="vi-VN"/>
+        </w:rPr>
+      </w:pPr>
+      <w:r>
+        <w:rPr>
+          <w:rFonts w:ascii="Times New Roman" w:hAnsi="Times New Roman" w:cs="Times New Roman"/>
+          <w:sz w:val="24"/>
+          <w:szCs w:val="24"/>
+        </w:rPr>
+        <w:t>hệ thống ép kiểu dữ liệu và thay thế giá trị Null bằng 0 để tránh ảnh hưởng đến quá trình tính toán.</w:t>
+      </w:r>
+    </w:p>
+    <w:p>
+      <w:pPr>
+        <w:pStyle w:val="Heading3"/>
+        <w:rPr>
+          <w:rFonts w:ascii="Times New Roman" w:hAnsi="Times New Roman" w:cs="Times New Roman"/>
+          <w:sz w:val="32"/>
+          <w:szCs w:val="32"/>
+          <w:lang w:val="vi-VN"/>
+        </w:rPr>
+      </w:pPr>
+      <w:r>
+        <w:rPr>
+          <w:rFonts w:ascii="Times New Roman" w:hAnsi="Times New Roman" w:cs="Times New Roman"/>
+          <w:sz w:val="32"/>
+          <w:szCs w:val="32"/>
+        </w:rPr>
+        <w:t>3.3.3 Chuẩn hóa dữ liệu</w:t>
+      </w:r>
+    </w:p>
+    <w:p>
+      <w:pPr>
+        <w:rPr>
+          <w:rFonts w:ascii="Times New Roman" w:hAnsi="Times New Roman" w:cs="Times New Roman"/>
+          <w:sz w:val="24"/>
+          <w:szCs w:val="24"/>
+        </w:rPr>
+      </w:pPr>
+      <w:r>
+        <w:rPr>
+          <w:rFonts w:ascii="Times New Roman" w:hAnsi="Times New Roman" w:cs="Times New Roman"/>
+          <w:sz w:val="24"/>
+          <w:szCs w:val="24"/>
+        </w:rPr>
+        <w:t>Các trường văn bản như quốc gia, thành phố, phân khúc khách hàng và tên sản phẩm được chuẩn hóa nhằm loại bỏ khoảng trắng thừa và thống nhất định dạng hiển thị.</w:t>
+      </w:r>
+    </w:p>
+    <w:p>
+      <w:pPr>
+        <w:rPr>
+          <w:rFonts w:ascii="Times New Roman" w:hAnsi="Times New Roman" w:cs="Times New Roman"/>
+          <w:sz w:val="24"/>
+          <w:szCs w:val="24"/>
+        </w:rPr>
+      </w:pPr>
+      <w:r>
+        <w:rPr>
+          <w:rFonts w:ascii="Times New Roman" w:hAnsi="Times New Roman" w:cs="Times New Roman"/>
+          <w:sz w:val="24"/>
+          <w:szCs w:val="24"/>
+        </w:rPr>
+        <w:t>.str.strip()</w:t>
+      </w:r>
+    </w:p>
+    <w:p>
+      <w:pPr>
+        <w:rPr>
+          <w:rFonts w:ascii="Times New Roman" w:hAnsi="Times New Roman" w:cs="Times New Roman"/>
+          <w:sz w:val="24"/>
+          <w:szCs w:val="24"/>
+        </w:rPr>
+      </w:pPr>
+      <w:r>
+        <w:rPr>
+          <w:rFonts w:ascii="Times New Roman" w:hAnsi="Times New Roman" w:cs="Times New Roman"/>
+          <w:sz w:val="24"/>
+          <w:szCs w:val="24"/>
+        </w:rPr>
+        <w:t>.str.title()</w:t>
+      </w:r>
+    </w:p>
+    <w:p>
+      <w:pPr>
+        <w:rPr>
+          <w:rFonts w:ascii="Times New Roman" w:hAnsi="Times New Roman" w:cs="Times New Roman"/>
+          <w:sz w:val="24"/>
+          <w:szCs w:val="24"/>
+          <w:lang w:val="vi-VN"/>
+        </w:rPr>
+      </w:pPr>
+      <w:r>
+        <w:rPr>
+          <w:rFonts w:ascii="Times New Roman" w:hAnsi="Times New Roman" w:cs="Times New Roman"/>
+          <w:sz w:val="24"/>
+          <w:szCs w:val="24"/>
+        </w:rPr>
+        <w:t>Đối với các trường tài chính như sales, profit và shipping_cost, dữ liệu được làm tròn đến 2 chữ số thập phân.</w:t>
+      </w:r>
+    </w:p>
+    <w:p>
+      <w:pPr>
+        <w:rPr>
+          <w:rFonts w:ascii="Times New Roman" w:hAnsi="Times New Roman" w:cs="Times New Roman"/>
+          <w:sz w:val="24"/>
+          <w:szCs w:val="24"/>
+          <w:lang w:val="vi-VN"/>
+        </w:rPr>
+      </w:pPr>
+      <w:r>
+        <w:rPr>
+          <w:rFonts w:ascii="Times New Roman" w:hAnsi="Times New Roman" w:cs="Times New Roman"/>
+          <w:sz w:val="24"/>
+          <w:szCs w:val="24"/>
+          <w:lang w:val="vi-VN"/>
+        </w:rPr>
+        <w:lastRenderedPageBreak/>
+        <w:drawing>
+          <wp:inline distT="0" distB="0" distL="0" distR="0" wp14:anchorId="099AF8CE" wp14:editId="1947A0E0">
+            <wp:extent cx="5668166" cy="1390844"/>
+            <wp:effectExtent l="0" t="0" r="8890" b="0"/>
+            <wp:docPr id="1278375414" name="Picture 1"/>
+            <wp:cNvGraphicFramePr>
+              <a:graphicFrameLocks xmlns:a="http://schemas.openxmlformats.org/drawingml/2006/main" noChangeAspect="1"/>
+            </wp:cNvGraphicFramePr>
+            <a:graphic xmlns:a="http://schemas.openxmlformats.org/drawingml/2006/main">
+              <a:graphicData uri="http://schemas.openxmlformats.org/drawingml/2006/picture">
+                <pic:pic xmlns:pic="http://schemas.openxmlformats.org/drawingml/2006/picture">
+                  <pic:nvPicPr>
+                    <pic:cNvPr id="1278375414" name=""/>
+                    <pic:cNvPicPr/>
+                  </pic:nvPicPr>
+                  <pic:blipFill>
+                    <a:blip r:embed="rId15"/>
+                    <a:stretch>
+                      <a:fillRect/>
+                    </a:stretch>
+                  </pic:blipFill>
+                  <pic:spPr>
+                    <a:xfrm>
+                      <a:off x="0" y="0"/>
+                      <a:ext cx="5668166" cy="1390844"/>
+                    </a:xfrm>
+                    <a:prstGeom prst="rect">
+                      <a:avLst/>
+                    </a:prstGeom>
+                  </pic:spPr>
+                </pic:pic>
+              </a:graphicData>
+            </a:graphic>
+          </wp:inline>
+        </w:drawing>
+      </w:r>
+    </w:p>
+    <w:p>
+      <w:pPr>
+        <w:rPr>
+          <w:rFonts w:ascii="Times New Roman" w:hAnsi="Times New Roman" w:cs="Times New Roman"/>
+          <w:sz w:val="24"/>
+          <w:szCs w:val="24"/>
+          <w:lang w:val="vi-VN"/>
+        </w:rPr>
+      </w:pPr>
+      <w:r>
+        <w:rPr>
+          <w:rFonts w:ascii="Times New Roman" w:hAnsi="Times New Roman" w:cs="Times New Roman"/>
+          <w:sz w:val="24"/>
+          <w:szCs w:val="24"/>
+        </w:rPr>
+        <w:t>Ngoài ra, hệ thống tạo thêm trường discount_pct để biểu diễn tỷ lệ giảm giá dưới dạng phần trăm.</w:t>
+      </w:r>
+    </w:p>
+    <w:p>
+      <w:pPr>
+        <w:rPr>
+          <w:rFonts w:ascii="Times New Roman" w:hAnsi="Times New Roman" w:cs="Times New Roman"/>
+          <w:lang w:val="vi-VN"/>
+        </w:rPr>
+      </w:pPr>
+      <w:r>
+        <w:rPr>
+          <w:rFonts w:ascii="Times New Roman" w:hAnsi="Times New Roman" w:cs="Times New Roman"/>
+          <w:lang w:val="vi-VN"/>
+        </w:rPr>
+        <w:drawing>
+          <wp:inline distT="0" distB="0" distL="0" distR="0" wp14:anchorId="02A4AE8C" wp14:editId="43059F9F">
+            <wp:extent cx="5943600" cy="1078865"/>
+            <wp:effectExtent l="0" t="0" r="0" b="6985"/>
+            <wp:docPr id="1225693373" name="Picture 1"/>
+            <wp:cNvGraphicFramePr>
+              <a:graphicFrameLocks xmlns:a="http://schemas.openxmlformats.org/drawingml/2006/main" noChangeAspect="1"/>
+            </wp:cNvGraphicFramePr>
+            <a:graphic xmlns:a="http://schemas.openxmlformats.org/drawingml/2006/main">
+              <a:graphicData uri="http://schemas.openxmlformats.org/drawingml/2006/picture">
+                <pic:pic xmlns:pic="http://schemas.openxmlformats.org/drawingml/2006/picture">
+                  <pic:nvPicPr>
+                    <pic:cNvPr id="1225693373" name=""/>
+                    <pic:cNvPicPr/>
+                  </pic:nvPicPr>
+                  <pic:blipFill>
+                    <a:blip r:embed="rId16"/>
+                    <a:stretch>
+                      <a:fillRect/>
+                    </a:stretch>
+                  </pic:blipFill>
+                  <pic:spPr>
+                    <a:xfrm>
+                      <a:off x="0" y="0"/>
+                      <a:ext cx="5943600" cy="1078865"/>
+                    </a:xfrm>
+                    <a:prstGeom prst="rect">
+                      <a:avLst/>
+                    </a:prstGeom>
+                  </pic:spPr>
+                </pic:pic>
+              </a:graphicData>
+            </a:graphic>
+          </wp:inline>
+        </w:drawing>
+      </w:r>
+    </w:p>
+    <w:p>
+      <w:pPr>
+        <w:rPr>
+          <w:rFonts w:ascii="Times New Roman" w:hAnsi="Times New Roman" w:cs="Times New Roman"/>
+          <w:sz w:val="24"/>
+          <w:szCs w:val="24"/>
+          <w:lang w:val="vi-VN"/>
+        </w:rPr>
+      </w:pPr>
+      <w:r>
+        <w:rPr>
+          <w:rFonts w:ascii="Times New Roman" w:hAnsi="Times New Roman" w:cs="Times New Roman"/>
+          <w:sz w:val="24"/>
+          <w:szCs w:val="24"/>
+        </w:rPr>
+        <w:t>Sau khi hoàn thành các bước trên, dữ liệu đã được làm sạch, chuẩn hóa và sẵn sàng cho giai đoạn Feature Engineering và phân tích dữ liệu.</w:t>
+      </w:r>
+    </w:p>
+    <w:p>
+      <w:pPr>
+        <w:rPr>
+          <w:lang w:val="vi-VN"/>
+        </w:rPr>
+      </w:pPr>
+    </w:p>
+    <w:p>
+      <w:pPr>
+        <w:rPr>
+          <w:lang w:val="vi-VN"/>
+        </w:rPr>
+      </w:pPr>
+    </w:p>
     <w:sectPr>
       <w:pgSz w:w="12240" w:h="15840"/>
       <w:pgMar w:top="1440" w:right="1440" w:bottom="1440" w:left="1440" w:header="720" w:footer="720" w:gutter="0"/>
@@ -5921,6 +6949,157 @@
     </w:lvl>
   </w:abstractNum>
   <w:abstractNum w:abstractNumId="8" w15:restartNumberingAfterBreak="0">
+    <w:nsid w:val="1C0C1DA6"/>
+    <w:multiLevelType w:val="multilevel"/>
+    <w:tmpl w:val="A2A4F9B0"/>
+    <w:lvl w:ilvl="0">
+      <w:start w:val="1"/>
+      <w:numFmt w:val="bullet"/>
+      <w:lvlText w:val="-"/>
+      <w:lvlJc w:val="left"/>
+      <w:pPr>
+        <w:tabs>
+          <w:tab w:val="num" w:pos="720"/>
+        </w:tabs>
+        <w:ind w:left="720" w:hanging="360"/>
+      </w:pPr>
+      <w:rPr>
+        <w:rFonts w:ascii="Times New Roman" w:eastAsia="Times New Roman" w:hAnsi="Times New Roman" w:cs="Times New Roman" w:hint="default"/>
+        <w:b/>
+        <w:color w:val="000000"/>
+        <w:sz w:val="20"/>
+      </w:rPr>
+    </w:lvl>
+    <w:lvl w:ilvl="1" w:tentative="1">
+      <w:start w:val="1"/>
+      <w:numFmt w:val="bullet"/>
+      <w:lvlText w:val="o"/>
+      <w:lvlJc w:val="left"/>
+      <w:pPr>
+        <w:tabs>
+          <w:tab w:val="num" w:pos="1440"/>
+        </w:tabs>
+        <w:ind w:left="1440" w:hanging="360"/>
+      </w:pPr>
+      <w:rPr>
+        <w:rFonts w:ascii="Courier New" w:hAnsi="Courier New" w:hint="default"/>
+        <w:sz w:val="20"/>
+      </w:rPr>
+    </w:lvl>
+    <w:lvl w:ilvl="2" w:tentative="1">
+      <w:start w:val="1"/>
+      <w:numFmt w:val="bullet"/>
+      <w:lvlText w:val=""/>
+      <w:lvlJc w:val="left"/>
+      <w:pPr>
+        <w:tabs>
+          <w:tab w:val="num" w:pos="2160"/>
+        </w:tabs>
+        <w:ind w:left="2160" w:hanging="360"/>
+      </w:pPr>
+      <w:rPr>
+        <w:rFonts w:ascii="Wingdings" w:hAnsi="Wingdings" w:hint="default"/>
+        <w:sz w:val="20"/>
+      </w:rPr>
+    </w:lvl>
+    <w:lvl w:ilvl="3" w:tentative="1">
+      <w:start w:val="1"/>
+      <w:numFmt w:val="bullet"/>
+      <w:lvlText w:val=""/>
+      <w:lvlJc w:val="left"/>
+      <w:pPr>
+        <w:tabs>
+          <w:tab w:val="num" w:pos="2880"/>
+        </w:tabs>
+        <w:ind w:left="2880" w:hanging="360"/>
+      </w:pPr>
+      <w:rPr>
+        <w:rFonts w:ascii="Wingdings" w:hAnsi="Wingdings" w:hint="default"/>
+        <w:sz w:val="20"/>
+      </w:rPr>
+    </w:lvl>
+    <w:lvl w:ilvl="4" w:tentative="1">
+      <w:start w:val="1"/>
+      <w:numFmt w:val="bullet"/>
+      <w:lvlText w:val=""/>
+      <w:lvlJc w:val="left"/>
+      <w:pPr>
+        <w:tabs>
+          <w:tab w:val="num" w:pos="3600"/>
+        </w:tabs>
+        <w:ind w:left="3600" w:hanging="360"/>
+      </w:pPr>
+      <w:rPr>
+        <w:rFonts w:ascii="Wingdings" w:hAnsi="Wingdings" w:hint="default"/>
+        <w:sz w:val="20"/>
+      </w:rPr>
+    </w:lvl>
+    <w:lvl w:ilvl="5" w:tentative="1">
+      <w:start w:val="1"/>
+      <w:numFmt w:val="bullet"/>
+      <w:lvlText w:val=""/>
+      <w:lvlJc w:val="left"/>
+      <w:pPr>
+        <w:tabs>
+          <w:tab w:val="num" w:pos="4320"/>
+        </w:tabs>
+        <w:ind w:left="4320" w:hanging="360"/>
+      </w:pPr>
+      <w:rPr>
+        <w:rFonts w:ascii="Wingdings" w:hAnsi="Wingdings" w:hint="default"/>
+        <w:sz w:val="20"/>
+      </w:rPr>
+    </w:lvl>
+    <w:lvl w:ilvl="6" w:tentative="1">
+      <w:start w:val="1"/>
+      <w:numFmt w:val="bullet"/>
+      <w:lvlText w:val=""/>
+      <w:lvlJc w:val="left"/>
+      <w:pPr>
+        <w:tabs>
+          <w:tab w:val="num" w:pos="5040"/>
+        </w:tabs>
+        <w:ind w:left="5040" w:hanging="360"/>
+      </w:pPr>
+      <w:rPr>
+        <w:rFonts w:ascii="Wingdings" w:hAnsi="Wingdings" w:hint="default"/>
+        <w:sz w:val="20"/>
+      </w:rPr>
+    </w:lvl>
+    <w:lvl w:ilvl="7" w:tentative="1">
+      <w:start w:val="1"/>
+      <w:numFmt w:val="bullet"/>
+      <w:lvlText w:val=""/>
+      <w:lvlJc w:val="left"/>
+      <w:pPr>
+        <w:tabs>
+          <w:tab w:val="num" w:pos="5760"/>
+        </w:tabs>
+        <w:ind w:left="5760" w:hanging="360"/>
+      </w:pPr>
+      <w:rPr>
+        <w:rFonts w:ascii="Wingdings" w:hAnsi="Wingdings" w:hint="default"/>
+        <w:sz w:val="20"/>
+      </w:rPr>
+    </w:lvl>
+    <w:lvl w:ilvl="8" w:tentative="1">
+      <w:start w:val="1"/>
+      <w:numFmt w:val="bullet"/>
+      <w:lvlText w:val=""/>
+      <w:lvlJc w:val="left"/>
+      <w:pPr>
+        <w:tabs>
+          <w:tab w:val="num" w:pos="6480"/>
+        </w:tabs>
+        <w:ind w:left="6480" w:hanging="360"/>
+      </w:pPr>
+      <w:rPr>
+        <w:rFonts w:ascii="Wingdings" w:hAnsi="Wingdings" w:hint="default"/>
+        <w:sz w:val="20"/>
+      </w:rPr>
+    </w:lvl>
+  </w:abstractNum>
+  <w:abstractNum w:abstractNumId="9" w15:restartNumberingAfterBreak="0">
     <w:nsid w:val="1C3F4B22"/>
     <w:multiLevelType w:val="multilevel"/>
     <w:tmpl w:val="1FECE964"/>
@@ -6033,7 +7212,158 @@
       </w:rPr>
     </w:lvl>
   </w:abstractNum>
-  <w:abstractNum w:abstractNumId="9" w15:restartNumberingAfterBreak="0">
+  <w:abstractNum w:abstractNumId="10" w15:restartNumberingAfterBreak="0">
+    <w:nsid w:val="1C923BBD"/>
+    <w:multiLevelType w:val="multilevel"/>
+    <w:tmpl w:val="98021794"/>
+    <w:lvl w:ilvl="0">
+      <w:start w:val="1"/>
+      <w:numFmt w:val="bullet"/>
+      <w:lvlText w:val="-"/>
+      <w:lvlJc w:val="left"/>
+      <w:pPr>
+        <w:tabs>
+          <w:tab w:val="num" w:pos="720"/>
+        </w:tabs>
+        <w:ind w:left="720" w:hanging="360"/>
+      </w:pPr>
+      <w:rPr>
+        <w:rFonts w:ascii="Times New Roman" w:eastAsia="Times New Roman" w:hAnsi="Times New Roman" w:cs="Times New Roman" w:hint="default"/>
+        <w:b/>
+        <w:color w:val="000000"/>
+        <w:sz w:val="20"/>
+      </w:rPr>
+    </w:lvl>
+    <w:lvl w:ilvl="1" w:tentative="1">
+      <w:start w:val="1"/>
+      <w:numFmt w:val="bullet"/>
+      <w:lvlText w:val="o"/>
+      <w:lvlJc w:val="left"/>
+      <w:pPr>
+        <w:tabs>
+          <w:tab w:val="num" w:pos="1440"/>
+        </w:tabs>
+        <w:ind w:left="1440" w:hanging="360"/>
+      </w:pPr>
+      <w:rPr>
+        <w:rFonts w:ascii="Courier New" w:hAnsi="Courier New" w:hint="default"/>
+        <w:sz w:val="20"/>
+      </w:rPr>
+    </w:lvl>
+    <w:lvl w:ilvl="2" w:tentative="1">
+      <w:start w:val="1"/>
+      <w:numFmt w:val="bullet"/>
+      <w:lvlText w:val=""/>
+      <w:lvlJc w:val="left"/>
+      <w:pPr>
+        <w:tabs>
+          <w:tab w:val="num" w:pos="2160"/>
+        </w:tabs>
+        <w:ind w:left="2160" w:hanging="360"/>
+      </w:pPr>
+      <w:rPr>
+        <w:rFonts w:ascii="Wingdings" w:hAnsi="Wingdings" w:hint="default"/>
+        <w:sz w:val="20"/>
+      </w:rPr>
+    </w:lvl>
+    <w:lvl w:ilvl="3" w:tentative="1">
+      <w:start w:val="1"/>
+      <w:numFmt w:val="bullet"/>
+      <w:lvlText w:val=""/>
+      <w:lvlJc w:val="left"/>
+      <w:pPr>
+        <w:tabs>
+          <w:tab w:val="num" w:pos="2880"/>
+        </w:tabs>
+        <w:ind w:left="2880" w:hanging="360"/>
+      </w:pPr>
+      <w:rPr>
+        <w:rFonts w:ascii="Wingdings" w:hAnsi="Wingdings" w:hint="default"/>
+        <w:sz w:val="20"/>
+      </w:rPr>
+    </w:lvl>
+    <w:lvl w:ilvl="4" w:tentative="1">
+      <w:start w:val="1"/>
+      <w:numFmt w:val="bullet"/>
+      <w:lvlText w:val=""/>
+      <w:lvlJc w:val="left"/>
+      <w:pPr>
+        <w:tabs>
+          <w:tab w:val="num" w:pos="3600"/>
+        </w:tabs>
+        <w:ind w:left="3600" w:hanging="360"/>
+      </w:pPr>
+      <w:rPr>
+        <w:rFonts w:ascii="Wingdings" w:hAnsi="Wingdings" w:hint="default"/>
+        <w:sz w:val="20"/>
+      </w:rPr>
+    </w:lvl>
+    <w:lvl w:ilvl="5" w:tentative="1">
+      <w:start w:val="1"/>
+      <w:numFmt w:val="bullet"/>
+      <w:lvlText w:val=""/>
+      <w:lvlJc w:val="left"/>
+      <w:pPr>
+        <w:tabs>
+          <w:tab w:val="num" w:pos="4320"/>
+        </w:tabs>
+        <w:ind w:left="4320" w:hanging="360"/>
+      </w:pPr>
+      <w:rPr>
+        <w:rFonts w:ascii="Wingdings" w:hAnsi="Wingdings" w:hint="default"/>
+        <w:sz w:val="20"/>
+      </w:rPr>
+    </w:lvl>
+    <w:lvl w:ilvl="6" w:tentative="1">
+      <w:start w:val="1"/>
+      <w:numFmt w:val="bullet"/>
+      <w:lvlText w:val=""/>
+      <w:lvlJc w:val="left"/>
+      <w:pPr>
+        <w:tabs>
+          <w:tab w:val="num" w:pos="5040"/>
+        </w:tabs>
+        <w:ind w:left="5040" w:hanging="360"/>
+      </w:pPr>
+      <w:rPr>
+        <w:rFonts w:ascii="Wingdings" w:hAnsi="Wingdings" w:hint="default"/>
+        <w:sz w:val="20"/>
+      </w:rPr>
+    </w:lvl>
+    <w:lvl w:ilvl="7" w:tentative="1">
+      <w:start w:val="1"/>
+      <w:numFmt w:val="bullet"/>
+      <w:lvlText w:val=""/>
+      <w:lvlJc w:val="left"/>
+      <w:pPr>
+        <w:tabs>
+          <w:tab w:val="num" w:pos="5760"/>
+        </w:tabs>
+        <w:ind w:left="5760" w:hanging="360"/>
+      </w:pPr>
+      <w:rPr>
+        <w:rFonts w:ascii="Wingdings" w:hAnsi="Wingdings" w:hint="default"/>
+        <w:sz w:val="20"/>
+      </w:rPr>
+    </w:lvl>
+    <w:lvl w:ilvl="8" w:tentative="1">
+      <w:start w:val="1"/>
+      <w:numFmt w:val="bullet"/>
+      <w:lvlText w:val=""/>
+      <w:lvlJc w:val="left"/>
+      <w:pPr>
+        <w:tabs>
+          <w:tab w:val="num" w:pos="6480"/>
+        </w:tabs>
+        <w:ind w:left="6480" w:hanging="360"/>
+      </w:pPr>
+      <w:rPr>
+        <w:rFonts w:ascii="Wingdings" w:hAnsi="Wingdings" w:hint="default"/>
+        <w:sz w:val="20"/>
+      </w:rPr>
+    </w:lvl>
+  </w:abstractNum>
+  <w:abstractNum w:abstractNumId="11" w15:restartNumberingAfterBreak="0">
     <w:nsid w:val="20BB6C66"/>
     <w:multiLevelType w:val="multilevel"/>
     <w:tmpl w:val="93BAE7D8"/>
@@ -6146,7 +7476,7 @@
       </w:rPr>
     </w:lvl>
   </w:abstractNum>
-  <w:abstractNum w:abstractNumId="10" w15:restartNumberingAfterBreak="0">
+  <w:abstractNum w:abstractNumId="12" w15:restartNumberingAfterBreak="0">
     <w:nsid w:val="23FC3AF6"/>
     <w:multiLevelType w:val="multilevel"/>
     <w:tmpl w:val="C5C4A9C0"/>
@@ -6295,7 +7625,7 @@
       </w:rPr>
     </w:lvl>
   </w:abstractNum>
-  <w:abstractNum w:abstractNumId="11" w15:restartNumberingAfterBreak="0">
+  <w:abstractNum w:abstractNumId="13" w15:restartNumberingAfterBreak="0">
     <w:nsid w:val="2D380231"/>
     <w:multiLevelType w:val="hybridMultilevel"/>
     <w:tmpl w:val="2BC223F8"/>
@@ -6384,7 +7714,7 @@
       </w:pPr>
     </w:lvl>
   </w:abstractNum>
-  <w:abstractNum w:abstractNumId="12" w15:restartNumberingAfterBreak="0">
+  <w:abstractNum w:abstractNumId="14" w15:restartNumberingAfterBreak="0">
     <w:nsid w:val="2E33147E"/>
     <w:multiLevelType w:val="multilevel"/>
     <w:tmpl w:val="B0180518"/>
@@ -6497,7 +7827,7 @@
       </w:rPr>
     </w:lvl>
   </w:abstractNum>
-  <w:abstractNum w:abstractNumId="13" w15:restartNumberingAfterBreak="0">
+  <w:abstractNum w:abstractNumId="15" w15:restartNumberingAfterBreak="0">
     <w:nsid w:val="34584CD0"/>
     <w:multiLevelType w:val="multilevel"/>
     <w:tmpl w:val="2D04444E"/>
@@ -6646,7 +7976,7 @@
       </w:rPr>
     </w:lvl>
   </w:abstractNum>
-  <w:abstractNum w:abstractNumId="14" w15:restartNumberingAfterBreak="0">
+  <w:abstractNum w:abstractNumId="16" w15:restartNumberingAfterBreak="0">
     <w:nsid w:val="3647762F"/>
     <w:multiLevelType w:val="multilevel"/>
     <w:tmpl w:val="56B60C02"/>
@@ -6795,7 +8125,7 @@
       </w:rPr>
     </w:lvl>
   </w:abstractNum>
-  <w:abstractNum w:abstractNumId="15" w15:restartNumberingAfterBreak="0">
+  <w:abstractNum w:abstractNumId="17" w15:restartNumberingAfterBreak="0">
     <w:nsid w:val="37462DF1"/>
     <w:multiLevelType w:val="hybridMultilevel"/>
     <w:tmpl w:val="ACAA9E4E"/>
@@ -6910,7 +8240,7 @@
       </w:rPr>
     </w:lvl>
   </w:abstractNum>
-  <w:abstractNum w:abstractNumId="16" w15:restartNumberingAfterBreak="0">
+  <w:abstractNum w:abstractNumId="18" w15:restartNumberingAfterBreak="0">
     <w:nsid w:val="38BF2779"/>
     <w:multiLevelType w:val="multilevel"/>
     <w:tmpl w:val="ABFC9622"/>
@@ -7061,7 +8391,7 @@
       </w:rPr>
     </w:lvl>
   </w:abstractNum>
-  <w:abstractNum w:abstractNumId="17" w15:restartNumberingAfterBreak="0">
+  <w:abstractNum w:abstractNumId="19" w15:restartNumberingAfterBreak="0">
     <w:nsid w:val="4009533C"/>
     <w:multiLevelType w:val="multilevel"/>
     <w:tmpl w:val="E17A8900"/>
@@ -7210,7 +8540,156 @@
       </w:rPr>
     </w:lvl>
   </w:abstractNum>
-  <w:abstractNum w:abstractNumId="18" w15:restartNumberingAfterBreak="0">
+  <w:abstractNum w:abstractNumId="20" w15:restartNumberingAfterBreak="0">
+    <w:nsid w:val="40217BD1"/>
+    <w:multiLevelType w:val="multilevel"/>
+    <w:tmpl w:val="885A71E4"/>
+    <w:lvl w:ilvl="0">
+      <w:start w:val="1"/>
+      <w:numFmt w:val="bullet"/>
+      <w:lvlText w:val=""/>
+      <w:lvlJc w:val="left"/>
+      <w:pPr>
+        <w:tabs>
+          <w:tab w:val="num" w:pos="720"/>
+        </w:tabs>
+        <w:ind w:left="720" w:hanging="360"/>
+      </w:pPr>
+      <w:rPr>
+        <w:rFonts w:ascii="Symbol" w:hAnsi="Symbol" w:hint="default"/>
+        <w:sz w:val="20"/>
+      </w:rPr>
+    </w:lvl>
+    <w:lvl w:ilvl="1" w:tentative="1">
+      <w:start w:val="1"/>
+      <w:numFmt w:val="bullet"/>
+      <w:lvlText w:val="o"/>
+      <w:lvlJc w:val="left"/>
+      <w:pPr>
+        <w:tabs>
+          <w:tab w:val="num" w:pos="1440"/>
+        </w:tabs>
+        <w:ind w:left="1440" w:hanging="360"/>
+      </w:pPr>
+      <w:rPr>
+        <w:rFonts w:ascii="Courier New" w:hAnsi="Courier New" w:hint="default"/>
+        <w:sz w:val="20"/>
+      </w:rPr>
+    </w:lvl>
+    <w:lvl w:ilvl="2" w:tentative="1">
+      <w:start w:val="1"/>
+      <w:numFmt w:val="bullet"/>
+      <w:lvlText w:val=""/>
+      <w:lvlJc w:val="left"/>
+      <w:pPr>
+        <w:tabs>
+          <w:tab w:val="num" w:pos="2160"/>
+        </w:tabs>
+        <w:ind w:left="2160" w:hanging="360"/>
+      </w:pPr>
+      <w:rPr>
+        <w:rFonts w:ascii="Wingdings" w:hAnsi="Wingdings" w:hint="default"/>
+        <w:sz w:val="20"/>
+      </w:rPr>
+    </w:lvl>
+    <w:lvl w:ilvl="3" w:tentative="1">
+      <w:start w:val="1"/>
+      <w:numFmt w:val="bullet"/>
+      <w:lvlText w:val=""/>
+      <w:lvlJc w:val="left"/>
+      <w:pPr>
+        <w:tabs>
+          <w:tab w:val="num" w:pos="2880"/>
+        </w:tabs>
+        <w:ind w:left="2880" w:hanging="360"/>
+      </w:pPr>
+      <w:rPr>
+        <w:rFonts w:ascii="Wingdings" w:hAnsi="Wingdings" w:hint="default"/>
+        <w:sz w:val="20"/>
+      </w:rPr>
+    </w:lvl>
+    <w:lvl w:ilvl="4" w:tentative="1">
+      <w:start w:val="1"/>
+      <w:numFmt w:val="bullet"/>
+      <w:lvlText w:val=""/>
+      <w:lvlJc w:val="left"/>
+      <w:pPr>
+        <w:tabs>
+          <w:tab w:val="num" w:pos="3600"/>
+        </w:tabs>
+        <w:ind w:left="3600" w:hanging="360"/>
+      </w:pPr>
+      <w:rPr>
+        <w:rFonts w:ascii="Wingdings" w:hAnsi="Wingdings" w:hint="default"/>
+        <w:sz w:val="20"/>
+      </w:rPr>
+    </w:lvl>
+    <w:lvl w:ilvl="5" w:tentative="1">
+      <w:start w:val="1"/>
+      <w:numFmt w:val="bullet"/>
+      <w:lvlText w:val=""/>
+      <w:lvlJc w:val="left"/>
+      <w:pPr>
+        <w:tabs>
+          <w:tab w:val="num" w:pos="4320"/>
+        </w:tabs>
+        <w:ind w:left="4320" w:hanging="360"/>
+      </w:pPr>
+      <w:rPr>
+        <w:rFonts w:ascii="Wingdings" w:hAnsi="Wingdings" w:hint="default"/>
+        <w:sz w:val="20"/>
+      </w:rPr>
+    </w:lvl>
+    <w:lvl w:ilvl="6" w:tentative="1">
+      <w:start w:val="1"/>
+      <w:numFmt w:val="bullet"/>
+      <w:lvlText w:val=""/>
+      <w:lvlJc w:val="left"/>
+      <w:pPr>
+        <w:tabs>
+          <w:tab w:val="num" w:pos="5040"/>
+        </w:tabs>
+        <w:ind w:left="5040" w:hanging="360"/>
+      </w:pPr>
+      <w:rPr>
+        <w:rFonts w:ascii="Wingdings" w:hAnsi="Wingdings" w:hint="default"/>
+        <w:sz w:val="20"/>
+      </w:rPr>
+    </w:lvl>
+    <w:lvl w:ilvl="7" w:tentative="1">
+      <w:start w:val="1"/>
+      <w:numFmt w:val="bullet"/>
+      <w:lvlText w:val=""/>
+      <w:lvlJc w:val="left"/>
+      <w:pPr>
+        <w:tabs>
+          <w:tab w:val="num" w:pos="5760"/>
+        </w:tabs>
+        <w:ind w:left="5760" w:hanging="360"/>
+      </w:pPr>
+      <w:rPr>
+        <w:rFonts w:ascii="Wingdings" w:hAnsi="Wingdings" w:hint="default"/>
+        <w:sz w:val="20"/>
+      </w:rPr>
+    </w:lvl>
+    <w:lvl w:ilvl="8" w:tentative="1">
+      <w:start w:val="1"/>
+      <w:numFmt w:val="bullet"/>
+      <w:lvlText w:val=""/>
+      <w:lvlJc w:val="left"/>
+      <w:pPr>
+        <w:tabs>
+          <w:tab w:val="num" w:pos="6480"/>
+        </w:tabs>
+        <w:ind w:left="6480" w:hanging="360"/>
+      </w:pPr>
+      <w:rPr>
+        <w:rFonts w:ascii="Wingdings" w:hAnsi="Wingdings" w:hint="default"/>
+        <w:sz w:val="20"/>
+      </w:rPr>
+    </w:lvl>
+  </w:abstractNum>
+  <w:abstractNum w:abstractNumId="21" w15:restartNumberingAfterBreak="0">
     <w:nsid w:val="45E93668"/>
     <w:multiLevelType w:val="multilevel"/>
     <w:tmpl w:val="F0687846"/>
@@ -7359,7 +8838,7 @@
       </w:rPr>
     </w:lvl>
   </w:abstractNum>
-  <w:abstractNum w:abstractNumId="19" w15:restartNumberingAfterBreak="0">
+  <w:abstractNum w:abstractNumId="22" w15:restartNumberingAfterBreak="0">
     <w:nsid w:val="515E534D"/>
     <w:multiLevelType w:val="multilevel"/>
     <w:tmpl w:val="D1C4CFB6"/>
@@ -7508,7 +8987,7 @@
       </w:rPr>
     </w:lvl>
   </w:abstractNum>
-  <w:abstractNum w:abstractNumId="20" w15:restartNumberingAfterBreak="0">
+  <w:abstractNum w:abstractNumId="23" w15:restartNumberingAfterBreak="0">
     <w:nsid w:val="51C67026"/>
     <w:multiLevelType w:val="multilevel"/>
     <w:tmpl w:val="66C4F238"/>
@@ -7657,7 +9136,7 @@
       </w:rPr>
     </w:lvl>
   </w:abstractNum>
-  <w:abstractNum w:abstractNumId="21" w15:restartNumberingAfterBreak="0">
+  <w:abstractNum w:abstractNumId="24" w15:restartNumberingAfterBreak="0">
     <w:nsid w:val="529736CC"/>
     <w:multiLevelType w:val="multilevel"/>
     <w:tmpl w:val="BAE80E96"/>
@@ -7770,7 +9249,7 @@
       </w:rPr>
     </w:lvl>
   </w:abstractNum>
-  <w:abstractNum w:abstractNumId="22" w15:restartNumberingAfterBreak="0">
+  <w:abstractNum w:abstractNumId="25" w15:restartNumberingAfterBreak="0">
     <w:nsid w:val="54242B49"/>
     <w:multiLevelType w:val="multilevel"/>
     <w:tmpl w:val="8AEAA4A4"/>
@@ -7919,7 +9398,7 @@
       </w:rPr>
     </w:lvl>
   </w:abstractNum>
-  <w:abstractNum w:abstractNumId="23" w15:restartNumberingAfterBreak="0">
+  <w:abstractNum w:abstractNumId="26" w15:restartNumberingAfterBreak="0">
     <w:nsid w:val="56C2176C"/>
     <w:multiLevelType w:val="hybridMultilevel"/>
     <w:tmpl w:val="76C01236"/>
@@ -8034,7 +9513,156 @@
       </w:rPr>
     </w:lvl>
   </w:abstractNum>
-  <w:abstractNum w:abstractNumId="24" w15:restartNumberingAfterBreak="0">
+  <w:abstractNum w:abstractNumId="27" w15:restartNumberingAfterBreak="0">
+    <w:nsid w:val="59F0198F"/>
+    <w:multiLevelType w:val="multilevel"/>
+    <w:tmpl w:val="86087134"/>
+    <w:lvl w:ilvl="0">
+      <w:start w:val="1"/>
+      <w:numFmt w:val="bullet"/>
+      <w:lvlText w:val=""/>
+      <w:lvlJc w:val="left"/>
+      <w:pPr>
+        <w:tabs>
+          <w:tab w:val="num" w:pos="720"/>
+        </w:tabs>
+        <w:ind w:left="720" w:hanging="360"/>
+      </w:pPr>
+      <w:rPr>
+        <w:rFonts w:ascii="Symbol" w:hAnsi="Symbol" w:hint="default"/>
+        <w:sz w:val="20"/>
+      </w:rPr>
+    </w:lvl>
+    <w:lvl w:ilvl="1" w:tentative="1">
+      <w:start w:val="1"/>
+      <w:numFmt w:val="bullet"/>
+      <w:lvlText w:val="o"/>
+      <w:lvlJc w:val="left"/>
+      <w:pPr>
+        <w:tabs>
+          <w:tab w:val="num" w:pos="1440"/>
+        </w:tabs>
+        <w:ind w:left="1440" w:hanging="360"/>
+      </w:pPr>
+      <w:rPr>
+        <w:rFonts w:ascii="Courier New" w:hAnsi="Courier New" w:hint="default"/>
+        <w:sz w:val="20"/>
+      </w:rPr>
+    </w:lvl>
+    <w:lvl w:ilvl="2" w:tentative="1">
+      <w:start w:val="1"/>
+      <w:numFmt w:val="bullet"/>
+      <w:lvlText w:val=""/>
+      <w:lvlJc w:val="left"/>
+      <w:pPr>
+        <w:tabs>
+          <w:tab w:val="num" w:pos="2160"/>
+        </w:tabs>
+        <w:ind w:left="2160" w:hanging="360"/>
+      </w:pPr>
+      <w:rPr>
+        <w:rFonts w:ascii="Wingdings" w:hAnsi="Wingdings" w:hint="default"/>
+        <w:sz w:val="20"/>
+      </w:rPr>
+    </w:lvl>
+    <w:lvl w:ilvl="3" w:tentative="1">
+      <w:start w:val="1"/>
+      <w:numFmt w:val="bullet"/>
+      <w:lvlText w:val=""/>
+      <w:lvlJc w:val="left"/>
+      <w:pPr>
+        <w:tabs>
+          <w:tab w:val="num" w:pos="2880"/>
+        </w:tabs>
+        <w:ind w:left="2880" w:hanging="360"/>
+      </w:pPr>
+      <w:rPr>
+        <w:rFonts w:ascii="Wingdings" w:hAnsi="Wingdings" w:hint="default"/>
+        <w:sz w:val="20"/>
+      </w:rPr>
+    </w:lvl>
+    <w:lvl w:ilvl="4" w:tentative="1">
+      <w:start w:val="1"/>
+      <w:numFmt w:val="bullet"/>
+      <w:lvlText w:val=""/>
+      <w:lvlJc w:val="left"/>
+      <w:pPr>
+        <w:tabs>
+          <w:tab w:val="num" w:pos="3600"/>
+        </w:tabs>
+        <w:ind w:left="3600" w:hanging="360"/>
+      </w:pPr>
+      <w:rPr>
+        <w:rFonts w:ascii="Wingdings" w:hAnsi="Wingdings" w:hint="default"/>
+        <w:sz w:val="20"/>
+      </w:rPr>
+    </w:lvl>
+    <w:lvl w:ilvl="5" w:tentative="1">
+      <w:start w:val="1"/>
+      <w:numFmt w:val="bullet"/>
+      <w:lvlText w:val=""/>
+      <w:lvlJc w:val="left"/>
+      <w:pPr>
+        <w:tabs>
+          <w:tab w:val="num" w:pos="4320"/>
+        </w:tabs>
+        <w:ind w:left="4320" w:hanging="360"/>
+      </w:pPr>
+      <w:rPr>
+        <w:rFonts w:ascii="Wingdings" w:hAnsi="Wingdings" w:hint="default"/>
+        <w:sz w:val="20"/>
+      </w:rPr>
+    </w:lvl>
+    <w:lvl w:ilvl="6" w:tentative="1">
+      <w:start w:val="1"/>
+      <w:numFmt w:val="bullet"/>
+      <w:lvlText w:val=""/>
+      <w:lvlJc w:val="left"/>
+      <w:pPr>
+        <w:tabs>
+          <w:tab w:val="num" w:pos="5040"/>
+        </w:tabs>
+        <w:ind w:left="5040" w:hanging="360"/>
+      </w:pPr>
+      <w:rPr>
+        <w:rFonts w:ascii="Wingdings" w:hAnsi="Wingdings" w:hint="default"/>
+        <w:sz w:val="20"/>
+      </w:rPr>
+    </w:lvl>
+    <w:lvl w:ilvl="7" w:tentative="1">
+      <w:start w:val="1"/>
+      <w:numFmt w:val="bullet"/>
+      <w:lvlText w:val=""/>
+      <w:lvlJc w:val="left"/>
+      <w:pPr>
+        <w:tabs>
+          <w:tab w:val="num" w:pos="5760"/>
+        </w:tabs>
+        <w:ind w:left="5760" w:hanging="360"/>
+      </w:pPr>
+      <w:rPr>
+        <w:rFonts w:ascii="Wingdings" w:hAnsi="Wingdings" w:hint="default"/>
+        <w:sz w:val="20"/>
+      </w:rPr>
+    </w:lvl>
+    <w:lvl w:ilvl="8" w:tentative="1">
+      <w:start w:val="1"/>
+      <w:numFmt w:val="bullet"/>
+      <w:lvlText w:val=""/>
+      <w:lvlJc w:val="left"/>
+      <w:pPr>
+        <w:tabs>
+          <w:tab w:val="num" w:pos="6480"/>
+        </w:tabs>
+        <w:ind w:left="6480" w:hanging="360"/>
+      </w:pPr>
+      <w:rPr>
+        <w:rFonts w:ascii="Wingdings" w:hAnsi="Wingdings" w:hint="default"/>
+        <w:sz w:val="20"/>
+      </w:rPr>
+    </w:lvl>
+  </w:abstractNum>
+  <w:abstractNum w:abstractNumId="28" w15:restartNumberingAfterBreak="0">
     <w:nsid w:val="5AA233D0"/>
     <w:multiLevelType w:val="multilevel"/>
     <w:tmpl w:val="F79CE1E8"/>
@@ -8183,7 +9811,7 @@
       </w:rPr>
     </w:lvl>
   </w:abstractNum>
-  <w:abstractNum w:abstractNumId="25" w15:restartNumberingAfterBreak="0">
+  <w:abstractNum w:abstractNumId="29" w15:restartNumberingAfterBreak="0">
     <w:nsid w:val="5B093866"/>
     <w:multiLevelType w:val="multilevel"/>
     <w:tmpl w:val="C9684AA0"/>
@@ -8332,7 +9960,7 @@
       </w:rPr>
     </w:lvl>
   </w:abstractNum>
-  <w:abstractNum w:abstractNumId="26" w15:restartNumberingAfterBreak="0">
+  <w:abstractNum w:abstractNumId="30" w15:restartNumberingAfterBreak="0">
     <w:nsid w:val="5B5F17F1"/>
     <w:multiLevelType w:val="multilevel"/>
     <w:tmpl w:val="53FEA10A"/>
@@ -8445,7 +10073,7 @@
       </w:pPr>
     </w:lvl>
   </w:abstractNum>
-  <w:abstractNum w:abstractNumId="27" w15:restartNumberingAfterBreak="0">
+  <w:abstractNum w:abstractNumId="31" w15:restartNumberingAfterBreak="0">
     <w:nsid w:val="5C296082"/>
     <w:multiLevelType w:val="hybridMultilevel"/>
     <w:tmpl w:val="17A22A20"/>
@@ -8558,7 +10186,7 @@
       </w:rPr>
     </w:lvl>
   </w:abstractNum>
-  <w:abstractNum w:abstractNumId="28" w15:restartNumberingAfterBreak="0">
+  <w:abstractNum w:abstractNumId="32" w15:restartNumberingAfterBreak="0">
     <w:nsid w:val="65B94988"/>
     <w:multiLevelType w:val="multilevel"/>
     <w:tmpl w:val="2F86AD6C"/>
@@ -8707,7 +10335,271 @@
       </w:rPr>
     </w:lvl>
   </w:abstractNum>
-  <w:abstractNum w:abstractNumId="29" w15:restartNumberingAfterBreak="0">
+  <w:abstractNum w:abstractNumId="33" w15:restartNumberingAfterBreak="0">
+    <w:nsid w:val="6924476B"/>
+    <w:multiLevelType w:val="multilevel"/>
+    <w:tmpl w:val="37DE8CD4"/>
+    <w:lvl w:ilvl="0">
+      <w:start w:val="1"/>
+      <w:numFmt w:val="bullet"/>
+      <w:lvlText w:val=""/>
+      <w:lvlJc w:val="left"/>
+      <w:pPr>
+        <w:tabs>
+          <w:tab w:val="num" w:pos="720"/>
+        </w:tabs>
+        <w:ind w:left="720" w:hanging="360"/>
+      </w:pPr>
+      <w:rPr>
+        <w:rFonts w:ascii="Symbol" w:hAnsi="Symbol" w:hint="default"/>
+        <w:sz w:val="20"/>
+      </w:rPr>
+    </w:lvl>
+    <w:lvl w:ilvl="1" w:tentative="1">
+      <w:start w:val="1"/>
+      <w:numFmt w:val="bullet"/>
+      <w:lvlText w:val="o"/>
+      <w:lvlJc w:val="left"/>
+      <w:pPr>
+        <w:tabs>
+          <w:tab w:val="num" w:pos="1440"/>
+        </w:tabs>
+        <w:ind w:left="1440" w:hanging="360"/>
+      </w:pPr>
+      <w:rPr>
+        <w:rFonts w:ascii="Courier New" w:hAnsi="Courier New" w:hint="default"/>
+        <w:sz w:val="20"/>
+      </w:rPr>
+    </w:lvl>
+    <w:lvl w:ilvl="2" w:tentative="1">
+      <w:start w:val="1"/>
+      <w:numFmt w:val="bullet"/>
+      <w:lvlText w:val=""/>
+      <w:lvlJc w:val="left"/>
+      <w:pPr>
+        <w:tabs>
+          <w:tab w:val="num" w:pos="2160"/>
+        </w:tabs>
+        <w:ind w:left="2160" w:hanging="360"/>
+      </w:pPr>
+      <w:rPr>
+        <w:rFonts w:ascii="Wingdings" w:hAnsi="Wingdings" w:hint="default"/>
+        <w:sz w:val="20"/>
+      </w:rPr>
+    </w:lvl>
+    <w:lvl w:ilvl="3" w:tentative="1">
+      <w:start w:val="1"/>
+      <w:numFmt w:val="bullet"/>
+      <w:lvlText w:val=""/>
+      <w:lvlJc w:val="left"/>
+      <w:pPr>
+        <w:tabs>
+          <w:tab w:val="num" w:pos="2880"/>
+        </w:tabs>
+        <w:ind w:left="2880" w:hanging="360"/>
+      </w:pPr>
+      <w:rPr>
+        <w:rFonts w:ascii="Wingdings" w:hAnsi="Wingdings" w:hint="default"/>
+        <w:sz w:val="20"/>
+      </w:rPr>
+    </w:lvl>
+    <w:lvl w:ilvl="4" w:tentative="1">
+      <w:start w:val="1"/>
+      <w:numFmt w:val="bullet"/>
+      <w:lvlText w:val=""/>
+      <w:lvlJc w:val="left"/>
+      <w:pPr>
+        <w:tabs>
+          <w:tab w:val="num" w:pos="3600"/>
+        </w:tabs>
+        <w:ind w:left="3600" w:hanging="360"/>
+      </w:pPr>
+      <w:rPr>
+        <w:rFonts w:ascii="Wingdings" w:hAnsi="Wingdings" w:hint="default"/>
+        <w:sz w:val="20"/>
+      </w:rPr>
+    </w:lvl>
+    <w:lvl w:ilvl="5" w:tentative="1">
+      <w:start w:val="1"/>
+      <w:numFmt w:val="bullet"/>
+      <w:lvlText w:val=""/>
+      <w:lvlJc w:val="left"/>
+      <w:pPr>
+        <w:tabs>
+          <w:tab w:val="num" w:pos="4320"/>
+        </w:tabs>
+        <w:ind w:left="4320" w:hanging="360"/>
+      </w:pPr>
+      <w:rPr>
+        <w:rFonts w:ascii="Wingdings" w:hAnsi="Wingdings" w:hint="default"/>
+        <w:sz w:val="20"/>
+      </w:rPr>
+    </w:lvl>
+    <w:lvl w:ilvl="6" w:tentative="1">
+      <w:start w:val="1"/>
+      <w:numFmt w:val="bullet"/>
+      <w:lvlText w:val=""/>
+      <w:lvlJc w:val="left"/>
+      <w:pPr>
+        <w:tabs>
+          <w:tab w:val="num" w:pos="5040"/>
+        </w:tabs>
+        <w:ind w:left="5040" w:hanging="360"/>
+      </w:pPr>
+      <w:rPr>
+        <w:rFonts w:ascii="Wingdings" w:hAnsi="Wingdings" w:hint="default"/>
+        <w:sz w:val="20"/>
+      </w:rPr>
+    </w:lvl>
+    <w:lvl w:ilvl="7" w:tentative="1">
+      <w:start w:val="1"/>
+      <w:numFmt w:val="bullet"/>
+      <w:lvlText w:val=""/>
+      <w:lvlJc w:val="left"/>
+      <w:pPr>
+        <w:tabs>
+          <w:tab w:val="num" w:pos="5760"/>
+        </w:tabs>
+        <w:ind w:left="5760" w:hanging="360"/>
+      </w:pPr>
+      <w:rPr>
+        <w:rFonts w:ascii="Wingdings" w:hAnsi="Wingdings" w:hint="default"/>
+        <w:sz w:val="20"/>
+      </w:rPr>
+    </w:lvl>
+    <w:lvl w:ilvl="8" w:tentative="1">
+      <w:start w:val="1"/>
+      <w:numFmt w:val="bullet"/>
+      <w:lvlText w:val=""/>
+      <w:lvlJc w:val="left"/>
+      <w:pPr>
+        <w:tabs>
+          <w:tab w:val="num" w:pos="6480"/>
+        </w:tabs>
+        <w:ind w:left="6480" w:hanging="360"/>
+      </w:pPr>
+      <w:rPr>
+        <w:rFonts w:ascii="Wingdings" w:hAnsi="Wingdings" w:hint="default"/>
+        <w:sz w:val="20"/>
+      </w:rPr>
+    </w:lvl>
+  </w:abstractNum>
+  <w:abstractNum w:abstractNumId="34" w15:restartNumberingAfterBreak="0">
+    <w:nsid w:val="6AC13D9D"/>
+    <w:multiLevelType w:val="hybridMultilevel"/>
+    <w:tmpl w:val="DCF6825C"/>
+    <w:lvl w:ilvl="0" w:tplc="BDA4B384">
+      <w:start w:val="1"/>
+      <w:numFmt w:val="bullet"/>
+      <w:lvlText w:val="-"/>
+      <w:lvlJc w:val="left"/>
+      <w:pPr>
+        <w:ind w:left="1080" w:hanging="360"/>
+      </w:pPr>
+      <w:rPr>
+        <w:rFonts w:ascii="Times New Roman" w:eastAsia="Times New Roman" w:hAnsi="Times New Roman" w:cs="Times New Roman" w:hint="default"/>
+        <w:b/>
+        <w:color w:val="000000"/>
+      </w:rPr>
+    </w:lvl>
+    <w:lvl w:ilvl="1" w:tplc="04090003" w:tentative="1">
+      <w:start w:val="1"/>
+      <w:numFmt w:val="bullet"/>
+      <w:lvlText w:val="o"/>
+      <w:lvlJc w:val="left"/>
+      <w:pPr>
+        <w:ind w:left="1800" w:hanging="360"/>
+      </w:pPr>
+      <w:rPr>
+        <w:rFonts w:ascii="Courier New" w:hAnsi="Courier New" w:cs="Courier New" w:hint="default"/>
+      </w:rPr>
+    </w:lvl>
+    <w:lvl w:ilvl="2" w:tplc="04090005" w:tentative="1">
+      <w:start w:val="1"/>
+      <w:numFmt w:val="bullet"/>
+      <w:lvlText w:val=""/>
+      <w:lvlJc w:val="left"/>
+      <w:pPr>
+        <w:ind w:left="2520" w:hanging="360"/>
+      </w:pPr>
+      <w:rPr>
+        <w:rFonts w:ascii="Wingdings" w:hAnsi="Wingdings" w:hint="default"/>
+      </w:rPr>
+    </w:lvl>
+    <w:lvl w:ilvl="3" w:tplc="04090001" w:tentative="1">
+      <w:start w:val="1"/>
+      <w:numFmt w:val="bullet"/>
+      <w:lvlText w:val=""/>
+      <w:lvlJc w:val="left"/>
+      <w:pPr>
+        <w:ind w:left="3240" w:hanging="360"/>
+      </w:pPr>
+      <w:rPr>
+        <w:rFonts w:ascii="Symbol" w:hAnsi="Symbol" w:hint="default"/>
+      </w:rPr>
+    </w:lvl>
+    <w:lvl w:ilvl="4" w:tplc="04090003" w:tentative="1">
+      <w:start w:val="1"/>
+      <w:numFmt w:val="bullet"/>
+      <w:lvlText w:val="o"/>
+      <w:lvlJc w:val="left"/>
+      <w:pPr>
+        <w:ind w:left="3960" w:hanging="360"/>
+      </w:pPr>
+      <w:rPr>
+        <w:rFonts w:ascii="Courier New" w:hAnsi="Courier New" w:cs="Courier New" w:hint="default"/>
+      </w:rPr>
+    </w:lvl>
+    <w:lvl w:ilvl="5" w:tplc="04090005" w:tentative="1">
+      <w:start w:val="1"/>
+      <w:numFmt w:val="bullet"/>
+      <w:lvlText w:val=""/>
+      <w:lvlJc w:val="left"/>
+      <w:pPr>
+        <w:ind w:left="4680" w:hanging="360"/>
+      </w:pPr>
+      <w:rPr>
+        <w:rFonts w:ascii="Wingdings" w:hAnsi="Wingdings" w:hint="default"/>
+      </w:rPr>
+    </w:lvl>
+    <w:lvl w:ilvl="6" w:tplc="04090001" w:tentative="1">
+      <w:start w:val="1"/>
+      <w:numFmt w:val="bullet"/>
+      <w:lvlText w:val=""/>
+      <w:lvlJc w:val="left"/>
+      <w:pPr>
+        <w:ind w:left="5400" w:hanging="360"/>
+      </w:pPr>
+      <w:rPr>
+        <w:rFonts w:ascii="Symbol" w:hAnsi="Symbol" w:hint="default"/>
+      </w:rPr>
+    </w:lvl>
+    <w:lvl w:ilvl="7" w:tplc="04090003" w:tentative="1">
+      <w:start w:val="1"/>
+      <w:numFmt w:val="bullet"/>
+      <w:lvlText w:val="o"/>
+      <w:lvlJc w:val="left"/>
+      <w:pPr>
+        <w:ind w:left="6120" w:hanging="360"/>
+      </w:pPr>
+      <w:rPr>
+        <w:rFonts w:ascii="Courier New" w:hAnsi="Courier New" w:cs="Courier New" w:hint="default"/>
+      </w:rPr>
+    </w:lvl>
+    <w:lvl w:ilvl="8" w:tplc="04090005" w:tentative="1">
+      <w:start w:val="1"/>
+      <w:numFmt w:val="bullet"/>
+      <w:lvlText w:val=""/>
+      <w:lvlJc w:val="left"/>
+      <w:pPr>
+        <w:ind w:left="6840" w:hanging="360"/>
+      </w:pPr>
+      <w:rPr>
+        <w:rFonts w:ascii="Wingdings" w:hAnsi="Wingdings" w:hint="default"/>
+      </w:rPr>
+    </w:lvl>
+  </w:abstractNum>
+  <w:abstractNum w:abstractNumId="35" w15:restartNumberingAfterBreak="0">
     <w:nsid w:val="71BE6108"/>
     <w:multiLevelType w:val="multilevel"/>
     <w:tmpl w:val="9D5440D8"/>
@@ -8856,7 +10748,7 @@
       </w:rPr>
     </w:lvl>
   </w:abstractNum>
-  <w:abstractNum w:abstractNumId="30" w15:restartNumberingAfterBreak="0">
+  <w:abstractNum w:abstractNumId="36" w15:restartNumberingAfterBreak="0">
     <w:nsid w:val="798359B5"/>
     <w:multiLevelType w:val="multilevel"/>
     <w:tmpl w:val="A540169C"/>
@@ -9005,7 +10897,7 @@
       </w:rPr>
     </w:lvl>
   </w:abstractNum>
-  <w:abstractNum w:abstractNumId="31" w15:restartNumberingAfterBreak="0">
+  <w:abstractNum w:abstractNumId="37" w15:restartNumberingAfterBreak="0">
     <w:nsid w:val="79B910ED"/>
     <w:multiLevelType w:val="hybridMultilevel"/>
     <w:tmpl w:val="012C4742"/>
@@ -9120,7 +11012,7 @@
       </w:rPr>
     </w:lvl>
   </w:abstractNum>
-  <w:abstractNum w:abstractNumId="32" w15:restartNumberingAfterBreak="0">
+  <w:abstractNum w:abstractNumId="38" w15:restartNumberingAfterBreak="0">
     <w:nsid w:val="7CF811A5"/>
     <w:multiLevelType w:val="hybridMultilevel"/>
     <w:tmpl w:val="D21E5BCA"/>
@@ -9233,7 +11125,7 @@
       </w:rPr>
     </w:lvl>
   </w:abstractNum>
-  <w:abstractNum w:abstractNumId="33" w15:restartNumberingAfterBreak="0">
+  <w:abstractNum w:abstractNumId="39" w15:restartNumberingAfterBreak="0">
     <w:nsid w:val="7E985D6B"/>
     <w:multiLevelType w:val="hybridMultilevel"/>
     <w:tmpl w:val="4AA046AE"/>
@@ -9346,7 +11238,7 @@
       </w:rPr>
     </w:lvl>
   </w:abstractNum>
-  <w:abstractNum w:abstractNumId="34" w15:restartNumberingAfterBreak="0">
+  <w:abstractNum w:abstractNumId="40" w15:restartNumberingAfterBreak="0">
     <w:nsid w:val="7EAE3E8A"/>
     <w:multiLevelType w:val="multilevel"/>
     <w:tmpl w:val="F8F223C4"/>
@@ -9459,7 +11351,7 @@
       </w:rPr>
     </w:lvl>
   </w:abstractNum>
-  <w:abstractNum w:abstractNumId="35" w15:restartNumberingAfterBreak="0">
+  <w:abstractNum w:abstractNumId="41" w15:restartNumberingAfterBreak="0">
     <w:nsid w:val="7F4D6E9D"/>
     <w:multiLevelType w:val="multilevel"/>
     <w:tmpl w:val="AD7865BC"/>
@@ -9579,106 +11471,124 @@
     <w:abstractNumId w:val="1"/>
   </w:num>
   <w:num w:numId="3" w16cid:durableId="175922415">
+    <w:abstractNumId w:val="13"/>
+  </w:num>
+  <w:num w:numId="4" w16cid:durableId="762605503">
+    <w:abstractNumId w:val="9"/>
+  </w:num>
+  <w:num w:numId="5" w16cid:durableId="88932562">
     <w:abstractNumId w:val="11"/>
   </w:num>
-  <w:num w:numId="4" w16cid:durableId="762605503">
-    <w:abstractNumId w:val="8"/>
-  </w:num>
-  <w:num w:numId="5" w16cid:durableId="88932562">
-    <w:abstractNumId w:val="9"/>
-  </w:num>
   <w:num w:numId="6" w16cid:durableId="1977637766">
-    <w:abstractNumId w:val="12"/>
+    <w:abstractNumId w:val="14"/>
   </w:num>
   <w:num w:numId="7" w16cid:durableId="1863471893">
-    <w:abstractNumId w:val="20"/>
+    <w:abstractNumId w:val="23"/>
   </w:num>
   <w:num w:numId="8" w16cid:durableId="973020106">
     <w:abstractNumId w:val="2"/>
   </w:num>
   <w:num w:numId="9" w16cid:durableId="106244939">
-    <w:abstractNumId w:val="19"/>
+    <w:abstractNumId w:val="22"/>
   </w:num>
   <w:num w:numId="10" w16cid:durableId="1726442119">
-    <w:abstractNumId w:val="32"/>
+    <w:abstractNumId w:val="38"/>
   </w:num>
   <w:num w:numId="11" w16cid:durableId="200437981">
-    <w:abstractNumId w:val="27"/>
+    <w:abstractNumId w:val="31"/>
   </w:num>
   <w:num w:numId="12" w16cid:durableId="1570074541">
     <w:abstractNumId w:val="4"/>
   </w:num>
   <w:num w:numId="13" w16cid:durableId="461657596">
-    <w:abstractNumId w:val="33"/>
+    <w:abstractNumId w:val="39"/>
   </w:num>
   <w:num w:numId="14" w16cid:durableId="839857498">
-    <w:abstractNumId w:val="35"/>
+    <w:abstractNumId w:val="41"/>
   </w:num>
   <w:num w:numId="15" w16cid:durableId="733044691">
-    <w:abstractNumId w:val="34"/>
+    <w:abstractNumId w:val="40"/>
   </w:num>
   <w:num w:numId="16" w16cid:durableId="1094328109">
-    <w:abstractNumId w:val="28"/>
+    <w:abstractNumId w:val="32"/>
   </w:num>
   <w:num w:numId="17" w16cid:durableId="531646460">
-    <w:abstractNumId w:val="10"/>
+    <w:abstractNumId w:val="12"/>
   </w:num>
   <w:num w:numId="18" w16cid:durableId="252591477">
-    <w:abstractNumId w:val="31"/>
+    <w:abstractNumId w:val="37"/>
   </w:num>
   <w:num w:numId="19" w16cid:durableId="932133179">
-    <w:abstractNumId w:val="15"/>
+    <w:abstractNumId w:val="17"/>
   </w:num>
   <w:num w:numId="20" w16cid:durableId="45841172">
     <w:abstractNumId w:val="6"/>
   </w:num>
   <w:num w:numId="21" w16cid:durableId="1264386997">
-    <w:abstractNumId w:val="23"/>
+    <w:abstractNumId w:val="26"/>
   </w:num>
   <w:num w:numId="22" w16cid:durableId="1201479460">
-    <w:abstractNumId w:val="30"/>
+    <w:abstractNumId w:val="36"/>
   </w:num>
   <w:num w:numId="23" w16cid:durableId="64226689">
+    <w:abstractNumId w:val="18"/>
+  </w:num>
+  <w:num w:numId="24" w16cid:durableId="1949191909">
+    <w:abstractNumId w:val="15"/>
+  </w:num>
+  <w:num w:numId="25" w16cid:durableId="1044908837">
+    <w:abstractNumId w:val="35"/>
+  </w:num>
+  <w:num w:numId="26" w16cid:durableId="381321195">
+    <w:abstractNumId w:val="29"/>
+  </w:num>
+  <w:num w:numId="27" w16cid:durableId="350423342">
     <w:abstractNumId w:val="16"/>
   </w:num>
-  <w:num w:numId="24" w16cid:durableId="1949191909">
-    <w:abstractNumId w:val="13"/>
-  </w:num>
-  <w:num w:numId="25" w16cid:durableId="1044908837">
-    <w:abstractNumId w:val="29"/>
-  </w:num>
-  <w:num w:numId="26" w16cid:durableId="381321195">
-    <w:abstractNumId w:val="25"/>
-  </w:num>
-  <w:num w:numId="27" w16cid:durableId="350423342">
-    <w:abstractNumId w:val="14"/>
-  </w:num>
   <w:num w:numId="28" w16cid:durableId="99301761">
-    <w:abstractNumId w:val="24"/>
+    <w:abstractNumId w:val="28"/>
   </w:num>
   <w:num w:numId="29" w16cid:durableId="1227686836">
-    <w:abstractNumId w:val="18"/>
+    <w:abstractNumId w:val="21"/>
   </w:num>
   <w:num w:numId="30" w16cid:durableId="319502056">
-    <w:abstractNumId w:val="17"/>
+    <w:abstractNumId w:val="19"/>
   </w:num>
   <w:num w:numId="31" w16cid:durableId="792408488">
     <w:abstractNumId w:val="5"/>
   </w:num>
   <w:num w:numId="32" w16cid:durableId="144441432">
-    <w:abstractNumId w:val="21"/>
+    <w:abstractNumId w:val="24"/>
   </w:num>
   <w:num w:numId="33" w16cid:durableId="1830170405">
-    <w:abstractNumId w:val="22"/>
+    <w:abstractNumId w:val="25"/>
   </w:num>
   <w:num w:numId="34" w16cid:durableId="952907690">
-    <w:abstractNumId w:val="26"/>
+    <w:abstractNumId w:val="30"/>
   </w:num>
   <w:num w:numId="35" w16cid:durableId="1837375106">
     <w:abstractNumId w:val="7"/>
   </w:num>
   <w:num w:numId="36" w16cid:durableId="955022580">
     <w:abstractNumId w:val="3"/>
+  </w:num>
+  <w:num w:numId="37" w16cid:durableId="874930041">
+    <w:abstractNumId w:val="27"/>
+  </w:num>
+  <w:num w:numId="38" w16cid:durableId="1363701821">
+    <w:abstractNumId w:val="20"/>
+  </w:num>
+  <w:num w:numId="39" w16cid:durableId="630481277">
+    <w:abstractNumId w:val="8"/>
+  </w:num>
+  <w:num w:numId="40" w16cid:durableId="362825111">
+    <w:abstractNumId w:val="34"/>
+  </w:num>
+  <w:num w:numId="41" w16cid:durableId="26875590">
+    <w:abstractNumId w:val="33"/>
+  </w:num>
+  <w:num w:numId="42" w16cid:durableId="291600163">
+    <w:abstractNumId w:val="10"/>
   </w:num>
 </w:numbering>
 </file>
@@ -10289,7 +12199,6 @@
   <w:style w:type="character" w:default="1" w:styleId="DefaultParagraphFont">
     <w:name w:val="Default Paragraph Font"/>
     <w:uiPriority w:val="1"/>
-    <w:semiHidden/>
     <w:unhideWhenUsed/>
   </w:style>
   <w:style w:type="table" w:default="1" w:styleId="TableNormal">

</xml_diff>

<commit_message>
3.6 Phân tích đơn và đa biến
</commit_message>
<xml_diff>
--- a/File docs/Báo cáo dự án.docx
+++ b/File docs/Báo cáo dự án.docx
@@ -6687,10 +6687,526 @@
     </w:p>
     <w:p>
       <w:pPr>
-        <w:rPr>
-          <w:lang w:val="vi-VN"/>
-        </w:rPr>
-      </w:pPr>
+        <w:pStyle w:val="Heading2"/>
+        <w:rPr>
+          <w:lang w:val="vi-VN"/>
+        </w:rPr>
+      </w:pPr>
+      <w:r>
+        <w:t>3.</w:t>
+      </w:r>
+      <w:r>
+        <w:t>6</w:t>
+      </w:r>
+      <w:r>
+        <w:t xml:space="preserve"> </w:t>
+      </w:r>
+      <w:r>
+        <w:t>PHÂN</w:t>
+      </w:r>
+      <w:r>
+        <w:rPr>
+          <w:lang w:val="vi-VN"/>
+        </w:rPr>
+        <w:t xml:space="preserve"> TÍCH ĐƠN BIẾN VÀ ĐA BIẾN</w:t>
+      </w:r>
+    </w:p>
+    <w:p>
+      <w:pPr>
+        <w:pStyle w:val="Heading3"/>
+        <w:rPr>
+          <w:lang w:val="vi-VN"/>
+        </w:rPr>
+      </w:pPr>
+      <w:r>
+        <w:t>3.</w:t>
+      </w:r>
+      <w:r>
+        <w:t>6</w:t>
+      </w:r>
+      <w:r>
+        <w:t xml:space="preserve">.1 </w:t>
+      </w:r>
+      <w:r>
+        <w:t>Phân</w:t>
+      </w:r>
+      <w:r>
+        <w:rPr>
+          <w:lang w:val="vi-VN"/>
+        </w:rPr>
+        <w:t xml:space="preserve"> tích đơn biến</w:t>
+      </w:r>
+    </w:p>
+    <w:p>
+      <w:pPr>
+        <w:pStyle w:val="Heading4"/>
+        <w:rPr>
+          <w:i w:val="0"/>
+          <w:iCs w:val="0"/>
+          <w:lang w:val="vi-VN"/>
+        </w:rPr>
+      </w:pPr>
+      <w:r>
+        <w:rPr>
+          <w:i w:val="0"/>
+          <w:iCs w:val="0"/>
+        </w:rPr>
+        <w:t>3.6.</w:t>
+      </w:r>
+      <w:r>
+        <w:rPr>
+          <w:i w:val="0"/>
+          <w:iCs w:val="0"/>
+        </w:rPr>
+        <w:t>1</w:t>
+      </w:r>
+      <w:r>
+        <w:rPr>
+          <w:i w:val="0"/>
+          <w:iCs w:val="0"/>
+          <w:lang w:val="vi-VN"/>
+        </w:rPr>
+        <w:t>.1</w:t>
+      </w:r>
+      <w:r>
+        <w:rPr>
+          <w:i w:val="0"/>
+          <w:iCs w:val="0"/>
+        </w:rPr>
+        <w:t xml:space="preserve"> Phân</w:t>
+      </w:r>
+      <w:r>
+        <w:rPr>
+          <w:i w:val="0"/>
+          <w:iCs w:val="0"/>
+          <w:lang w:val="vi-VN"/>
+        </w:rPr>
+        <w:t xml:space="preserve"> tích </w:t>
+      </w:r>
+      <w:r>
+        <w:rPr>
+          <w:i w:val="0"/>
+          <w:iCs w:val="0"/>
+          <w:lang w:val="vi-VN"/>
+        </w:rPr>
+        <w:t>doanh số</w:t>
+      </w:r>
+    </w:p>
+    <w:p>
+      <w:pPr>
+        <w:pStyle w:val="Heading4"/>
+        <w:rPr>
+          <w:i w:val="0"/>
+          <w:iCs w:val="0"/>
+          <w:lang w:val="vi-VN"/>
+        </w:rPr>
+      </w:pPr>
+      <w:r>
+        <w:rPr>
+          <w:i w:val="0"/>
+          <w:iCs w:val="0"/>
+        </w:rPr>
+        <w:t>3.6.</w:t>
+      </w:r>
+      <w:r>
+        <w:rPr>
+          <w:i w:val="0"/>
+          <w:iCs w:val="0"/>
+        </w:rPr>
+        <w:t>1</w:t>
+      </w:r>
+      <w:r>
+        <w:rPr>
+          <w:i w:val="0"/>
+          <w:iCs w:val="0"/>
+          <w:lang w:val="vi-VN"/>
+        </w:rPr>
+        <w:t>.</w:t>
+      </w:r>
+      <w:r>
+        <w:rPr>
+          <w:i w:val="0"/>
+          <w:iCs w:val="0"/>
+          <w:lang w:val="vi-VN"/>
+        </w:rPr>
+        <w:t>2</w:t>
+      </w:r>
+      <w:r>
+        <w:rPr>
+          <w:i w:val="0"/>
+          <w:iCs w:val="0"/>
+        </w:rPr>
+        <w:t xml:space="preserve"> Phân</w:t>
+      </w:r>
+      <w:r>
+        <w:rPr>
+          <w:i w:val="0"/>
+          <w:iCs w:val="0"/>
+          <w:lang w:val="vi-VN"/>
+        </w:rPr>
+        <w:t xml:space="preserve"> tích </w:t>
+      </w:r>
+      <w:r>
+        <w:rPr>
+          <w:i w:val="0"/>
+          <w:iCs w:val="0"/>
+          <w:lang w:val="vi-VN"/>
+        </w:rPr>
+        <w:t>lợi nhuận</w:t>
+      </w:r>
+    </w:p>
+    <w:p>
+      <w:pPr>
+        <w:pStyle w:val="Heading4"/>
+        <w:rPr>
+          <w:i w:val="0"/>
+          <w:iCs w:val="0"/>
+          <w:lang w:val="vi-VN"/>
+        </w:rPr>
+      </w:pPr>
+      <w:r>
+        <w:rPr>
+          <w:i w:val="0"/>
+          <w:iCs w:val="0"/>
+        </w:rPr>
+        <w:t>3.6.</w:t>
+      </w:r>
+      <w:r>
+        <w:rPr>
+          <w:i w:val="0"/>
+          <w:iCs w:val="0"/>
+        </w:rPr>
+        <w:t>1</w:t>
+      </w:r>
+      <w:r>
+        <w:rPr>
+          <w:i w:val="0"/>
+          <w:iCs w:val="0"/>
+          <w:lang w:val="vi-VN"/>
+        </w:rPr>
+        <w:t>.</w:t>
+      </w:r>
+      <w:r>
+        <w:rPr>
+          <w:i w:val="0"/>
+          <w:iCs w:val="0"/>
+          <w:lang w:val="vi-VN"/>
+        </w:rPr>
+        <w:t>3</w:t>
+      </w:r>
+      <w:r>
+        <w:rPr>
+          <w:i w:val="0"/>
+          <w:iCs w:val="0"/>
+        </w:rPr>
+        <w:t xml:space="preserve"> Phân</w:t>
+      </w:r>
+      <w:r>
+        <w:rPr>
+          <w:i w:val="0"/>
+          <w:iCs w:val="0"/>
+          <w:lang w:val="vi-VN"/>
+        </w:rPr>
+        <w:t xml:space="preserve"> tích </w:t>
+      </w:r>
+      <w:r>
+        <w:rPr>
+          <w:i w:val="0"/>
+          <w:iCs w:val="0"/>
+          <w:lang w:val="vi-VN"/>
+        </w:rPr>
+        <w:t>thời gian</w:t>
+      </w:r>
+    </w:p>
+    <w:p>
+      <w:pPr>
+        <w:rPr>
+          <w:lang w:val="vi-VN"/>
+        </w:rPr>
+      </w:pPr>
+    </w:p>
+    <w:p>
+      <w:pPr>
+        <w:pStyle w:val="Heading3"/>
+        <w:rPr>
+          <w:lang w:val="vi-VN"/>
+        </w:rPr>
+      </w:pPr>
+      <w:r>
+        <w:lastRenderedPageBreak/>
+        <w:t>3.6.</w:t>
+      </w:r>
+      <w:r>
+        <w:t>2</w:t>
+      </w:r>
+      <w:r>
+        <w:t xml:space="preserve"> Phân</w:t>
+      </w:r>
+      <w:r>
+        <w:rPr>
+          <w:lang w:val="vi-VN"/>
+        </w:rPr>
+        <w:t xml:space="preserve"> tích </w:t>
+      </w:r>
+      <w:r>
+        <w:rPr>
+          <w:lang w:val="vi-VN"/>
+        </w:rPr>
+        <w:t>đa</w:t>
+      </w:r>
+      <w:r>
+        <w:rPr>
+          <w:lang w:val="vi-VN"/>
+        </w:rPr>
+        <w:t xml:space="preserve"> biến</w:t>
+      </w:r>
+    </w:p>
+    <w:p>
+      <w:pPr>
+        <w:pStyle w:val="Heading4"/>
+        <w:rPr>
+          <w:i w:val="0"/>
+          <w:iCs w:val="0"/>
+          <w:lang w:val="vi-VN"/>
+        </w:rPr>
+      </w:pPr>
+      <w:r>
+        <w:rPr>
+          <w:i w:val="0"/>
+          <w:iCs w:val="0"/>
+        </w:rPr>
+        <w:t>3.6.</w:t>
+      </w:r>
+      <w:r>
+        <w:rPr>
+          <w:i w:val="0"/>
+          <w:iCs w:val="0"/>
+        </w:rPr>
+        <w:t>2</w:t>
+      </w:r>
+      <w:r>
+        <w:rPr>
+          <w:i w:val="0"/>
+          <w:iCs w:val="0"/>
+          <w:lang w:val="vi-VN"/>
+        </w:rPr>
+        <w:t>.1</w:t>
+      </w:r>
+      <w:r>
+        <w:rPr>
+          <w:i w:val="0"/>
+          <w:iCs w:val="0"/>
+        </w:rPr>
+        <w:t xml:space="preserve"> Phân</w:t>
+      </w:r>
+      <w:r>
+        <w:rPr>
+          <w:i w:val="0"/>
+          <w:iCs w:val="0"/>
+          <w:lang w:val="vi-VN"/>
+        </w:rPr>
+        <w:t xml:space="preserve"> tích </w:t>
+      </w:r>
+      <w:r>
+        <w:rPr>
+          <w:i w:val="0"/>
+          <w:iCs w:val="0"/>
+          <w:lang w:val="vi-VN"/>
+        </w:rPr>
+        <w:t>hiệu suất kinh doanh theo năm và thị trường</w:t>
+      </w:r>
+    </w:p>
+    <w:p>
+      <w:pPr>
+        <w:pStyle w:val="Heading4"/>
+        <w:rPr>
+          <w:lang w:val="vi-VN"/>
+        </w:rPr>
+      </w:pPr>
+      <w:r>
+        <w:rPr>
+          <w:i w:val="0"/>
+          <w:iCs w:val="0"/>
+        </w:rPr>
+        <w:t>3.6.</w:t>
+      </w:r>
+      <w:r>
+        <w:rPr>
+          <w:i w:val="0"/>
+          <w:iCs w:val="0"/>
+        </w:rPr>
+        <w:t>2</w:t>
+      </w:r>
+      <w:r>
+        <w:rPr>
+          <w:i w:val="0"/>
+          <w:iCs w:val="0"/>
+          <w:lang w:val="vi-VN"/>
+        </w:rPr>
+        <w:t>.</w:t>
+      </w:r>
+      <w:r>
+        <w:rPr>
+          <w:i w:val="0"/>
+          <w:iCs w:val="0"/>
+          <w:lang w:val="vi-VN"/>
+        </w:rPr>
+        <w:t>2</w:t>
+      </w:r>
+      <w:r>
+        <w:rPr>
+          <w:i w:val="0"/>
+          <w:iCs w:val="0"/>
+        </w:rPr>
+        <w:t xml:space="preserve"> Phân</w:t>
+      </w:r>
+      <w:r>
+        <w:rPr>
+          <w:i w:val="0"/>
+          <w:iCs w:val="0"/>
+          <w:lang w:val="vi-VN"/>
+        </w:rPr>
+        <w:t xml:space="preserve"> tích </w:t>
+      </w:r>
+      <w:r>
+        <w:rPr>
+          <w:i w:val="0"/>
+          <w:iCs w:val="0"/>
+          <w:lang w:val="vi-VN"/>
+        </w:rPr>
+        <w:t xml:space="preserve">chi tiết ngành hàng </w:t>
+      </w:r>
+      <w:r>
+        <w:rPr>
+          <w:i w:val="0"/>
+          <w:iCs w:val="0"/>
+          <w:lang w:val="vi-VN"/>
+        </w:rPr>
+        <w:t>(</w:t>
+      </w:r>
+      <w:r>
+        <w:rPr>
+          <w:i w:val="0"/>
+          <w:iCs w:val="0"/>
+          <w:lang w:val="vi-VN"/>
+        </w:rPr>
+        <w:t>Category &amp; Sub-</w:t>
+      </w:r>
+      <w:r>
+        <w:rPr>
+          <w:i w:val="0"/>
+          <w:iCs w:val="0"/>
+          <w:lang w:val="vi-VN"/>
+        </w:rPr>
+        <w:t>Category</w:t>
+      </w:r>
+      <w:r>
+        <w:rPr>
+          <w:lang w:val="vi-VN"/>
+        </w:rPr>
+        <w:t>)</w:t>
+      </w:r>
+    </w:p>
+    <w:p>
+      <w:pPr>
+        <w:pStyle w:val="Heading4"/>
+        <w:rPr>
+          <w:lang w:val="vi-VN"/>
+        </w:rPr>
+      </w:pPr>
+      <w:r>
+        <w:rPr>
+          <w:i w:val="0"/>
+          <w:iCs w:val="0"/>
+        </w:rPr>
+        <w:t>3.6.</w:t>
+      </w:r>
+      <w:r>
+        <w:rPr>
+          <w:i w:val="0"/>
+          <w:iCs w:val="0"/>
+        </w:rPr>
+        <w:t>2</w:t>
+      </w:r>
+      <w:r>
+        <w:rPr>
+          <w:i w:val="0"/>
+          <w:iCs w:val="0"/>
+          <w:lang w:val="vi-VN"/>
+        </w:rPr>
+        <w:t>.</w:t>
+      </w:r>
+      <w:r>
+        <w:rPr>
+          <w:i w:val="0"/>
+          <w:iCs w:val="0"/>
+          <w:lang w:val="vi-VN"/>
+        </w:rPr>
+        <w:t>3</w:t>
+      </w:r>
+      <w:r>
+        <w:rPr>
+          <w:i w:val="0"/>
+          <w:iCs w:val="0"/>
+        </w:rPr>
+        <w:t xml:space="preserve"> Phân</w:t>
+      </w:r>
+      <w:r>
+        <w:rPr>
+          <w:i w:val="0"/>
+          <w:iCs w:val="0"/>
+          <w:lang w:val="vi-VN"/>
+        </w:rPr>
+        <w:t xml:space="preserve"> tích </w:t>
+      </w:r>
+      <w:r>
+        <w:rPr>
+          <w:i w:val="0"/>
+          <w:iCs w:val="0"/>
+          <w:lang w:val="vi-VN"/>
+        </w:rPr>
+        <w:t>h</w:t>
+      </w:r>
+      <w:r>
+        <w:rPr>
+          <w:i w:val="0"/>
+          <w:iCs w:val="0"/>
+          <w:lang w:val="vi-VN"/>
+        </w:rPr>
+        <w:t xml:space="preserve">iệu suất </w:t>
+      </w:r>
+      <w:r>
+        <w:rPr>
+          <w:i w:val="0"/>
+          <w:iCs w:val="0"/>
+          <w:lang w:val="vi-VN"/>
+        </w:rPr>
+        <w:t>v</w:t>
+      </w:r>
+      <w:r>
+        <w:rPr>
+          <w:i w:val="0"/>
+          <w:iCs w:val="0"/>
+          <w:lang w:val="vi-VN"/>
+        </w:rPr>
+        <w:t xml:space="preserve">ận chuyển &amp; </w:t>
+      </w:r>
+      <w:r>
+        <w:rPr>
+          <w:i w:val="0"/>
+          <w:iCs w:val="0"/>
+          <w:lang w:val="vi-VN"/>
+        </w:rPr>
+        <w:t>l</w:t>
+      </w:r>
+      <w:r>
+        <w:rPr>
+          <w:i w:val="0"/>
+          <w:iCs w:val="0"/>
+          <w:lang w:val="vi-VN"/>
+        </w:rPr>
+        <w:t>ogistics</w:t>
+      </w:r>
     </w:p>
     <w:sectPr>
       <w:pgSz w:w="12240" w:h="15840"/>

</xml_diff>

<commit_message>
báo cáo đa biến và đơn biến
</commit_message>
<xml_diff>
--- a/File docs/Báo cáo dự án.docx
+++ b/File docs/Báo cáo dự án.docx
@@ -6739,6 +6739,7 @@
         </w:rPr>
       </w:pPr>
       <w:r>
+        <w:lastRenderedPageBreak/>
         <w:t>3.6 PHÂN</w:t>
       </w:r>
       <w:r>
@@ -6814,6 +6815,88 @@
     </w:p>
     <w:p>
       <w:pPr>
+        <w:rPr>
+          <w:lang w:val="vi-VN"/>
+        </w:rPr>
+      </w:pPr>
+      <w:r>
+        <w:rPr>
+          <w:lang w:val="vi-VN"/>
+        </w:rPr>
+        <w:drawing>
+          <wp:inline distT="0" distB="0" distL="0" distR="0" wp14:anchorId="42D0240F" wp14:editId="4808903B">
+            <wp:extent cx="5943600" cy="3180715"/>
+            <wp:effectExtent l="0" t="0" r="0" b="635"/>
+            <wp:docPr id="1646133346" name="Picture 1"/>
+            <wp:cNvGraphicFramePr>
+              <a:graphicFrameLocks xmlns:a="http://schemas.openxmlformats.org/drawingml/2006/main" noChangeAspect="1"/>
+            </wp:cNvGraphicFramePr>
+            <a:graphic xmlns:a="http://schemas.openxmlformats.org/drawingml/2006/main">
+              <a:graphicData uri="http://schemas.openxmlformats.org/drawingml/2006/picture">
+                <pic:pic xmlns:pic="http://schemas.openxmlformats.org/drawingml/2006/picture">
+                  <pic:nvPicPr>
+                    <pic:cNvPr id="1646133346" name=""/>
+                    <pic:cNvPicPr/>
+                  </pic:nvPicPr>
+                  <pic:blipFill>
+                    <a:blip r:embed="rId18"/>
+                    <a:stretch>
+                      <a:fillRect/>
+                    </a:stretch>
+                  </pic:blipFill>
+                  <pic:spPr>
+                    <a:xfrm>
+                      <a:off x="0" y="0"/>
+                      <a:ext cx="5943600" cy="3180715"/>
+                    </a:xfrm>
+                    <a:prstGeom prst="rect">
+                      <a:avLst/>
+                    </a:prstGeom>
+                  </pic:spPr>
+                </pic:pic>
+              </a:graphicData>
+            </a:graphic>
+          </wp:inline>
+        </w:drawing>
+      </w:r>
+    </w:p>
+    <w:p>
+      <w:pPr>
+        <w:rPr>
+          <w:rFonts w:ascii="Times New Roman" w:hAnsi="Times New Roman" w:cs="Times New Roman"/>
+          <w:sz w:val="24"/>
+          <w:szCs w:val="24"/>
+          <w:lang w:val="vi-VN"/>
+        </w:rPr>
+      </w:pPr>
+      <w:r>
+        <w:rPr>
+          <w:rFonts w:ascii="Times New Roman" w:hAnsi="Times New Roman" w:cs="Times New Roman"/>
+          <w:sz w:val="24"/>
+          <w:szCs w:val="24"/>
+        </w:rPr>
+        <w:t xml:space="preserve">Nhận xét </w:t>
+      </w:r>
+      <w:r>
+        <w:rPr>
+          <w:rFonts w:ascii="Times New Roman" w:hAnsi="Times New Roman" w:cs="Times New Roman"/>
+          <w:sz w:val="24"/>
+          <w:szCs w:val="24"/>
+          <w:lang w:val="vi-VN"/>
+        </w:rPr>
+        <w:t xml:space="preserve">: </w:t>
+      </w:r>
+      <w:r>
+        <w:rPr>
+          <w:rFonts w:ascii="Times New Roman" w:hAnsi="Times New Roman" w:cs="Times New Roman"/>
+          <w:sz w:val="24"/>
+          <w:szCs w:val="24"/>
+        </w:rPr>
+        <w:t>Nhìn chung, lượng đơn hàng của doanh nghiệp tập trung chủ yếu ở phân khúc giá trị trung bình và thấp. Trong đó, phân khúc từ $100 – $500 chiếm tỷ trọng lớn nhất với 32.43% (16,619 đơn hàng), theo sát sau đó là phân khúc từ $10 – $50 với 30.50% (15,630 đơn hàng). Ngược lại, các đơn hàng giá trị cao (trên $5,000) xuất hiện rất ít, chỉ chiếm 0.09% tổng số đơn. Điều này cho thấy nguồn thu chính của doanh nghiệp đang dựa vào số lượng lớn các đơn hàng vừa và nhỏ.</w:t>
+      </w:r>
+    </w:p>
+    <w:p>
+      <w:pPr>
         <w:pStyle w:val="Heading4"/>
         <w:rPr>
           <w:i w:val="0"/>
@@ -6826,6 +6909,7 @@
           <w:i w:val="0"/>
           <w:iCs w:val="0"/>
         </w:rPr>
+        <w:lastRenderedPageBreak/>
         <w:t>3.6.</w:t>
       </w:r>
       <w:r>
@@ -6869,6 +6953,88 @@
     </w:p>
     <w:p>
       <w:pPr>
+        <w:rPr>
+          <w:lang w:val="vi-VN"/>
+        </w:rPr>
+      </w:pPr>
+      <w:r>
+        <w:rPr>
+          <w:lang w:val="vi-VN"/>
+        </w:rPr>
+        <w:drawing>
+          <wp:inline distT="0" distB="0" distL="0" distR="0" wp14:anchorId="34FB0C74" wp14:editId="3F5231AA">
+            <wp:extent cx="5943600" cy="3326130"/>
+            <wp:effectExtent l="0" t="0" r="0" b="7620"/>
+            <wp:docPr id="1541982817" name="Picture 1"/>
+            <wp:cNvGraphicFramePr>
+              <a:graphicFrameLocks xmlns:a="http://schemas.openxmlformats.org/drawingml/2006/main" noChangeAspect="1"/>
+            </wp:cNvGraphicFramePr>
+            <a:graphic xmlns:a="http://schemas.openxmlformats.org/drawingml/2006/main">
+              <a:graphicData uri="http://schemas.openxmlformats.org/drawingml/2006/picture">
+                <pic:pic xmlns:pic="http://schemas.openxmlformats.org/drawingml/2006/picture">
+                  <pic:nvPicPr>
+                    <pic:cNvPr id="1541982817" name=""/>
+                    <pic:cNvPicPr/>
+                  </pic:nvPicPr>
+                  <pic:blipFill>
+                    <a:blip r:embed="rId19"/>
+                    <a:stretch>
+                      <a:fillRect/>
+                    </a:stretch>
+                  </pic:blipFill>
+                  <pic:spPr>
+                    <a:xfrm>
+                      <a:off x="0" y="0"/>
+                      <a:ext cx="5943600" cy="3326130"/>
+                    </a:xfrm>
+                    <a:prstGeom prst="rect">
+                      <a:avLst/>
+                    </a:prstGeom>
+                  </pic:spPr>
+                </pic:pic>
+              </a:graphicData>
+            </a:graphic>
+          </wp:inline>
+        </w:drawing>
+      </w:r>
+    </w:p>
+    <w:p>
+      <w:pPr>
+        <w:rPr>
+          <w:rFonts w:ascii="Times New Roman" w:hAnsi="Times New Roman" w:cs="Times New Roman"/>
+          <w:sz w:val="24"/>
+          <w:szCs w:val="24"/>
+          <w:lang w:val="vi-VN"/>
+        </w:rPr>
+      </w:pPr>
+      <w:r>
+        <w:rPr>
+          <w:rFonts w:ascii="Times New Roman" w:hAnsi="Times New Roman" w:cs="Times New Roman"/>
+          <w:sz w:val="24"/>
+          <w:szCs w:val="24"/>
+        </w:rPr>
+        <w:t xml:space="preserve">Nhận xét </w:t>
+      </w:r>
+      <w:r>
+        <w:rPr>
+          <w:rFonts w:ascii="Times New Roman" w:hAnsi="Times New Roman" w:cs="Times New Roman"/>
+          <w:sz w:val="24"/>
+          <w:szCs w:val="24"/>
+          <w:lang w:val="vi-VN"/>
+        </w:rPr>
+        <w:t xml:space="preserve">: </w:t>
+      </w:r>
+      <w:r>
+        <w:rPr>
+          <w:rFonts w:ascii="Times New Roman" w:hAnsi="Times New Roman" w:cs="Times New Roman"/>
+          <w:sz w:val="24"/>
+          <w:szCs w:val="24"/>
+        </w:rPr>
+        <w:t>Kết quả thống kê cho thấy hoạt động kinh doanh của doanh nghiệp đạt hiệu quả tương đối tốt với 74.23% tổng số đơn hàng mang lại lợi nhuận dương (tương ứng với 38,043 đơn hàng). Tuy nhiên, tỷ lệ đơn hàng đang chịu tình trạng thua lỗ vẫn còn ở mức khá cao, chiếm 24.47% (12,541 đơn hàng). Lượng đơn hàng hòa vốn chiếm tỷ trọng không đáng kể với 1.30% (668 đơn hàng). Nhìn chung, mặc dù phần lớn các giao dịch đều sinh lời, doanh nghiệp vẫn cần có các biện pháp rà soát lại nhóm đơn hàng bù lỗ để tối ưu hóa hiệu quả tài chính.</w:t>
+      </w:r>
+    </w:p>
+    <w:p>
+      <w:pPr>
         <w:pStyle w:val="Heading4"/>
         <w:rPr>
           <w:i w:val="0"/>
@@ -6881,6 +7047,7 @@
           <w:i w:val="0"/>
           <w:iCs w:val="0"/>
         </w:rPr>
+        <w:lastRenderedPageBreak/>
         <w:t>3.6.</w:t>
       </w:r>
       <w:r>
@@ -6928,6 +7095,96 @@
           <w:lang w:val="vi-VN"/>
         </w:rPr>
       </w:pPr>
+      <w:r>
+        <w:rPr>
+          <w:lang w:val="vi-VN"/>
+        </w:rPr>
+        <w:drawing>
+          <wp:inline distT="0" distB="0" distL="0" distR="0" wp14:anchorId="5D47F459" wp14:editId="5B10A949">
+            <wp:extent cx="5943600" cy="3342005"/>
+            <wp:effectExtent l="0" t="0" r="0" b="0"/>
+            <wp:docPr id="820576927" name="Picture 1"/>
+            <wp:cNvGraphicFramePr>
+              <a:graphicFrameLocks xmlns:a="http://schemas.openxmlformats.org/drawingml/2006/main" noChangeAspect="1"/>
+            </wp:cNvGraphicFramePr>
+            <a:graphic xmlns:a="http://schemas.openxmlformats.org/drawingml/2006/main">
+              <a:graphicData uri="http://schemas.openxmlformats.org/drawingml/2006/picture">
+                <pic:pic xmlns:pic="http://schemas.openxmlformats.org/drawingml/2006/picture">
+                  <pic:nvPicPr>
+                    <pic:cNvPr id="820576927" name=""/>
+                    <pic:cNvPicPr/>
+                  </pic:nvPicPr>
+                  <pic:blipFill>
+                    <a:blip r:embed="rId20"/>
+                    <a:stretch>
+                      <a:fillRect/>
+                    </a:stretch>
+                  </pic:blipFill>
+                  <pic:spPr>
+                    <a:xfrm>
+                      <a:off x="0" y="0"/>
+                      <a:ext cx="5943600" cy="3342005"/>
+                    </a:xfrm>
+                    <a:prstGeom prst="rect">
+                      <a:avLst/>
+                    </a:prstGeom>
+                  </pic:spPr>
+                </pic:pic>
+              </a:graphicData>
+            </a:graphic>
+          </wp:inline>
+        </w:drawing>
+      </w:r>
+    </w:p>
+    <w:p>
+      <w:pPr>
+        <w:rPr>
+          <w:lang w:val="vi-VN"/>
+        </w:rPr>
+      </w:pPr>
+      <w:r>
+        <w:rPr>
+          <w:rFonts w:ascii="Times New Roman" w:hAnsi="Times New Roman" w:cs="Times New Roman"/>
+          <w:sz w:val="24"/>
+          <w:szCs w:val="24"/>
+        </w:rPr>
+        <w:t xml:space="preserve">Nhận </w:t>
+      </w:r>
+      <w:r>
+        <w:rPr>
+          <w:rFonts w:ascii="Times New Roman" w:hAnsi="Times New Roman" w:cs="Times New Roman"/>
+          <w:sz w:val="24"/>
+          <w:szCs w:val="24"/>
+        </w:rPr>
+        <w:t>xét</w:t>
+      </w:r>
+      <w:r>
+        <w:rPr>
+          <w:rFonts w:ascii="Times New Roman" w:hAnsi="Times New Roman" w:cs="Times New Roman"/>
+          <w:sz w:val="24"/>
+          <w:szCs w:val="24"/>
+          <w:lang w:val="vi-VN"/>
+        </w:rPr>
+        <w:t xml:space="preserve"> :</w:t>
+      </w:r>
+      <w:r>
+        <w:rPr>
+          <w:rFonts w:ascii="Times New Roman" w:hAnsi="Times New Roman" w:cs="Times New Roman"/>
+          <w:sz w:val="24"/>
+          <w:szCs w:val="24"/>
+        </w:rPr>
+        <w:t xml:space="preserve"> Nhìn chung, nhu cầu mua sắm của khách hàng biến động mạnh theo các mùa trong năm và có xu hướng tăng tốc rõ rệt vào nửa cuối năm. Lượng đơn hàng tập trung đậm đặc nhất vào quý IV, đạt đỉnh vào Tháng 11 (12.37%) và Tháng 12 (12.28%) nhờ vào các mùa lễ hội và chiến dịch kích cầu cuối năm. Ngược lại, giai đoạn đầu năm là thời kỳ thấp điểm, với Tháng 2 ghi nhận lượng đơn hàng chạm đáy toàn năm, chỉ chiếm 4.22% (2,165 đơn). Doanh nghiệp cần dựa vào tính chu kỳ này để phân phối ngân sách marketing và kế hoạch tồn kho hợp lý</w:t>
+      </w:r>
+      <w:r>
+        <w:t>.</w:t>
+      </w:r>
+    </w:p>
+    <w:p>
+      <w:pPr>
+        <w:rPr>
+          <w:lang w:val="vi-VN"/>
+        </w:rPr>
+      </w:pPr>
     </w:p>
     <w:p>
       <w:pPr>
@@ -6937,6 +7194,7 @@
         </w:rPr>
       </w:pPr>
       <w:r>
+        <w:lastRenderedPageBreak/>
         <w:t>3.6.2 Phân</w:t>
       </w:r>
       <w:r>
@@ -7003,6 +7261,81 @@
     </w:p>
     <w:p>
       <w:pPr>
+        <w:rPr>
+          <w:lang w:val="vi-VN"/>
+        </w:rPr>
+      </w:pPr>
+      <w:r>
+        <w:rPr>
+          <w:lang w:val="vi-VN"/>
+        </w:rPr>
+        <w:drawing>
+          <wp:inline distT="0" distB="0" distL="0" distR="0" wp14:anchorId="1BF81379" wp14:editId="0982B2A5">
+            <wp:extent cx="5943600" cy="3147060"/>
+            <wp:effectExtent l="0" t="0" r="0" b="0"/>
+            <wp:docPr id="2003075461" name="Picture 1"/>
+            <wp:cNvGraphicFramePr>
+              <a:graphicFrameLocks xmlns:a="http://schemas.openxmlformats.org/drawingml/2006/main" noChangeAspect="1"/>
+            </wp:cNvGraphicFramePr>
+            <a:graphic xmlns:a="http://schemas.openxmlformats.org/drawingml/2006/main">
+              <a:graphicData uri="http://schemas.openxmlformats.org/drawingml/2006/picture">
+                <pic:pic xmlns:pic="http://schemas.openxmlformats.org/drawingml/2006/picture">
+                  <pic:nvPicPr>
+                    <pic:cNvPr id="2003075461" name=""/>
+                    <pic:cNvPicPr/>
+                  </pic:nvPicPr>
+                  <pic:blipFill>
+                    <a:blip r:embed="rId21"/>
+                    <a:stretch>
+                      <a:fillRect/>
+                    </a:stretch>
+                  </pic:blipFill>
+                  <pic:spPr>
+                    <a:xfrm>
+                      <a:off x="0" y="0"/>
+                      <a:ext cx="5943600" cy="3147060"/>
+                    </a:xfrm>
+                    <a:prstGeom prst="rect">
+                      <a:avLst/>
+                    </a:prstGeom>
+                  </pic:spPr>
+                </pic:pic>
+              </a:graphicData>
+            </a:graphic>
+          </wp:inline>
+        </w:drawing>
+      </w:r>
+    </w:p>
+    <w:p>
+      <w:pPr>
+        <w:rPr>
+          <w:rFonts w:ascii="Times New Roman" w:hAnsi="Times New Roman" w:cs="Times New Roman"/>
+          <w:sz w:val="24"/>
+          <w:szCs w:val="24"/>
+          <w:lang w:val="vi-VN"/>
+        </w:rPr>
+      </w:pPr>
+      <w:r>
+        <w:rPr>
+          <w:rFonts w:ascii="Times New Roman" w:hAnsi="Times New Roman" w:cs="Times New Roman"/>
+          <w:sz w:val="24"/>
+          <w:szCs w:val="24"/>
+          <w:lang w:val="vi-VN"/>
+        </w:rPr>
+        <w:t xml:space="preserve">Nhận xét : </w:t>
+      </w:r>
+      <w:r>
+        <w:rPr>
+          <w:rFonts w:ascii="Times New Roman" w:hAnsi="Times New Roman" w:cs="Times New Roman"/>
+          <w:sz w:val="24"/>
+          <w:szCs w:val="24"/>
+          <w:lang w:val="vi-VN"/>
+        </w:rPr>
+        <w:t>Tổng doanh số (Total Sales) và lợi nhuận (Total Profit) toàn cầu của Superstore có sự tăng trưởng liên tục và đồng đều qua các năm (từ năm 2011 đến năm 2014). Mặc dù doanh số liên tục tăng qua các năm (đạt mức rất cao vào năm 2014), nhưng tổng lợi nhuận mang về lại tăng trưởng rất chậm và biên lợi nhuận cực kỳ mỏng.</w:t>
+      </w:r>
+    </w:p>
+    <w:p>
+      <w:pPr>
         <w:pStyle w:val="Heading4"/>
         <w:rPr>
           <w:lang w:val="vi-VN"/>
@@ -7070,47 +7403,117 @@
     </w:p>
     <w:p>
       <w:pPr>
+        <w:rPr>
+          <w:lang w:val="vi-VN"/>
+        </w:rPr>
+      </w:pPr>
+      <w:r>
+        <w:rPr>
+          <w:lang w:val="vi-VN"/>
+        </w:rPr>
+        <w:drawing>
+          <wp:inline distT="0" distB="0" distL="0" distR="0" wp14:anchorId="410ABBF4" wp14:editId="14A96734">
+            <wp:extent cx="5943600" cy="3193415"/>
+            <wp:effectExtent l="0" t="0" r="0" b="6985"/>
+            <wp:docPr id="773608377" name="Picture 1"/>
+            <wp:cNvGraphicFramePr>
+              <a:graphicFrameLocks xmlns:a="http://schemas.openxmlformats.org/drawingml/2006/main" noChangeAspect="1"/>
+            </wp:cNvGraphicFramePr>
+            <a:graphic xmlns:a="http://schemas.openxmlformats.org/drawingml/2006/main">
+              <a:graphicData uri="http://schemas.openxmlformats.org/drawingml/2006/picture">
+                <pic:pic xmlns:pic="http://schemas.openxmlformats.org/drawingml/2006/picture">
+                  <pic:nvPicPr>
+                    <pic:cNvPr id="773608377" name=""/>
+                    <pic:cNvPicPr/>
+                  </pic:nvPicPr>
+                  <pic:blipFill>
+                    <a:blip r:embed="rId22"/>
+                    <a:stretch>
+                      <a:fillRect/>
+                    </a:stretch>
+                  </pic:blipFill>
+                  <pic:spPr>
+                    <a:xfrm>
+                      <a:off x="0" y="0"/>
+                      <a:ext cx="5943600" cy="3193415"/>
+                    </a:xfrm>
+                    <a:prstGeom prst="rect">
+                      <a:avLst/>
+                    </a:prstGeom>
+                  </pic:spPr>
+                </pic:pic>
+              </a:graphicData>
+            </a:graphic>
+          </wp:inline>
+        </w:drawing>
+      </w:r>
+    </w:p>
+    <w:p>
+      <w:pPr>
+        <w:rPr>
+          <w:rFonts w:ascii="Times New Roman" w:hAnsi="Times New Roman" w:cs="Times New Roman"/>
+          <w:sz w:val="24"/>
+          <w:szCs w:val="24"/>
+          <w:lang w:val="vi-VN"/>
+        </w:rPr>
+      </w:pPr>
+      <w:r>
+        <w:rPr>
+          <w:rFonts w:ascii="Times New Roman" w:hAnsi="Times New Roman" w:cs="Times New Roman"/>
+          <w:sz w:val="24"/>
+          <w:szCs w:val="24"/>
+          <w:lang w:val="vi-VN"/>
+        </w:rPr>
+        <w:lastRenderedPageBreak/>
+        <w:t xml:space="preserve">Nhận xét : </w:t>
+      </w:r>
+      <w:r>
+        <w:rPr>
+          <w:rFonts w:ascii="Times New Roman" w:hAnsi="Times New Roman" w:cs="Times New Roman"/>
+          <w:sz w:val="24"/>
+          <w:szCs w:val="24"/>
+          <w:lang w:val="vi-VN"/>
+        </w:rPr>
+        <w:t>Công nghệ (Technology), cụ thể là hai nhóm Copiers (Máy photocopy) và Phones (Điện thoại) là những sản phẩm mang lại lợi nhuận lớn nhất cho toàn hệ thống. Ngành hàng gánh lỗ nặng nhất: Đồ nội thất (Furniture), đặc biệt là nhóm Tables (Bàn ghế).</w:t>
+      </w:r>
+    </w:p>
+    <w:p>
+      <w:pPr>
         <w:pStyle w:val="Heading4"/>
-        <w:rPr>
-          <w:lang w:val="vi-VN"/>
-        </w:rPr>
-      </w:pPr>
-      <w:r>
         <w:rPr>
           <w:i w:val="0"/>
           <w:iCs w:val="0"/>
-        </w:rPr>
-        <w:t>3.6.</w:t>
-      </w:r>
+          <w:lang w:val="vi-VN"/>
+        </w:rPr>
+      </w:pPr>
       <w:r>
         <w:rPr>
           <w:i w:val="0"/>
           <w:iCs w:val="0"/>
         </w:rPr>
-        <w:t>2</w:t>
+        <w:t>3.6.</w:t>
       </w:r>
       <w:r>
         <w:rPr>
           <w:i w:val="0"/>
           <w:iCs w:val="0"/>
-          <w:lang w:val="vi-VN"/>
-        </w:rPr>
-        <w:t>.3</w:t>
+        </w:rPr>
+        <w:t>2</w:t>
       </w:r>
       <w:r>
         <w:rPr>
           <w:i w:val="0"/>
           <w:iCs w:val="0"/>
-        </w:rPr>
-        <w:t xml:space="preserve"> Phân</w:t>
+          <w:lang w:val="vi-VN"/>
+        </w:rPr>
+        <w:t>.3</w:t>
       </w:r>
       <w:r>
         <w:rPr>
           <w:i w:val="0"/>
           <w:iCs w:val="0"/>
-          <w:lang w:val="vi-VN"/>
-        </w:rPr>
-        <w:t xml:space="preserve"> tích </w:t>
+        </w:rPr>
+        <w:t xml:space="preserve"> Phân</w:t>
       </w:r>
       <w:r>
         <w:rPr>
@@ -7118,7 +7521,7 @@
           <w:iCs w:val="0"/>
           <w:lang w:val="vi-VN"/>
         </w:rPr>
-        <w:t>h</w:t>
+        <w:t xml:space="preserve"> tích </w:t>
       </w:r>
       <w:r>
         <w:rPr>
@@ -7126,7 +7529,7 @@
           <w:iCs w:val="0"/>
           <w:lang w:val="vi-VN"/>
         </w:rPr>
-        <w:t xml:space="preserve">iệu suất </w:t>
+        <w:t>h</w:t>
       </w:r>
       <w:r>
         <w:rPr>
@@ -7134,7 +7537,7 @@
           <w:iCs w:val="0"/>
           <w:lang w:val="vi-VN"/>
         </w:rPr>
-        <w:t>v</w:t>
+        <w:t xml:space="preserve">iệu suất </w:t>
       </w:r>
       <w:r>
         <w:rPr>
@@ -7142,7 +7545,7 @@
           <w:iCs w:val="0"/>
           <w:lang w:val="vi-VN"/>
         </w:rPr>
-        <w:t xml:space="preserve">ận chuyển &amp; </w:t>
+        <w:t>v</w:t>
       </w:r>
       <w:r>
         <w:rPr>
@@ -7150,7 +7553,7 @@
           <w:iCs w:val="0"/>
           <w:lang w:val="vi-VN"/>
         </w:rPr>
-        <w:t>l</w:t>
+        <w:t xml:space="preserve">ận chuyển &amp; </w:t>
       </w:r>
       <w:r>
         <w:rPr>
@@ -7158,7 +7561,90 @@
           <w:iCs w:val="0"/>
           <w:lang w:val="vi-VN"/>
         </w:rPr>
+        <w:t>l</w:t>
+      </w:r>
+      <w:r>
+        <w:rPr>
+          <w:i w:val="0"/>
+          <w:iCs w:val="0"/>
+          <w:lang w:val="vi-VN"/>
+        </w:rPr>
         <w:t>ogistics</w:t>
+      </w:r>
+    </w:p>
+    <w:p>
+      <w:pPr>
+        <w:rPr>
+          <w:lang w:val="vi-VN"/>
+        </w:rPr>
+      </w:pPr>
+      <w:r>
+        <w:rPr>
+          <w:lang w:val="vi-VN"/>
+        </w:rPr>
+        <w:drawing>
+          <wp:inline distT="0" distB="0" distL="0" distR="0" wp14:anchorId="7C88A894" wp14:editId="783B4FED">
+            <wp:extent cx="5943600" cy="3182620"/>
+            <wp:effectExtent l="0" t="0" r="0" b="0"/>
+            <wp:docPr id="59274171" name="Picture 1"/>
+            <wp:cNvGraphicFramePr>
+              <a:graphicFrameLocks xmlns:a="http://schemas.openxmlformats.org/drawingml/2006/main" noChangeAspect="1"/>
+            </wp:cNvGraphicFramePr>
+            <a:graphic xmlns:a="http://schemas.openxmlformats.org/drawingml/2006/main">
+              <a:graphicData uri="http://schemas.openxmlformats.org/drawingml/2006/picture">
+                <pic:pic xmlns:pic="http://schemas.openxmlformats.org/drawingml/2006/picture">
+                  <pic:nvPicPr>
+                    <pic:cNvPr id="59274171" name=""/>
+                    <pic:cNvPicPr/>
+                  </pic:nvPicPr>
+                  <pic:blipFill>
+                    <a:blip r:embed="rId23"/>
+                    <a:stretch>
+                      <a:fillRect/>
+                    </a:stretch>
+                  </pic:blipFill>
+                  <pic:spPr>
+                    <a:xfrm>
+                      <a:off x="0" y="0"/>
+                      <a:ext cx="5943600" cy="3182620"/>
+                    </a:xfrm>
+                    <a:prstGeom prst="rect">
+                      <a:avLst/>
+                    </a:prstGeom>
+                  </pic:spPr>
+                </pic:pic>
+              </a:graphicData>
+            </a:graphic>
+          </wp:inline>
+        </w:drawing>
+      </w:r>
+    </w:p>
+    <w:p>
+      <w:pPr>
+        <w:rPr>
+          <w:rFonts w:ascii="Times New Roman" w:hAnsi="Times New Roman" w:cs="Times New Roman"/>
+          <w:sz w:val="24"/>
+          <w:szCs w:val="24"/>
+          <w:lang w:val="vi-VN"/>
+        </w:rPr>
+      </w:pPr>
+      <w:r>
+        <w:rPr>
+          <w:rFonts w:ascii="Times New Roman" w:hAnsi="Times New Roman" w:cs="Times New Roman"/>
+          <w:sz w:val="24"/>
+          <w:szCs w:val="24"/>
+          <w:lang w:val="vi-VN"/>
+        </w:rPr>
+        <w:t xml:space="preserve">Nhận xét : </w:t>
+      </w:r>
+      <w:r>
+        <w:rPr>
+          <w:rFonts w:ascii="Times New Roman" w:hAnsi="Times New Roman" w:cs="Times New Roman"/>
+          <w:sz w:val="24"/>
+          <w:szCs w:val="24"/>
+          <w:lang w:val="vi-VN"/>
+        </w:rPr>
+        <w:t>Chi phí vận chuyển trung bình (avg_shipping_cost) phụ thuộc hoàn toàn vào hình thức giao hàng. Giao trong ngày (Same Day) có chi phí cao nhất (dao động từ $41 đến $95 tùy độ ưu tiên), theo sau là First Class, Second Class, và thấp nhất là giao tiêu chuẩn (Standard Class). Và biến số ngày trễ trung bình (avg_delay_days) phản ánh đúng bản chất của từng gói dịch vụ: Same Day có độ trễ bằng 0, First Class trễ ~2 ngày, Second Class trễ ~3 ngày, và Standard Class trễ từ 4–5 ngày.</w:t>
       </w:r>
     </w:p>
     <w:sectPr>
@@ -9711,7 +10197,6 @@
   <w:style w:type="character" w:default="1" w:styleId="DefaultParagraphFont">
     <w:name w:val="Default Paragraph Font"/>
     <w:uiPriority w:val="1"/>
-    <w:semiHidden/>
     <w:unhideWhenUsed/>
   </w:style>
   <w:style w:type="table" w:default="1" w:styleId="TableNormal">

</xml_diff>

<commit_message>
Sửa báo cáo 3.6
</commit_message>
<xml_diff>
--- a/File docs/Báo cáo dự án.docx
+++ b/File docs/Báo cáo dự án.docx
@@ -7445,7 +7445,15 @@
           <w:lang w:val="vi-VN"/>
         </w:rPr>
         <w:lastRenderedPageBreak/>
-        <w:t>Nhận xét : Công nghệ (Technology), cụ thể là hai nhóm Copiers (Máy photocopy) và Phones (Điện thoại) là những sản phẩm mang lại lợi nhuận lớn nhất cho toàn hệ thống. Ngành hàng gánh lỗ nặng nhất: Đồ nội thất (Furniture), đặc biệt là nhóm Tables (Bàn ghế).</w:t>
+        <w:t xml:space="preserve">Nhận xét : </w:t>
+      </w:r>
+      <w:r>
+        <w:rPr>
+          <w:rFonts w:ascii="Times New Roman" w:hAnsi="Times New Roman" w:cs="Times New Roman"/>
+          <w:sz w:val="24"/>
+          <w:szCs w:val="24"/>
+        </w:rPr>
+        <w:t>Trong khi ngành hàng Công nghệ (đặc biệt là Copiers) đóng vai trò trụ cột cứu vãn lợi nhuận nhờ biên lợi nhuận vượt trội 20.5%, thì nhóm ngành hàng Bàn ghế (Tables) lại đang đốt tiền của doanh nghiệp với mức lỗ biên -8.8%. Nguyên nhân trực tiếp đến từ chính sách chiết khấu quá tay (trên 28%)</w:t>
       </w:r>
     </w:p>
     <w:p>
@@ -10162,7 +10170,6 @@
   <w:style w:type="character" w:default="1" w:styleId="DefaultParagraphFont">
     <w:name w:val="Default Paragraph Font"/>
     <w:uiPriority w:val="1"/>
-    <w:semiHidden/>
     <w:unhideWhenUsed/>
   </w:style>
   <w:style w:type="table" w:default="1" w:styleId="TableNormal">

</xml_diff>

<commit_message>
báo cáo db 1
</commit_message>
<xml_diff>
--- a/File docs/Báo cáo dự án.docx
+++ b/File docs/Báo cáo dự án.docx
@@ -8269,6 +8269,7 @@
     <w:p>
       <w:pPr>
         <w:pStyle w:val="Heading2"/>
+        <w:ind w:left="567"/>
       </w:pPr>
       <w:r>
         <w:t>4.3 CHI TIẾT HỆ THỐNG DASHBOARD PHÂN TÍCH</w:t>
@@ -8277,6 +8278,7 @@
     <w:p>
       <w:pPr>
         <w:pStyle w:val="Heading3"/>
+        <w:ind w:left="567"/>
       </w:pPr>
       <w:bookmarkStart w:id="2" w:name="_Toc227352036"/>
       <w:r>
@@ -8285,6 +8287,9 @@
       <w:bookmarkEnd w:id="2"/>
     </w:p>
     <w:p>
+      <w:pPr>
+        <w:ind w:left="567"/>
+      </w:pPr>
       <w:r>
         <w:drawing>
           <wp:inline distT="0" distB="0" distL="0" distR="0" wp14:anchorId="054490D9" wp14:editId="107154BE">
@@ -8323,6 +8328,513 @@
         </w:drawing>
       </w:r>
     </w:p>
+    <w:p>
+      <w:pPr>
+        <w:pStyle w:val="font-claude-response-body"/>
+        <w:spacing w:line="360" w:lineRule="auto"/>
+        <w:ind w:left="567"/>
+        <w:jc w:val="center"/>
+        <w:rPr>
+          <w:b/>
+          <w:bCs/>
+        </w:rPr>
+      </w:pPr>
+      <w:r>
+        <w:rPr>
+          <w:b/>
+          <w:bCs/>
+        </w:rPr>
+        <w:t>Dashboard 1</w:t>
+      </w:r>
+    </w:p>
+    <w:p>
+      <w:pPr>
+        <w:pStyle w:val="font-claude-response-body"/>
+        <w:spacing w:line="360" w:lineRule="auto"/>
+        <w:ind w:left="567"/>
+        <w:rPr>
+          <w:b/>
+          <w:bCs/>
+          <w:noProof/>
+          <w:lang w:val="en-US"/>
+        </w:rPr>
+      </w:pPr>
+      <w:r>
+        <w:rPr>
+          <w:b/>
+          <w:bCs/>
+          <w:noProof/>
+          <w:lang w:val="en-US"/>
+        </w:rPr>
+        <w:t>1. Mục đích và Đối tượng</w:t>
+      </w:r>
+      <w:r>
+        <w:rPr>
+          <w:b/>
+          <w:bCs/>
+          <w:noProof/>
+          <w:lang w:val="en-US"/>
+        </w:rPr>
+        <w:t>:</w:t>
+      </w:r>
+    </w:p>
+    <w:p>
+      <w:pPr>
+        <w:pStyle w:val="font-claude-response-body"/>
+        <w:numPr>
+          <w:ilvl w:val="0"/>
+          <w:numId w:val="15"/>
+        </w:numPr>
+        <w:spacing w:line="360" w:lineRule="auto"/>
+        <w:rPr>
+          <w:b/>
+          <w:bCs/>
+          <w:noProof/>
+          <w:lang w:val="en-US"/>
+        </w:rPr>
+      </w:pPr>
+      <w:r>
+        <w:rPr>
+          <w:noProof/>
+          <w:lang w:val="en-US"/>
+        </w:rPr>
+        <w:t>Mục đích: Cung cấp cái nhìn toàn cảnh về sức khỏe tài chính và hiệu quả vận hành của Global Superstore, giúp nhận diện động lực tăng trưởng doanh thu, biến động lợi nhuận và các khu vực/phân khúc gặp rủi ro kinh doanh.</w:t>
+      </w:r>
+    </w:p>
+    <w:p>
+      <w:pPr>
+        <w:pStyle w:val="font-claude-response-body"/>
+        <w:numPr>
+          <w:ilvl w:val="0"/>
+          <w:numId w:val="15"/>
+        </w:numPr>
+        <w:spacing w:line="360" w:lineRule="auto"/>
+        <w:rPr>
+          <w:noProof/>
+          <w:lang w:val="en-US"/>
+        </w:rPr>
+      </w:pPr>
+      <w:r>
+        <w:rPr>
+          <w:noProof/>
+          <w:lang w:val="en-US"/>
+        </w:rPr>
+        <w:t>Đối tượng: Ban Lãnh đạo (Executive/C-Suite), Giám đốc Tài chính (CFO), Giám đốc Kinh doanh (CSO) và Bộ phận Hoạch định Chiến lược.</w:t>
+      </w:r>
+    </w:p>
+    <w:p>
+      <w:pPr>
+        <w:pStyle w:val="font-claude-response-body"/>
+        <w:spacing w:line="360" w:lineRule="auto"/>
+        <w:ind w:left="567"/>
+        <w:rPr>
+          <w:b/>
+          <w:bCs/>
+          <w:noProof/>
+          <w:lang w:val="en-US"/>
+        </w:rPr>
+      </w:pPr>
+      <w:r>
+        <w:rPr>
+          <w:b/>
+          <w:bCs/>
+          <w:noProof/>
+          <w:lang w:val="en-US"/>
+        </w:rPr>
+        <w:t>2. Phân tích Dữ liệu Chi tiết</w:t>
+      </w:r>
+    </w:p>
+    <w:p>
+      <w:pPr>
+        <w:pStyle w:val="font-claude-response-body"/>
+        <w:spacing w:line="360" w:lineRule="auto"/>
+        <w:ind w:left="567"/>
+        <w:rPr>
+          <w:noProof/>
+          <w:lang w:val="en-US"/>
+        </w:rPr>
+      </w:pPr>
+      <w:r>
+        <w:rPr>
+          <w:noProof/>
+          <w:lang w:val="en-US"/>
+        </w:rPr>
+        <w:lastRenderedPageBreak/>
+        <w:t>A. Tổng quan Bức tranh Tài chính (KPI Cards)</w:t>
+      </w:r>
+    </w:p>
+    <w:p>
+      <w:pPr>
+        <w:pStyle w:val="font-claude-response-body"/>
+        <w:numPr>
+          <w:ilvl w:val="0"/>
+          <w:numId w:val="15"/>
+        </w:numPr>
+        <w:spacing w:line="360" w:lineRule="auto"/>
+        <w:rPr>
+          <w:noProof/>
+          <w:lang w:val="en-US"/>
+        </w:rPr>
+      </w:pPr>
+      <w:r>
+        <w:rPr>
+          <w:noProof/>
+          <w:lang w:val="en-US"/>
+        </w:rPr>
+        <w:t>Tổng Doanh thu (Sales): Đạt $13M, phản ánh quy mô thị trường lớn.</w:t>
+      </w:r>
+    </w:p>
+    <w:p>
+      <w:pPr>
+        <w:pStyle w:val="font-claude-response-body"/>
+        <w:numPr>
+          <w:ilvl w:val="0"/>
+          <w:numId w:val="15"/>
+        </w:numPr>
+        <w:spacing w:line="360" w:lineRule="auto"/>
+        <w:rPr>
+          <w:noProof/>
+          <w:lang w:val="en-US"/>
+        </w:rPr>
+      </w:pPr>
+      <w:r>
+        <w:rPr>
+          <w:noProof/>
+          <w:lang w:val="en-US"/>
+        </w:rPr>
+        <w:t>Tổng Lợi nhuận (Profit): Đạt $1.5M, biên lợi nhuận trung bình (Overall Profit Margin) duy trì ở mức 11.6%.</w:t>
+      </w:r>
+    </w:p>
+    <w:p>
+      <w:pPr>
+        <w:pStyle w:val="font-claude-response-body"/>
+        <w:numPr>
+          <w:ilvl w:val="0"/>
+          <w:numId w:val="15"/>
+        </w:numPr>
+        <w:spacing w:line="360" w:lineRule="auto"/>
+        <w:rPr>
+          <w:noProof/>
+          <w:lang w:val="en-US"/>
+        </w:rPr>
+      </w:pPr>
+      <w:r>
+        <w:rPr>
+          <w:noProof/>
+          <w:lang w:val="en-US"/>
+        </w:rPr>
+        <w:t>Tỷ lệ đơn hàng chịu lỗ (Loss-making order rate): Chiếm tới 24.5% (gần 1/4 tổng số đơn hàng bán ra bị lỗ).</w:t>
+      </w:r>
+    </w:p>
+    <w:p>
+      <w:pPr>
+        <w:pStyle w:val="font-claude-response-body"/>
+        <w:spacing w:line="360" w:lineRule="auto"/>
+        <w:ind w:left="567"/>
+        <w:rPr>
+          <w:noProof/>
+          <w:lang w:val="en-US"/>
+        </w:rPr>
+      </w:pPr>
+      <w:r>
+        <w:rPr>
+          <w:noProof/>
+          <w:lang w:val="en-US"/>
+        </w:rPr>
+        <w:t>B. Xu hướng Tăng trưởng &amp; Mùa vụ (Sales &amp; Profit Trend &amp; Quarterly Revenue)</w:t>
+      </w:r>
+    </w:p>
+    <w:p>
+      <w:pPr>
+        <w:pStyle w:val="font-claude-response-body"/>
+        <w:numPr>
+          <w:ilvl w:val="0"/>
+          <w:numId w:val="15"/>
+        </w:numPr>
+        <w:spacing w:line="360" w:lineRule="auto"/>
+        <w:rPr>
+          <w:noProof/>
+          <w:lang w:val="en-US"/>
+        </w:rPr>
+      </w:pPr>
+      <w:r>
+        <w:rPr>
+          <w:noProof/>
+          <w:lang w:val="en-US"/>
+        </w:rPr>
+        <w:t>Xu hướng theo năm (2011–2017): Doanh thu và lợi nhuận tăng trưởng liên tục từ 2011 đến mốc đỉnh điểm vào năm 2016 ($4.1M sales / $516K profit), tuy nhiên có dấu hiệu sụt giảm mạnh vào năm 2017.</w:t>
+      </w:r>
+    </w:p>
+    <w:p>
+      <w:pPr>
+        <w:pStyle w:val="font-claude-response-body"/>
+        <w:numPr>
+          <w:ilvl w:val="0"/>
+          <w:numId w:val="15"/>
+        </w:numPr>
+        <w:spacing w:line="360" w:lineRule="auto"/>
+        <w:rPr>
+          <w:noProof/>
+          <w:lang w:val="en-US"/>
+        </w:rPr>
+      </w:pPr>
+      <w:r>
+        <w:rPr>
+          <w:noProof/>
+          <w:lang w:val="en-US"/>
+        </w:rPr>
+        <w:t>Tính mùa vụ theo quý (Quarterly Revenue): Doanh thu có tính chu kỳ rõ rệt. Q1 luôn có doanh thu thấp nhất năm, sau đó tăng dần qua Q2, Q3 và đạt đỉnh cao nhất vào Q4 hàng năm (đặc biệt là giai đoạn 2013–2014).</w:t>
+      </w:r>
+    </w:p>
+    <w:p>
+      <w:pPr>
+        <w:pStyle w:val="font-claude-response-body"/>
+        <w:spacing w:line="360" w:lineRule="auto"/>
+        <w:ind w:left="567"/>
+        <w:rPr>
+          <w:noProof/>
+          <w:lang w:val="en-US"/>
+        </w:rPr>
+      </w:pPr>
+      <w:r>
+        <w:rPr>
+          <w:noProof/>
+          <w:lang w:val="en-US"/>
+        </w:rPr>
+        <w:t>C. Rủi ro theo Thị trường (Loss-making order rate by Market)</w:t>
+      </w:r>
+    </w:p>
+    <w:p>
+      <w:pPr>
+        <w:pStyle w:val="font-claude-response-body"/>
+        <w:numPr>
+          <w:ilvl w:val="0"/>
+          <w:numId w:val="15"/>
+        </w:numPr>
+        <w:spacing w:line="360" w:lineRule="auto"/>
+        <w:rPr>
+          <w:noProof/>
+          <w:lang w:val="en-US"/>
+        </w:rPr>
+      </w:pPr>
+      <w:r>
+        <w:rPr>
+          <w:noProof/>
+          <w:lang w:val="en-US"/>
+        </w:rPr>
+        <w:t>Tỷ lệ đơn hàng lỗ phân hóa rất lớn giữa các thị trường:</w:t>
+      </w:r>
+    </w:p>
+    <w:p>
+      <w:pPr>
+        <w:pStyle w:val="font-claude-response-body"/>
+        <w:numPr>
+          <w:ilvl w:val="0"/>
+          <w:numId w:val="15"/>
+        </w:numPr>
+        <w:spacing w:line="360" w:lineRule="auto"/>
+        <w:rPr>
+          <w:noProof/>
+          <w:lang w:val="en-US"/>
+        </w:rPr>
+      </w:pPr>
+      <w:r>
+        <w:rPr>
+          <w:noProof/>
+          <w:lang w:val="en-US"/>
+        </w:rPr>
+        <w:t>Thị trường rủi ro cao nhất: EMEA (32%), APAC (29%) và LATAM (26%).</w:t>
+      </w:r>
+    </w:p>
+    <w:p>
+      <w:pPr>
+        <w:pStyle w:val="font-claude-response-body"/>
+        <w:numPr>
+          <w:ilvl w:val="0"/>
+          <w:numId w:val="15"/>
+        </w:numPr>
+        <w:spacing w:line="360" w:lineRule="auto"/>
+        <w:rPr>
+          <w:noProof/>
+          <w:lang w:val="en-US"/>
+        </w:rPr>
+      </w:pPr>
+      <w:r>
+        <w:rPr>
+          <w:noProof/>
+          <w:lang w:val="en-US"/>
+        </w:rPr>
+        <w:t>Thị trường rủi ro thấp/an toàn: US (19%) và Canada (0% - hoàn toàn không có đơn hàng lỗ).</w:t>
+      </w:r>
+    </w:p>
+    <w:p>
+      <w:pPr>
+        <w:pStyle w:val="font-claude-response-body"/>
+        <w:spacing w:line="360" w:lineRule="auto"/>
+        <w:ind w:left="567"/>
+        <w:rPr>
+          <w:noProof/>
+          <w:lang w:val="en-US"/>
+        </w:rPr>
+      </w:pPr>
+      <w:r>
+        <w:rPr>
+          <w:noProof/>
+          <w:lang w:val="en-US"/>
+        </w:rPr>
+        <w:t>D. Cơ cấu Phân khúc Khách hàng (Sales Contribution by Customer Segment)</w:t>
+      </w:r>
+    </w:p>
+    <w:p>
+      <w:pPr>
+        <w:pStyle w:val="font-claude-response-body"/>
+        <w:numPr>
+          <w:ilvl w:val="0"/>
+          <w:numId w:val="15"/>
+        </w:numPr>
+        <w:spacing w:line="360" w:lineRule="auto"/>
+        <w:rPr>
+          <w:noProof/>
+          <w:lang w:val="en-US"/>
+        </w:rPr>
+      </w:pPr>
+      <w:r>
+        <w:rPr>
+          <w:noProof/>
+          <w:lang w:val="en-US"/>
+        </w:rPr>
+        <w:t>Consumer (Khách hàng cá nhân): Là phân khúc chủ lực, đóng góp 51.44% tổng doanh thu.</w:t>
+      </w:r>
+    </w:p>
+    <w:p>
+      <w:pPr>
+        <w:pStyle w:val="font-claude-response-body"/>
+        <w:numPr>
+          <w:ilvl w:val="0"/>
+          <w:numId w:val="15"/>
+        </w:numPr>
+        <w:spacing w:line="360" w:lineRule="auto"/>
+        <w:rPr>
+          <w:noProof/>
+          <w:lang w:val="en-US"/>
+        </w:rPr>
+      </w:pPr>
+      <w:r>
+        <w:rPr>
+          <w:noProof/>
+          <w:lang w:val="en-US"/>
+        </w:rPr>
+        <w:t>Corporate (Doanh nghiệp): Chiếm vị trí thứ hai với 30.28% doanh thu.</w:t>
+      </w:r>
+    </w:p>
+    <w:p>
+      <w:pPr>
+        <w:pStyle w:val="font-claude-response-body"/>
+        <w:numPr>
+          <w:ilvl w:val="0"/>
+          <w:numId w:val="15"/>
+        </w:numPr>
+        <w:spacing w:line="360" w:lineRule="auto"/>
+        <w:rPr>
+          <w:noProof/>
+          <w:lang w:val="en-US"/>
+        </w:rPr>
+      </w:pPr>
+      <w:r>
+        <w:rPr>
+          <w:noProof/>
+          <w:lang w:val="en-US"/>
+        </w:rPr>
+        <w:t>Home Office (Văn phòng nhỏ/Tại nhà): Đóng góp thấp nhất với 18.28% doanh thu.</w:t>
+      </w:r>
+    </w:p>
+    <w:p>
+      <w:pPr>
+        <w:pStyle w:val="font-claude-response-body"/>
+        <w:spacing w:line="360" w:lineRule="auto"/>
+        <w:ind w:left="567"/>
+        <w:rPr>
+          <w:b/>
+          <w:bCs/>
+          <w:noProof/>
+          <w:lang w:val="en-US"/>
+        </w:rPr>
+      </w:pPr>
+      <w:r>
+        <w:rPr>
+          <w:b/>
+          <w:bCs/>
+          <w:noProof/>
+          <w:lang w:val="en-US"/>
+        </w:rPr>
+        <w:t>3. Business Insights chính từ Dashboard 1</w:t>
+      </w:r>
+    </w:p>
+    <w:p>
+      <w:pPr>
+        <w:pStyle w:val="font-claude-response-body"/>
+        <w:spacing w:line="360" w:lineRule="auto"/>
+        <w:ind w:left="567"/>
+        <w:rPr>
+          <w:noProof/>
+          <w:lang w:val="en-US"/>
+        </w:rPr>
+      </w:pPr>
+      <w:r>
+        <w:rPr>
+          <w:noProof/>
+          <w:lang w:val="en-US"/>
+        </w:rPr>
+        <w:lastRenderedPageBreak/>
+        <w:t>Hiệu quả kinh doanh bị xói mòn bởi đơn hàng lỗ: Mặc dù doanh thu chạm mốc $13M nhưng biên lợi nhuận chỉ đạt 11.6%. Lý do chính là có đến 24.5% đơn hàng đang bán lỗ, trong đó khu vực EMEA và APAC là 2 "điểm nóng" cần rà soát lại chính sách chiết khấu (discount) và chi phí vận chuyển (shipping cost).</w:t>
+      </w:r>
+    </w:p>
+    <w:p>
+      <w:pPr>
+        <w:pStyle w:val="font-claude-response-body"/>
+        <w:spacing w:line="360" w:lineRule="auto"/>
+        <w:ind w:left="567"/>
+        <w:rPr>
+          <w:noProof/>
+          <w:lang w:val="en-US"/>
+        </w:rPr>
+      </w:pPr>
+      <w:r>
+        <w:rPr>
+          <w:noProof/>
+          <w:lang w:val="en-US"/>
+        </w:rPr>
+        <w:t>Nguồn thu phụ thuộc lớn vào phân khúc Consumer và chu kỳ Q4: Doanh thu phụ thuộc hơn 50% vào nhóm khách hàng cá nhân và chịu áp lực mùa vụ rất lớn vào Quý 4. Doanh nghiệp gặp rủi ro hụt dòng tiền vào Quý 1 nếu không có chiến lược kích cầu hợp lý.</w:t>
+      </w:r>
+    </w:p>
+    <w:p>
+      <w:pPr>
+        <w:pStyle w:val="font-claude-response-body"/>
+        <w:spacing w:line="360" w:lineRule="auto"/>
+        <w:ind w:left="567"/>
+        <w:rPr>
+          <w:noProof/>
+          <w:lang w:val="en-US"/>
+        </w:rPr>
+      </w:pPr>
+      <w:r>
+        <w:rPr>
+          <w:noProof/>
+          <w:lang w:val="en-US"/>
+        </w:rPr>
+        <w:t>Cảnh báo dấu hiệu suy giảm tăng trưởng năm 2017: Doanh thu và lợi nhuận sau giai đoạn đỉnh cao 2016 đang có xu hướng lao dốc vào năm 2017, đòi hỏi Ban Quản trị phải tái cấu trúc danh mục sản phẩm và tối ưu lại chi phí vận hành ngay lập tức.</w:t>
+      </w:r>
+    </w:p>
+    <w:p>
+      <w:pPr>
+        <w:pStyle w:val="font-claude-response-body"/>
+        <w:spacing w:line="360" w:lineRule="auto"/>
+        <w:rPr>
+          <w:b/>
+          <w:bCs/>
+        </w:rPr>
+      </w:pPr>
+    </w:p>
     <w:p/>
     <w:p/>
     <w:p>
@@ -8639,6 +9151,155 @@
     </w:lvl>
   </w:abstractNum>
   <w:abstractNum w:abstractNumId="2" w15:restartNumberingAfterBreak="0">
+    <w:nsid w:val="0DF34811"/>
+    <w:multiLevelType w:val="multilevel"/>
+    <w:tmpl w:val="BE2E71A2"/>
+    <w:lvl w:ilvl="0">
+      <w:start w:val="1"/>
+      <w:numFmt w:val="bullet"/>
+      <w:lvlText w:val=""/>
+      <w:lvlJc w:val="left"/>
+      <w:pPr>
+        <w:tabs>
+          <w:tab w:val="num" w:pos="720"/>
+        </w:tabs>
+        <w:ind w:left="720" w:hanging="360"/>
+      </w:pPr>
+      <w:rPr>
+        <w:rFonts w:ascii="Symbol" w:hAnsi="Symbol" w:hint="default"/>
+        <w:sz w:val="20"/>
+      </w:rPr>
+    </w:lvl>
+    <w:lvl w:ilvl="1" w:tentative="1">
+      <w:start w:val="1"/>
+      <w:numFmt w:val="bullet"/>
+      <w:lvlText w:val="o"/>
+      <w:lvlJc w:val="left"/>
+      <w:pPr>
+        <w:tabs>
+          <w:tab w:val="num" w:pos="1440"/>
+        </w:tabs>
+        <w:ind w:left="1440" w:hanging="360"/>
+      </w:pPr>
+      <w:rPr>
+        <w:rFonts w:ascii="Courier New" w:hAnsi="Courier New" w:hint="default"/>
+        <w:sz w:val="20"/>
+      </w:rPr>
+    </w:lvl>
+    <w:lvl w:ilvl="2" w:tentative="1">
+      <w:start w:val="1"/>
+      <w:numFmt w:val="bullet"/>
+      <w:lvlText w:val=""/>
+      <w:lvlJc w:val="left"/>
+      <w:pPr>
+        <w:tabs>
+          <w:tab w:val="num" w:pos="2160"/>
+        </w:tabs>
+        <w:ind w:left="2160" w:hanging="360"/>
+      </w:pPr>
+      <w:rPr>
+        <w:rFonts w:ascii="Wingdings" w:hAnsi="Wingdings" w:hint="default"/>
+        <w:sz w:val="20"/>
+      </w:rPr>
+    </w:lvl>
+    <w:lvl w:ilvl="3" w:tentative="1">
+      <w:start w:val="1"/>
+      <w:numFmt w:val="bullet"/>
+      <w:lvlText w:val=""/>
+      <w:lvlJc w:val="left"/>
+      <w:pPr>
+        <w:tabs>
+          <w:tab w:val="num" w:pos="2880"/>
+        </w:tabs>
+        <w:ind w:left="2880" w:hanging="360"/>
+      </w:pPr>
+      <w:rPr>
+        <w:rFonts w:ascii="Wingdings" w:hAnsi="Wingdings" w:hint="default"/>
+        <w:sz w:val="20"/>
+      </w:rPr>
+    </w:lvl>
+    <w:lvl w:ilvl="4" w:tentative="1">
+      <w:start w:val="1"/>
+      <w:numFmt w:val="bullet"/>
+      <w:lvlText w:val=""/>
+      <w:lvlJc w:val="left"/>
+      <w:pPr>
+        <w:tabs>
+          <w:tab w:val="num" w:pos="3600"/>
+        </w:tabs>
+        <w:ind w:left="3600" w:hanging="360"/>
+      </w:pPr>
+      <w:rPr>
+        <w:rFonts w:ascii="Wingdings" w:hAnsi="Wingdings" w:hint="default"/>
+        <w:sz w:val="20"/>
+      </w:rPr>
+    </w:lvl>
+    <w:lvl w:ilvl="5" w:tentative="1">
+      <w:start w:val="1"/>
+      <w:numFmt w:val="bullet"/>
+      <w:lvlText w:val=""/>
+      <w:lvlJc w:val="left"/>
+      <w:pPr>
+        <w:tabs>
+          <w:tab w:val="num" w:pos="4320"/>
+        </w:tabs>
+        <w:ind w:left="4320" w:hanging="360"/>
+      </w:pPr>
+      <w:rPr>
+        <w:rFonts w:ascii="Wingdings" w:hAnsi="Wingdings" w:hint="default"/>
+        <w:sz w:val="20"/>
+      </w:rPr>
+    </w:lvl>
+    <w:lvl w:ilvl="6" w:tentative="1">
+      <w:start w:val="1"/>
+      <w:numFmt w:val="bullet"/>
+      <w:lvlText w:val=""/>
+      <w:lvlJc w:val="left"/>
+      <w:pPr>
+        <w:tabs>
+          <w:tab w:val="num" w:pos="5040"/>
+        </w:tabs>
+        <w:ind w:left="5040" w:hanging="360"/>
+      </w:pPr>
+      <w:rPr>
+        <w:rFonts w:ascii="Wingdings" w:hAnsi="Wingdings" w:hint="default"/>
+        <w:sz w:val="20"/>
+      </w:rPr>
+    </w:lvl>
+    <w:lvl w:ilvl="7" w:tentative="1">
+      <w:start w:val="1"/>
+      <w:numFmt w:val="bullet"/>
+      <w:lvlText w:val=""/>
+      <w:lvlJc w:val="left"/>
+      <w:pPr>
+        <w:tabs>
+          <w:tab w:val="num" w:pos="5760"/>
+        </w:tabs>
+        <w:ind w:left="5760" w:hanging="360"/>
+      </w:pPr>
+      <w:rPr>
+        <w:rFonts w:ascii="Wingdings" w:hAnsi="Wingdings" w:hint="default"/>
+        <w:sz w:val="20"/>
+      </w:rPr>
+    </w:lvl>
+    <w:lvl w:ilvl="8" w:tentative="1">
+      <w:start w:val="1"/>
+      <w:numFmt w:val="bullet"/>
+      <w:lvlText w:val=""/>
+      <w:lvlJc w:val="left"/>
+      <w:pPr>
+        <w:tabs>
+          <w:tab w:val="num" w:pos="6480"/>
+        </w:tabs>
+        <w:ind w:left="6480" w:hanging="360"/>
+      </w:pPr>
+      <w:rPr>
+        <w:rFonts w:ascii="Wingdings" w:hAnsi="Wingdings" w:hint="default"/>
+        <w:sz w:val="20"/>
+      </w:rPr>
+    </w:lvl>
+  </w:abstractNum>
+  <w:abstractNum w:abstractNumId="3" w15:restartNumberingAfterBreak="0">
     <w:nsid w:val="1002417F"/>
     <w:multiLevelType w:val="multilevel"/>
     <w:tmpl w:val="B5ECD206"/>
@@ -8751,7 +9412,7 @@
       </w:rPr>
     </w:lvl>
   </w:abstractNum>
-  <w:abstractNum w:abstractNumId="3" w15:restartNumberingAfterBreak="0">
+  <w:abstractNum w:abstractNumId="4" w15:restartNumberingAfterBreak="0">
     <w:nsid w:val="1275559F"/>
     <w:multiLevelType w:val="hybridMultilevel"/>
     <w:tmpl w:val="11DC6EE6"/>
@@ -8866,7 +9527,307 @@
       </w:rPr>
     </w:lvl>
   </w:abstractNum>
-  <w:abstractNum w:abstractNumId="4" w15:restartNumberingAfterBreak="0">
+  <w:abstractNum w:abstractNumId="5" w15:restartNumberingAfterBreak="0">
+    <w:nsid w:val="15842612"/>
+    <w:multiLevelType w:val="multilevel"/>
+    <w:tmpl w:val="746A7C4A"/>
+    <w:lvl w:ilvl="0">
+      <w:start w:val="1"/>
+      <w:numFmt w:val="bullet"/>
+      <w:lvlText w:val=""/>
+      <w:lvlJc w:val="left"/>
+      <w:pPr>
+        <w:tabs>
+          <w:tab w:val="num" w:pos="720"/>
+        </w:tabs>
+        <w:ind w:left="720" w:hanging="360"/>
+      </w:pPr>
+      <w:rPr>
+        <w:rFonts w:ascii="Symbol" w:hAnsi="Symbol" w:hint="default"/>
+        <w:sz w:val="20"/>
+      </w:rPr>
+    </w:lvl>
+    <w:lvl w:ilvl="1">
+      <w:start w:val="1"/>
+      <w:numFmt w:val="bullet"/>
+      <w:lvlText w:val="o"/>
+      <w:lvlJc w:val="left"/>
+      <w:pPr>
+        <w:tabs>
+          <w:tab w:val="num" w:pos="1440"/>
+        </w:tabs>
+        <w:ind w:left="1440" w:hanging="360"/>
+      </w:pPr>
+      <w:rPr>
+        <w:rFonts w:ascii="Courier New" w:hAnsi="Courier New" w:hint="default"/>
+        <w:sz w:val="20"/>
+      </w:rPr>
+    </w:lvl>
+    <w:lvl w:ilvl="2" w:tentative="1">
+      <w:start w:val="1"/>
+      <w:numFmt w:val="bullet"/>
+      <w:lvlText w:val=""/>
+      <w:lvlJc w:val="left"/>
+      <w:pPr>
+        <w:tabs>
+          <w:tab w:val="num" w:pos="2160"/>
+        </w:tabs>
+        <w:ind w:left="2160" w:hanging="360"/>
+      </w:pPr>
+      <w:rPr>
+        <w:rFonts w:ascii="Wingdings" w:hAnsi="Wingdings" w:hint="default"/>
+        <w:sz w:val="20"/>
+      </w:rPr>
+    </w:lvl>
+    <w:lvl w:ilvl="3" w:tentative="1">
+      <w:start w:val="1"/>
+      <w:numFmt w:val="bullet"/>
+      <w:lvlText w:val=""/>
+      <w:lvlJc w:val="left"/>
+      <w:pPr>
+        <w:tabs>
+          <w:tab w:val="num" w:pos="2880"/>
+        </w:tabs>
+        <w:ind w:left="2880" w:hanging="360"/>
+      </w:pPr>
+      <w:rPr>
+        <w:rFonts w:ascii="Wingdings" w:hAnsi="Wingdings" w:hint="default"/>
+        <w:sz w:val="20"/>
+      </w:rPr>
+    </w:lvl>
+    <w:lvl w:ilvl="4" w:tentative="1">
+      <w:start w:val="1"/>
+      <w:numFmt w:val="bullet"/>
+      <w:lvlText w:val=""/>
+      <w:lvlJc w:val="left"/>
+      <w:pPr>
+        <w:tabs>
+          <w:tab w:val="num" w:pos="3600"/>
+        </w:tabs>
+        <w:ind w:left="3600" w:hanging="360"/>
+      </w:pPr>
+      <w:rPr>
+        <w:rFonts w:ascii="Wingdings" w:hAnsi="Wingdings" w:hint="default"/>
+        <w:sz w:val="20"/>
+      </w:rPr>
+    </w:lvl>
+    <w:lvl w:ilvl="5" w:tentative="1">
+      <w:start w:val="1"/>
+      <w:numFmt w:val="bullet"/>
+      <w:lvlText w:val=""/>
+      <w:lvlJc w:val="left"/>
+      <w:pPr>
+        <w:tabs>
+          <w:tab w:val="num" w:pos="4320"/>
+        </w:tabs>
+        <w:ind w:left="4320" w:hanging="360"/>
+      </w:pPr>
+      <w:rPr>
+        <w:rFonts w:ascii="Wingdings" w:hAnsi="Wingdings" w:hint="default"/>
+        <w:sz w:val="20"/>
+      </w:rPr>
+    </w:lvl>
+    <w:lvl w:ilvl="6" w:tentative="1">
+      <w:start w:val="1"/>
+      <w:numFmt w:val="bullet"/>
+      <w:lvlText w:val=""/>
+      <w:lvlJc w:val="left"/>
+      <w:pPr>
+        <w:tabs>
+          <w:tab w:val="num" w:pos="5040"/>
+        </w:tabs>
+        <w:ind w:left="5040" w:hanging="360"/>
+      </w:pPr>
+      <w:rPr>
+        <w:rFonts w:ascii="Wingdings" w:hAnsi="Wingdings" w:hint="default"/>
+        <w:sz w:val="20"/>
+      </w:rPr>
+    </w:lvl>
+    <w:lvl w:ilvl="7" w:tentative="1">
+      <w:start w:val="1"/>
+      <w:numFmt w:val="bullet"/>
+      <w:lvlText w:val=""/>
+      <w:lvlJc w:val="left"/>
+      <w:pPr>
+        <w:tabs>
+          <w:tab w:val="num" w:pos="5760"/>
+        </w:tabs>
+        <w:ind w:left="5760" w:hanging="360"/>
+      </w:pPr>
+      <w:rPr>
+        <w:rFonts w:ascii="Wingdings" w:hAnsi="Wingdings" w:hint="default"/>
+        <w:sz w:val="20"/>
+      </w:rPr>
+    </w:lvl>
+    <w:lvl w:ilvl="8" w:tentative="1">
+      <w:start w:val="1"/>
+      <w:numFmt w:val="bullet"/>
+      <w:lvlText w:val=""/>
+      <w:lvlJc w:val="left"/>
+      <w:pPr>
+        <w:tabs>
+          <w:tab w:val="num" w:pos="6480"/>
+        </w:tabs>
+        <w:ind w:left="6480" w:hanging="360"/>
+      </w:pPr>
+      <w:rPr>
+        <w:rFonts w:ascii="Wingdings" w:hAnsi="Wingdings" w:hint="default"/>
+        <w:sz w:val="20"/>
+      </w:rPr>
+    </w:lvl>
+  </w:abstractNum>
+  <w:abstractNum w:abstractNumId="6" w15:restartNumberingAfterBreak="0">
+    <w:nsid w:val="19BA3858"/>
+    <w:multiLevelType w:val="multilevel"/>
+    <w:tmpl w:val="98021794"/>
+    <w:lvl w:ilvl="0">
+      <w:start w:val="1"/>
+      <w:numFmt w:val="bullet"/>
+      <w:lvlText w:val="-"/>
+      <w:lvlJc w:val="left"/>
+      <w:pPr>
+        <w:tabs>
+          <w:tab w:val="num" w:pos="1080"/>
+        </w:tabs>
+        <w:ind w:left="1080" w:hanging="360"/>
+      </w:pPr>
+      <w:rPr>
+        <w:rFonts w:ascii="Times New Roman" w:eastAsia="Times New Roman" w:hAnsi="Times New Roman" w:cs="Times New Roman" w:hint="default"/>
+        <w:b/>
+        <w:color w:val="000000"/>
+        <w:sz w:val="20"/>
+      </w:rPr>
+    </w:lvl>
+    <w:lvl w:ilvl="1">
+      <w:start w:val="1"/>
+      <w:numFmt w:val="bullet"/>
+      <w:lvlText w:val="o"/>
+      <w:lvlJc w:val="left"/>
+      <w:pPr>
+        <w:tabs>
+          <w:tab w:val="num" w:pos="1800"/>
+        </w:tabs>
+        <w:ind w:left="1800" w:hanging="360"/>
+      </w:pPr>
+      <w:rPr>
+        <w:rFonts w:ascii="Courier New" w:hAnsi="Courier New" w:hint="default"/>
+        <w:sz w:val="20"/>
+      </w:rPr>
+    </w:lvl>
+    <w:lvl w:ilvl="2" w:tentative="1">
+      <w:start w:val="1"/>
+      <w:numFmt w:val="bullet"/>
+      <w:lvlText w:val=""/>
+      <w:lvlJc w:val="left"/>
+      <w:pPr>
+        <w:tabs>
+          <w:tab w:val="num" w:pos="2520"/>
+        </w:tabs>
+        <w:ind w:left="2520" w:hanging="360"/>
+      </w:pPr>
+      <w:rPr>
+        <w:rFonts w:ascii="Wingdings" w:hAnsi="Wingdings" w:hint="default"/>
+        <w:sz w:val="20"/>
+      </w:rPr>
+    </w:lvl>
+    <w:lvl w:ilvl="3" w:tentative="1">
+      <w:start w:val="1"/>
+      <w:numFmt w:val="bullet"/>
+      <w:lvlText w:val=""/>
+      <w:lvlJc w:val="left"/>
+      <w:pPr>
+        <w:tabs>
+          <w:tab w:val="num" w:pos="3240"/>
+        </w:tabs>
+        <w:ind w:left="3240" w:hanging="360"/>
+      </w:pPr>
+      <w:rPr>
+        <w:rFonts w:ascii="Wingdings" w:hAnsi="Wingdings" w:hint="default"/>
+        <w:sz w:val="20"/>
+      </w:rPr>
+    </w:lvl>
+    <w:lvl w:ilvl="4" w:tentative="1">
+      <w:start w:val="1"/>
+      <w:numFmt w:val="bullet"/>
+      <w:lvlText w:val=""/>
+      <w:lvlJc w:val="left"/>
+      <w:pPr>
+        <w:tabs>
+          <w:tab w:val="num" w:pos="3960"/>
+        </w:tabs>
+        <w:ind w:left="3960" w:hanging="360"/>
+      </w:pPr>
+      <w:rPr>
+        <w:rFonts w:ascii="Wingdings" w:hAnsi="Wingdings" w:hint="default"/>
+        <w:sz w:val="20"/>
+      </w:rPr>
+    </w:lvl>
+    <w:lvl w:ilvl="5" w:tentative="1">
+      <w:start w:val="1"/>
+      <w:numFmt w:val="bullet"/>
+      <w:lvlText w:val=""/>
+      <w:lvlJc w:val="left"/>
+      <w:pPr>
+        <w:tabs>
+          <w:tab w:val="num" w:pos="4680"/>
+        </w:tabs>
+        <w:ind w:left="4680" w:hanging="360"/>
+      </w:pPr>
+      <w:rPr>
+        <w:rFonts w:ascii="Wingdings" w:hAnsi="Wingdings" w:hint="default"/>
+        <w:sz w:val="20"/>
+      </w:rPr>
+    </w:lvl>
+    <w:lvl w:ilvl="6" w:tentative="1">
+      <w:start w:val="1"/>
+      <w:numFmt w:val="bullet"/>
+      <w:lvlText w:val=""/>
+      <w:lvlJc w:val="left"/>
+      <w:pPr>
+        <w:tabs>
+          <w:tab w:val="num" w:pos="5400"/>
+        </w:tabs>
+        <w:ind w:left="5400" w:hanging="360"/>
+      </w:pPr>
+      <w:rPr>
+        <w:rFonts w:ascii="Wingdings" w:hAnsi="Wingdings" w:hint="default"/>
+        <w:sz w:val="20"/>
+      </w:rPr>
+    </w:lvl>
+    <w:lvl w:ilvl="7" w:tentative="1">
+      <w:start w:val="1"/>
+      <w:numFmt w:val="bullet"/>
+      <w:lvlText w:val=""/>
+      <w:lvlJc w:val="left"/>
+      <w:pPr>
+        <w:tabs>
+          <w:tab w:val="num" w:pos="6120"/>
+        </w:tabs>
+        <w:ind w:left="6120" w:hanging="360"/>
+      </w:pPr>
+      <w:rPr>
+        <w:rFonts w:ascii="Wingdings" w:hAnsi="Wingdings" w:hint="default"/>
+        <w:sz w:val="20"/>
+      </w:rPr>
+    </w:lvl>
+    <w:lvl w:ilvl="8" w:tentative="1">
+      <w:start w:val="1"/>
+      <w:numFmt w:val="bullet"/>
+      <w:lvlText w:val=""/>
+      <w:lvlJc w:val="left"/>
+      <w:pPr>
+        <w:tabs>
+          <w:tab w:val="num" w:pos="6840"/>
+        </w:tabs>
+        <w:ind w:left="6840" w:hanging="360"/>
+      </w:pPr>
+      <w:rPr>
+        <w:rFonts w:ascii="Wingdings" w:hAnsi="Wingdings" w:hint="default"/>
+        <w:sz w:val="20"/>
+      </w:rPr>
+    </w:lvl>
+  </w:abstractNum>
+  <w:abstractNum w:abstractNumId="7" w15:restartNumberingAfterBreak="0">
     <w:nsid w:val="1BD26E23"/>
     <w:multiLevelType w:val="multilevel"/>
     <w:tmpl w:val="03B82166"/>
@@ -8979,7 +9940,7 @@
       </w:rPr>
     </w:lvl>
   </w:abstractNum>
-  <w:abstractNum w:abstractNumId="5" w15:restartNumberingAfterBreak="0">
+  <w:abstractNum w:abstractNumId="8" w15:restartNumberingAfterBreak="0">
     <w:nsid w:val="1C923BBD"/>
     <w:multiLevelType w:val="multilevel"/>
     <w:tmpl w:val="98021794"/>
@@ -9130,7 +10091,309 @@
       </w:rPr>
     </w:lvl>
   </w:abstractNum>
-  <w:abstractNum w:abstractNumId="6" w15:restartNumberingAfterBreak="0">
+  <w:abstractNum w:abstractNumId="9" w15:restartNumberingAfterBreak="0">
+    <w:nsid w:val="20214F47"/>
+    <w:multiLevelType w:val="multilevel"/>
+    <w:tmpl w:val="98021794"/>
+    <w:lvl w:ilvl="0">
+      <w:start w:val="1"/>
+      <w:numFmt w:val="bullet"/>
+      <w:lvlText w:val="-"/>
+      <w:lvlJc w:val="left"/>
+      <w:pPr>
+        <w:tabs>
+          <w:tab w:val="num" w:pos="1080"/>
+        </w:tabs>
+        <w:ind w:left="1080" w:hanging="360"/>
+      </w:pPr>
+      <w:rPr>
+        <w:rFonts w:ascii="Times New Roman" w:eastAsia="Times New Roman" w:hAnsi="Times New Roman" w:cs="Times New Roman" w:hint="default"/>
+        <w:b/>
+        <w:color w:val="000000"/>
+        <w:sz w:val="20"/>
+      </w:rPr>
+    </w:lvl>
+    <w:lvl w:ilvl="1">
+      <w:start w:val="1"/>
+      <w:numFmt w:val="bullet"/>
+      <w:lvlText w:val="o"/>
+      <w:lvlJc w:val="left"/>
+      <w:pPr>
+        <w:tabs>
+          <w:tab w:val="num" w:pos="1800"/>
+        </w:tabs>
+        <w:ind w:left="1800" w:hanging="360"/>
+      </w:pPr>
+      <w:rPr>
+        <w:rFonts w:ascii="Courier New" w:hAnsi="Courier New" w:hint="default"/>
+        <w:sz w:val="20"/>
+      </w:rPr>
+    </w:lvl>
+    <w:lvl w:ilvl="2" w:tentative="1">
+      <w:start w:val="1"/>
+      <w:numFmt w:val="bullet"/>
+      <w:lvlText w:val=""/>
+      <w:lvlJc w:val="left"/>
+      <w:pPr>
+        <w:tabs>
+          <w:tab w:val="num" w:pos="2520"/>
+        </w:tabs>
+        <w:ind w:left="2520" w:hanging="360"/>
+      </w:pPr>
+      <w:rPr>
+        <w:rFonts w:ascii="Wingdings" w:hAnsi="Wingdings" w:hint="default"/>
+        <w:sz w:val="20"/>
+      </w:rPr>
+    </w:lvl>
+    <w:lvl w:ilvl="3" w:tentative="1">
+      <w:start w:val="1"/>
+      <w:numFmt w:val="bullet"/>
+      <w:lvlText w:val=""/>
+      <w:lvlJc w:val="left"/>
+      <w:pPr>
+        <w:tabs>
+          <w:tab w:val="num" w:pos="3240"/>
+        </w:tabs>
+        <w:ind w:left="3240" w:hanging="360"/>
+      </w:pPr>
+      <w:rPr>
+        <w:rFonts w:ascii="Wingdings" w:hAnsi="Wingdings" w:hint="default"/>
+        <w:sz w:val="20"/>
+      </w:rPr>
+    </w:lvl>
+    <w:lvl w:ilvl="4" w:tentative="1">
+      <w:start w:val="1"/>
+      <w:numFmt w:val="bullet"/>
+      <w:lvlText w:val=""/>
+      <w:lvlJc w:val="left"/>
+      <w:pPr>
+        <w:tabs>
+          <w:tab w:val="num" w:pos="3960"/>
+        </w:tabs>
+        <w:ind w:left="3960" w:hanging="360"/>
+      </w:pPr>
+      <w:rPr>
+        <w:rFonts w:ascii="Wingdings" w:hAnsi="Wingdings" w:hint="default"/>
+        <w:sz w:val="20"/>
+      </w:rPr>
+    </w:lvl>
+    <w:lvl w:ilvl="5" w:tentative="1">
+      <w:start w:val="1"/>
+      <w:numFmt w:val="bullet"/>
+      <w:lvlText w:val=""/>
+      <w:lvlJc w:val="left"/>
+      <w:pPr>
+        <w:tabs>
+          <w:tab w:val="num" w:pos="4680"/>
+        </w:tabs>
+        <w:ind w:left="4680" w:hanging="360"/>
+      </w:pPr>
+      <w:rPr>
+        <w:rFonts w:ascii="Wingdings" w:hAnsi="Wingdings" w:hint="default"/>
+        <w:sz w:val="20"/>
+      </w:rPr>
+    </w:lvl>
+    <w:lvl w:ilvl="6" w:tentative="1">
+      <w:start w:val="1"/>
+      <w:numFmt w:val="bullet"/>
+      <w:lvlText w:val=""/>
+      <w:lvlJc w:val="left"/>
+      <w:pPr>
+        <w:tabs>
+          <w:tab w:val="num" w:pos="5400"/>
+        </w:tabs>
+        <w:ind w:left="5400" w:hanging="360"/>
+      </w:pPr>
+      <w:rPr>
+        <w:rFonts w:ascii="Wingdings" w:hAnsi="Wingdings" w:hint="default"/>
+        <w:sz w:val="20"/>
+      </w:rPr>
+    </w:lvl>
+    <w:lvl w:ilvl="7" w:tentative="1">
+      <w:start w:val="1"/>
+      <w:numFmt w:val="bullet"/>
+      <w:lvlText w:val=""/>
+      <w:lvlJc w:val="left"/>
+      <w:pPr>
+        <w:tabs>
+          <w:tab w:val="num" w:pos="6120"/>
+        </w:tabs>
+        <w:ind w:left="6120" w:hanging="360"/>
+      </w:pPr>
+      <w:rPr>
+        <w:rFonts w:ascii="Wingdings" w:hAnsi="Wingdings" w:hint="default"/>
+        <w:sz w:val="20"/>
+      </w:rPr>
+    </w:lvl>
+    <w:lvl w:ilvl="8" w:tentative="1">
+      <w:start w:val="1"/>
+      <w:numFmt w:val="bullet"/>
+      <w:lvlText w:val=""/>
+      <w:lvlJc w:val="left"/>
+      <w:pPr>
+        <w:tabs>
+          <w:tab w:val="num" w:pos="6840"/>
+        </w:tabs>
+        <w:ind w:left="6840" w:hanging="360"/>
+      </w:pPr>
+      <w:rPr>
+        <w:rFonts w:ascii="Wingdings" w:hAnsi="Wingdings" w:hint="default"/>
+        <w:sz w:val="20"/>
+      </w:rPr>
+    </w:lvl>
+  </w:abstractNum>
+  <w:abstractNum w:abstractNumId="10" w15:restartNumberingAfterBreak="0">
+    <w:nsid w:val="204F2912"/>
+    <w:multiLevelType w:val="multilevel"/>
+    <w:tmpl w:val="98021794"/>
+    <w:lvl w:ilvl="0">
+      <w:start w:val="1"/>
+      <w:numFmt w:val="bullet"/>
+      <w:lvlText w:val="-"/>
+      <w:lvlJc w:val="left"/>
+      <w:pPr>
+        <w:tabs>
+          <w:tab w:val="num" w:pos="1080"/>
+        </w:tabs>
+        <w:ind w:left="1080" w:hanging="360"/>
+      </w:pPr>
+      <w:rPr>
+        <w:rFonts w:ascii="Times New Roman" w:eastAsia="Times New Roman" w:hAnsi="Times New Roman" w:cs="Times New Roman" w:hint="default"/>
+        <w:b/>
+        <w:color w:val="000000"/>
+        <w:sz w:val="20"/>
+      </w:rPr>
+    </w:lvl>
+    <w:lvl w:ilvl="1">
+      <w:start w:val="1"/>
+      <w:numFmt w:val="bullet"/>
+      <w:lvlText w:val="o"/>
+      <w:lvlJc w:val="left"/>
+      <w:pPr>
+        <w:tabs>
+          <w:tab w:val="num" w:pos="1800"/>
+        </w:tabs>
+        <w:ind w:left="1800" w:hanging="360"/>
+      </w:pPr>
+      <w:rPr>
+        <w:rFonts w:ascii="Courier New" w:hAnsi="Courier New" w:hint="default"/>
+        <w:sz w:val="20"/>
+      </w:rPr>
+    </w:lvl>
+    <w:lvl w:ilvl="2" w:tentative="1">
+      <w:start w:val="1"/>
+      <w:numFmt w:val="bullet"/>
+      <w:lvlText w:val=""/>
+      <w:lvlJc w:val="left"/>
+      <w:pPr>
+        <w:tabs>
+          <w:tab w:val="num" w:pos="2520"/>
+        </w:tabs>
+        <w:ind w:left="2520" w:hanging="360"/>
+      </w:pPr>
+      <w:rPr>
+        <w:rFonts w:ascii="Wingdings" w:hAnsi="Wingdings" w:hint="default"/>
+        <w:sz w:val="20"/>
+      </w:rPr>
+    </w:lvl>
+    <w:lvl w:ilvl="3" w:tentative="1">
+      <w:start w:val="1"/>
+      <w:numFmt w:val="bullet"/>
+      <w:lvlText w:val=""/>
+      <w:lvlJc w:val="left"/>
+      <w:pPr>
+        <w:tabs>
+          <w:tab w:val="num" w:pos="3240"/>
+        </w:tabs>
+        <w:ind w:left="3240" w:hanging="360"/>
+      </w:pPr>
+      <w:rPr>
+        <w:rFonts w:ascii="Wingdings" w:hAnsi="Wingdings" w:hint="default"/>
+        <w:sz w:val="20"/>
+      </w:rPr>
+    </w:lvl>
+    <w:lvl w:ilvl="4" w:tentative="1">
+      <w:start w:val="1"/>
+      <w:numFmt w:val="bullet"/>
+      <w:lvlText w:val=""/>
+      <w:lvlJc w:val="left"/>
+      <w:pPr>
+        <w:tabs>
+          <w:tab w:val="num" w:pos="3960"/>
+        </w:tabs>
+        <w:ind w:left="3960" w:hanging="360"/>
+      </w:pPr>
+      <w:rPr>
+        <w:rFonts w:ascii="Wingdings" w:hAnsi="Wingdings" w:hint="default"/>
+        <w:sz w:val="20"/>
+      </w:rPr>
+    </w:lvl>
+    <w:lvl w:ilvl="5" w:tentative="1">
+      <w:start w:val="1"/>
+      <w:numFmt w:val="bullet"/>
+      <w:lvlText w:val=""/>
+      <w:lvlJc w:val="left"/>
+      <w:pPr>
+        <w:tabs>
+          <w:tab w:val="num" w:pos="4680"/>
+        </w:tabs>
+        <w:ind w:left="4680" w:hanging="360"/>
+      </w:pPr>
+      <w:rPr>
+        <w:rFonts w:ascii="Wingdings" w:hAnsi="Wingdings" w:hint="default"/>
+        <w:sz w:val="20"/>
+      </w:rPr>
+    </w:lvl>
+    <w:lvl w:ilvl="6" w:tentative="1">
+      <w:start w:val="1"/>
+      <w:numFmt w:val="bullet"/>
+      <w:lvlText w:val=""/>
+      <w:lvlJc w:val="left"/>
+      <w:pPr>
+        <w:tabs>
+          <w:tab w:val="num" w:pos="5400"/>
+        </w:tabs>
+        <w:ind w:left="5400" w:hanging="360"/>
+      </w:pPr>
+      <w:rPr>
+        <w:rFonts w:ascii="Wingdings" w:hAnsi="Wingdings" w:hint="default"/>
+        <w:sz w:val="20"/>
+      </w:rPr>
+    </w:lvl>
+    <w:lvl w:ilvl="7" w:tentative="1">
+      <w:start w:val="1"/>
+      <w:numFmt w:val="bullet"/>
+      <w:lvlText w:val=""/>
+      <w:lvlJc w:val="left"/>
+      <w:pPr>
+        <w:tabs>
+          <w:tab w:val="num" w:pos="6120"/>
+        </w:tabs>
+        <w:ind w:left="6120" w:hanging="360"/>
+      </w:pPr>
+      <w:rPr>
+        <w:rFonts w:ascii="Wingdings" w:hAnsi="Wingdings" w:hint="default"/>
+        <w:sz w:val="20"/>
+      </w:rPr>
+    </w:lvl>
+    <w:lvl w:ilvl="8" w:tentative="1">
+      <w:start w:val="1"/>
+      <w:numFmt w:val="bullet"/>
+      <w:lvlText w:val=""/>
+      <w:lvlJc w:val="left"/>
+      <w:pPr>
+        <w:tabs>
+          <w:tab w:val="num" w:pos="6840"/>
+        </w:tabs>
+        <w:ind w:left="6840" w:hanging="360"/>
+      </w:pPr>
+      <w:rPr>
+        <w:rFonts w:ascii="Wingdings" w:hAnsi="Wingdings" w:hint="default"/>
+        <w:sz w:val="20"/>
+      </w:rPr>
+    </w:lvl>
+  </w:abstractNum>
+  <w:abstractNum w:abstractNumId="11" w15:restartNumberingAfterBreak="0">
     <w:nsid w:val="23FC3AF6"/>
     <w:multiLevelType w:val="multilevel"/>
     <w:tmpl w:val="C5C4A9C0"/>
@@ -9279,7 +10542,7 @@
       </w:rPr>
     </w:lvl>
   </w:abstractNum>
-  <w:abstractNum w:abstractNumId="7" w15:restartNumberingAfterBreak="0">
+  <w:abstractNum w:abstractNumId="12" w15:restartNumberingAfterBreak="0">
     <w:nsid w:val="26111F7F"/>
     <w:multiLevelType w:val="multilevel"/>
     <w:tmpl w:val="09C65F84"/>
@@ -9428,7 +10691,156 @@
       </w:rPr>
     </w:lvl>
   </w:abstractNum>
-  <w:abstractNum w:abstractNumId="8" w15:restartNumberingAfterBreak="0">
+  <w:abstractNum w:abstractNumId="13" w15:restartNumberingAfterBreak="0">
+    <w:nsid w:val="275948CB"/>
+    <w:multiLevelType w:val="multilevel"/>
+    <w:tmpl w:val="A63E12BC"/>
+    <w:lvl w:ilvl="0">
+      <w:start w:val="1"/>
+      <w:numFmt w:val="bullet"/>
+      <w:lvlText w:val=""/>
+      <w:lvlJc w:val="left"/>
+      <w:pPr>
+        <w:tabs>
+          <w:tab w:val="num" w:pos="720"/>
+        </w:tabs>
+        <w:ind w:left="720" w:hanging="360"/>
+      </w:pPr>
+      <w:rPr>
+        <w:rFonts w:ascii="Symbol" w:hAnsi="Symbol" w:hint="default"/>
+        <w:sz w:val="20"/>
+      </w:rPr>
+    </w:lvl>
+    <w:lvl w:ilvl="1" w:tentative="1">
+      <w:start w:val="1"/>
+      <w:numFmt w:val="bullet"/>
+      <w:lvlText w:val="o"/>
+      <w:lvlJc w:val="left"/>
+      <w:pPr>
+        <w:tabs>
+          <w:tab w:val="num" w:pos="1440"/>
+        </w:tabs>
+        <w:ind w:left="1440" w:hanging="360"/>
+      </w:pPr>
+      <w:rPr>
+        <w:rFonts w:ascii="Courier New" w:hAnsi="Courier New" w:hint="default"/>
+        <w:sz w:val="20"/>
+      </w:rPr>
+    </w:lvl>
+    <w:lvl w:ilvl="2" w:tentative="1">
+      <w:start w:val="1"/>
+      <w:numFmt w:val="bullet"/>
+      <w:lvlText w:val=""/>
+      <w:lvlJc w:val="left"/>
+      <w:pPr>
+        <w:tabs>
+          <w:tab w:val="num" w:pos="2160"/>
+        </w:tabs>
+        <w:ind w:left="2160" w:hanging="360"/>
+      </w:pPr>
+      <w:rPr>
+        <w:rFonts w:ascii="Wingdings" w:hAnsi="Wingdings" w:hint="default"/>
+        <w:sz w:val="20"/>
+      </w:rPr>
+    </w:lvl>
+    <w:lvl w:ilvl="3" w:tentative="1">
+      <w:start w:val="1"/>
+      <w:numFmt w:val="bullet"/>
+      <w:lvlText w:val=""/>
+      <w:lvlJc w:val="left"/>
+      <w:pPr>
+        <w:tabs>
+          <w:tab w:val="num" w:pos="2880"/>
+        </w:tabs>
+        <w:ind w:left="2880" w:hanging="360"/>
+      </w:pPr>
+      <w:rPr>
+        <w:rFonts w:ascii="Wingdings" w:hAnsi="Wingdings" w:hint="default"/>
+        <w:sz w:val="20"/>
+      </w:rPr>
+    </w:lvl>
+    <w:lvl w:ilvl="4" w:tentative="1">
+      <w:start w:val="1"/>
+      <w:numFmt w:val="bullet"/>
+      <w:lvlText w:val=""/>
+      <w:lvlJc w:val="left"/>
+      <w:pPr>
+        <w:tabs>
+          <w:tab w:val="num" w:pos="3600"/>
+        </w:tabs>
+        <w:ind w:left="3600" w:hanging="360"/>
+      </w:pPr>
+      <w:rPr>
+        <w:rFonts w:ascii="Wingdings" w:hAnsi="Wingdings" w:hint="default"/>
+        <w:sz w:val="20"/>
+      </w:rPr>
+    </w:lvl>
+    <w:lvl w:ilvl="5" w:tentative="1">
+      <w:start w:val="1"/>
+      <w:numFmt w:val="bullet"/>
+      <w:lvlText w:val=""/>
+      <w:lvlJc w:val="left"/>
+      <w:pPr>
+        <w:tabs>
+          <w:tab w:val="num" w:pos="4320"/>
+        </w:tabs>
+        <w:ind w:left="4320" w:hanging="360"/>
+      </w:pPr>
+      <w:rPr>
+        <w:rFonts w:ascii="Wingdings" w:hAnsi="Wingdings" w:hint="default"/>
+        <w:sz w:val="20"/>
+      </w:rPr>
+    </w:lvl>
+    <w:lvl w:ilvl="6" w:tentative="1">
+      <w:start w:val="1"/>
+      <w:numFmt w:val="bullet"/>
+      <w:lvlText w:val=""/>
+      <w:lvlJc w:val="left"/>
+      <w:pPr>
+        <w:tabs>
+          <w:tab w:val="num" w:pos="5040"/>
+        </w:tabs>
+        <w:ind w:left="5040" w:hanging="360"/>
+      </w:pPr>
+      <w:rPr>
+        <w:rFonts w:ascii="Wingdings" w:hAnsi="Wingdings" w:hint="default"/>
+        <w:sz w:val="20"/>
+      </w:rPr>
+    </w:lvl>
+    <w:lvl w:ilvl="7" w:tentative="1">
+      <w:start w:val="1"/>
+      <w:numFmt w:val="bullet"/>
+      <w:lvlText w:val=""/>
+      <w:lvlJc w:val="left"/>
+      <w:pPr>
+        <w:tabs>
+          <w:tab w:val="num" w:pos="5760"/>
+        </w:tabs>
+        <w:ind w:left="5760" w:hanging="360"/>
+      </w:pPr>
+      <w:rPr>
+        <w:rFonts w:ascii="Wingdings" w:hAnsi="Wingdings" w:hint="default"/>
+        <w:sz w:val="20"/>
+      </w:rPr>
+    </w:lvl>
+    <w:lvl w:ilvl="8" w:tentative="1">
+      <w:start w:val="1"/>
+      <w:numFmt w:val="bullet"/>
+      <w:lvlText w:val=""/>
+      <w:lvlJc w:val="left"/>
+      <w:pPr>
+        <w:tabs>
+          <w:tab w:val="num" w:pos="6480"/>
+        </w:tabs>
+        <w:ind w:left="6480" w:hanging="360"/>
+      </w:pPr>
+      <w:rPr>
+        <w:rFonts w:ascii="Wingdings" w:hAnsi="Wingdings" w:hint="default"/>
+        <w:sz w:val="20"/>
+      </w:rPr>
+    </w:lvl>
+  </w:abstractNum>
+  <w:abstractNum w:abstractNumId="14" w15:restartNumberingAfterBreak="0">
     <w:nsid w:val="29863524"/>
     <w:multiLevelType w:val="multilevel"/>
     <w:tmpl w:val="E8EEB618"/>
@@ -9541,7 +10953,7 @@
       </w:rPr>
     </w:lvl>
   </w:abstractNum>
-  <w:abstractNum w:abstractNumId="9" w15:restartNumberingAfterBreak="0">
+  <w:abstractNum w:abstractNumId="15" w15:restartNumberingAfterBreak="0">
     <w:nsid w:val="2D380231"/>
     <w:multiLevelType w:val="hybridMultilevel"/>
     <w:tmpl w:val="2BC223F8"/>
@@ -9630,7 +11042,7 @@
       </w:pPr>
     </w:lvl>
   </w:abstractNum>
-  <w:abstractNum w:abstractNumId="10" w15:restartNumberingAfterBreak="0">
+  <w:abstractNum w:abstractNumId="16" w15:restartNumberingAfterBreak="0">
     <w:nsid w:val="37462DF1"/>
     <w:multiLevelType w:val="hybridMultilevel"/>
     <w:tmpl w:val="ACAA9E4E"/>
@@ -9745,7 +11157,7 @@
       </w:rPr>
     </w:lvl>
   </w:abstractNum>
-  <w:abstractNum w:abstractNumId="11" w15:restartNumberingAfterBreak="0">
+  <w:abstractNum w:abstractNumId="17" w15:restartNumberingAfterBreak="0">
     <w:nsid w:val="37E92F9C"/>
     <w:multiLevelType w:val="multilevel"/>
     <w:tmpl w:val="60B0AB10"/>
@@ -9858,7 +11270,7 @@
       </w:rPr>
     </w:lvl>
   </w:abstractNum>
-  <w:abstractNum w:abstractNumId="12" w15:restartNumberingAfterBreak="0">
+  <w:abstractNum w:abstractNumId="18" w15:restartNumberingAfterBreak="0">
     <w:nsid w:val="38BF2779"/>
     <w:multiLevelType w:val="multilevel"/>
     <w:tmpl w:val="ABFC9622"/>
@@ -10009,7 +11421,158 @@
       </w:rPr>
     </w:lvl>
   </w:abstractNum>
-  <w:abstractNum w:abstractNumId="13" w15:restartNumberingAfterBreak="0">
+  <w:abstractNum w:abstractNumId="19" w15:restartNumberingAfterBreak="0">
+    <w:nsid w:val="3A19010B"/>
+    <w:multiLevelType w:val="multilevel"/>
+    <w:tmpl w:val="98021794"/>
+    <w:lvl w:ilvl="0">
+      <w:start w:val="1"/>
+      <w:numFmt w:val="bullet"/>
+      <w:lvlText w:val="-"/>
+      <w:lvlJc w:val="left"/>
+      <w:pPr>
+        <w:tabs>
+          <w:tab w:val="num" w:pos="1080"/>
+        </w:tabs>
+        <w:ind w:left="1080" w:hanging="360"/>
+      </w:pPr>
+      <w:rPr>
+        <w:rFonts w:ascii="Times New Roman" w:eastAsia="Times New Roman" w:hAnsi="Times New Roman" w:cs="Times New Roman" w:hint="default"/>
+        <w:b/>
+        <w:color w:val="000000"/>
+        <w:sz w:val="20"/>
+      </w:rPr>
+    </w:lvl>
+    <w:lvl w:ilvl="1">
+      <w:start w:val="1"/>
+      <w:numFmt w:val="bullet"/>
+      <w:lvlText w:val="o"/>
+      <w:lvlJc w:val="left"/>
+      <w:pPr>
+        <w:tabs>
+          <w:tab w:val="num" w:pos="1800"/>
+        </w:tabs>
+        <w:ind w:left="1800" w:hanging="360"/>
+      </w:pPr>
+      <w:rPr>
+        <w:rFonts w:ascii="Courier New" w:hAnsi="Courier New" w:hint="default"/>
+        <w:sz w:val="20"/>
+      </w:rPr>
+    </w:lvl>
+    <w:lvl w:ilvl="2" w:tentative="1">
+      <w:start w:val="1"/>
+      <w:numFmt w:val="bullet"/>
+      <w:lvlText w:val=""/>
+      <w:lvlJc w:val="left"/>
+      <w:pPr>
+        <w:tabs>
+          <w:tab w:val="num" w:pos="2520"/>
+        </w:tabs>
+        <w:ind w:left="2520" w:hanging="360"/>
+      </w:pPr>
+      <w:rPr>
+        <w:rFonts w:ascii="Wingdings" w:hAnsi="Wingdings" w:hint="default"/>
+        <w:sz w:val="20"/>
+      </w:rPr>
+    </w:lvl>
+    <w:lvl w:ilvl="3" w:tentative="1">
+      <w:start w:val="1"/>
+      <w:numFmt w:val="bullet"/>
+      <w:lvlText w:val=""/>
+      <w:lvlJc w:val="left"/>
+      <w:pPr>
+        <w:tabs>
+          <w:tab w:val="num" w:pos="3240"/>
+        </w:tabs>
+        <w:ind w:left="3240" w:hanging="360"/>
+      </w:pPr>
+      <w:rPr>
+        <w:rFonts w:ascii="Wingdings" w:hAnsi="Wingdings" w:hint="default"/>
+        <w:sz w:val="20"/>
+      </w:rPr>
+    </w:lvl>
+    <w:lvl w:ilvl="4" w:tentative="1">
+      <w:start w:val="1"/>
+      <w:numFmt w:val="bullet"/>
+      <w:lvlText w:val=""/>
+      <w:lvlJc w:val="left"/>
+      <w:pPr>
+        <w:tabs>
+          <w:tab w:val="num" w:pos="3960"/>
+        </w:tabs>
+        <w:ind w:left="3960" w:hanging="360"/>
+      </w:pPr>
+      <w:rPr>
+        <w:rFonts w:ascii="Wingdings" w:hAnsi="Wingdings" w:hint="default"/>
+        <w:sz w:val="20"/>
+      </w:rPr>
+    </w:lvl>
+    <w:lvl w:ilvl="5" w:tentative="1">
+      <w:start w:val="1"/>
+      <w:numFmt w:val="bullet"/>
+      <w:lvlText w:val=""/>
+      <w:lvlJc w:val="left"/>
+      <w:pPr>
+        <w:tabs>
+          <w:tab w:val="num" w:pos="4680"/>
+        </w:tabs>
+        <w:ind w:left="4680" w:hanging="360"/>
+      </w:pPr>
+      <w:rPr>
+        <w:rFonts w:ascii="Wingdings" w:hAnsi="Wingdings" w:hint="default"/>
+        <w:sz w:val="20"/>
+      </w:rPr>
+    </w:lvl>
+    <w:lvl w:ilvl="6" w:tentative="1">
+      <w:start w:val="1"/>
+      <w:numFmt w:val="bullet"/>
+      <w:lvlText w:val=""/>
+      <w:lvlJc w:val="left"/>
+      <w:pPr>
+        <w:tabs>
+          <w:tab w:val="num" w:pos="5400"/>
+        </w:tabs>
+        <w:ind w:left="5400" w:hanging="360"/>
+      </w:pPr>
+      <w:rPr>
+        <w:rFonts w:ascii="Wingdings" w:hAnsi="Wingdings" w:hint="default"/>
+        <w:sz w:val="20"/>
+      </w:rPr>
+    </w:lvl>
+    <w:lvl w:ilvl="7" w:tentative="1">
+      <w:start w:val="1"/>
+      <w:numFmt w:val="bullet"/>
+      <w:lvlText w:val=""/>
+      <w:lvlJc w:val="left"/>
+      <w:pPr>
+        <w:tabs>
+          <w:tab w:val="num" w:pos="6120"/>
+        </w:tabs>
+        <w:ind w:left="6120" w:hanging="360"/>
+      </w:pPr>
+      <w:rPr>
+        <w:rFonts w:ascii="Wingdings" w:hAnsi="Wingdings" w:hint="default"/>
+        <w:sz w:val="20"/>
+      </w:rPr>
+    </w:lvl>
+    <w:lvl w:ilvl="8" w:tentative="1">
+      <w:start w:val="1"/>
+      <w:numFmt w:val="bullet"/>
+      <w:lvlText w:val=""/>
+      <w:lvlJc w:val="left"/>
+      <w:pPr>
+        <w:tabs>
+          <w:tab w:val="num" w:pos="6840"/>
+        </w:tabs>
+        <w:ind w:left="6840" w:hanging="360"/>
+      </w:pPr>
+      <w:rPr>
+        <w:rFonts w:ascii="Wingdings" w:hAnsi="Wingdings" w:hint="default"/>
+        <w:sz w:val="20"/>
+      </w:rPr>
+    </w:lvl>
+  </w:abstractNum>
+  <w:abstractNum w:abstractNumId="20" w15:restartNumberingAfterBreak="0">
     <w:nsid w:val="3C926DB1"/>
     <w:multiLevelType w:val="multilevel"/>
     <w:tmpl w:val="DC36B4B8"/>
@@ -10126,7 +11689,7 @@
       </w:pPr>
     </w:lvl>
   </w:abstractNum>
-  <w:abstractNum w:abstractNumId="14" w15:restartNumberingAfterBreak="0">
+  <w:abstractNum w:abstractNumId="21" w15:restartNumberingAfterBreak="0">
     <w:nsid w:val="435A2935"/>
     <w:multiLevelType w:val="multilevel"/>
     <w:tmpl w:val="CFD82E00"/>
@@ -10272,7 +11835,7 @@
       </w:rPr>
     </w:lvl>
   </w:abstractNum>
-  <w:abstractNum w:abstractNumId="15" w15:restartNumberingAfterBreak="0">
+  <w:abstractNum w:abstractNumId="22" w15:restartNumberingAfterBreak="0">
     <w:nsid w:val="43F25837"/>
     <w:multiLevelType w:val="multilevel"/>
     <w:tmpl w:val="7848DA80"/>
@@ -10420,7 +11983,7 @@
       </w:rPr>
     </w:lvl>
   </w:abstractNum>
-  <w:abstractNum w:abstractNumId="16" w15:restartNumberingAfterBreak="0">
+  <w:abstractNum w:abstractNumId="23" w15:restartNumberingAfterBreak="0">
     <w:nsid w:val="529736CC"/>
     <w:multiLevelType w:val="multilevel"/>
     <w:tmpl w:val="BAE80E96"/>
@@ -10533,7 +12096,7 @@
       </w:rPr>
     </w:lvl>
   </w:abstractNum>
-  <w:abstractNum w:abstractNumId="17" w15:restartNumberingAfterBreak="0">
+  <w:abstractNum w:abstractNumId="24" w15:restartNumberingAfterBreak="0">
     <w:nsid w:val="56C2176C"/>
     <w:multiLevelType w:val="hybridMultilevel"/>
     <w:tmpl w:val="76C01236"/>
@@ -10648,7 +12211,7 @@
       </w:rPr>
     </w:lvl>
   </w:abstractNum>
-  <w:abstractNum w:abstractNumId="18" w15:restartNumberingAfterBreak="0">
+  <w:abstractNum w:abstractNumId="25" w15:restartNumberingAfterBreak="0">
     <w:nsid w:val="5B5F17F1"/>
     <w:multiLevelType w:val="multilevel"/>
     <w:tmpl w:val="53FEA10A"/>
@@ -10761,7 +12324,269 @@
       </w:pPr>
     </w:lvl>
   </w:abstractNum>
-  <w:abstractNum w:abstractNumId="19" w15:restartNumberingAfterBreak="0">
+  <w:abstractNum w:abstractNumId="26" w15:restartNumberingAfterBreak="0">
+    <w:nsid w:val="616D6D88"/>
+    <w:multiLevelType w:val="multilevel"/>
+    <w:tmpl w:val="96D88636"/>
+    <w:lvl w:ilvl="0">
+      <w:start w:val="1"/>
+      <w:numFmt w:val="bullet"/>
+      <w:lvlText w:val=""/>
+      <w:lvlJc w:val="left"/>
+      <w:pPr>
+        <w:tabs>
+          <w:tab w:val="num" w:pos="720"/>
+        </w:tabs>
+        <w:ind w:left="720" w:hanging="360"/>
+      </w:pPr>
+      <w:rPr>
+        <w:rFonts w:ascii="Symbol" w:hAnsi="Symbol" w:hint="default"/>
+        <w:sz w:val="20"/>
+      </w:rPr>
+    </w:lvl>
+    <w:lvl w:ilvl="1" w:tentative="1">
+      <w:start w:val="1"/>
+      <w:numFmt w:val="bullet"/>
+      <w:lvlText w:val="o"/>
+      <w:lvlJc w:val="left"/>
+      <w:pPr>
+        <w:tabs>
+          <w:tab w:val="num" w:pos="1440"/>
+        </w:tabs>
+        <w:ind w:left="1440" w:hanging="360"/>
+      </w:pPr>
+      <w:rPr>
+        <w:rFonts w:ascii="Courier New" w:hAnsi="Courier New" w:hint="default"/>
+        <w:sz w:val="20"/>
+      </w:rPr>
+    </w:lvl>
+    <w:lvl w:ilvl="2" w:tentative="1">
+      <w:start w:val="1"/>
+      <w:numFmt w:val="bullet"/>
+      <w:lvlText w:val=""/>
+      <w:lvlJc w:val="left"/>
+      <w:pPr>
+        <w:tabs>
+          <w:tab w:val="num" w:pos="2160"/>
+        </w:tabs>
+        <w:ind w:left="2160" w:hanging="360"/>
+      </w:pPr>
+      <w:rPr>
+        <w:rFonts w:ascii="Wingdings" w:hAnsi="Wingdings" w:hint="default"/>
+        <w:sz w:val="20"/>
+      </w:rPr>
+    </w:lvl>
+    <w:lvl w:ilvl="3" w:tentative="1">
+      <w:start w:val="1"/>
+      <w:numFmt w:val="bullet"/>
+      <w:lvlText w:val=""/>
+      <w:lvlJc w:val="left"/>
+      <w:pPr>
+        <w:tabs>
+          <w:tab w:val="num" w:pos="2880"/>
+        </w:tabs>
+        <w:ind w:left="2880" w:hanging="360"/>
+      </w:pPr>
+      <w:rPr>
+        <w:rFonts w:ascii="Wingdings" w:hAnsi="Wingdings" w:hint="default"/>
+        <w:sz w:val="20"/>
+      </w:rPr>
+    </w:lvl>
+    <w:lvl w:ilvl="4" w:tentative="1">
+      <w:start w:val="1"/>
+      <w:numFmt w:val="bullet"/>
+      <w:lvlText w:val=""/>
+      <w:lvlJc w:val="left"/>
+      <w:pPr>
+        <w:tabs>
+          <w:tab w:val="num" w:pos="3600"/>
+        </w:tabs>
+        <w:ind w:left="3600" w:hanging="360"/>
+      </w:pPr>
+      <w:rPr>
+        <w:rFonts w:ascii="Wingdings" w:hAnsi="Wingdings" w:hint="default"/>
+        <w:sz w:val="20"/>
+      </w:rPr>
+    </w:lvl>
+    <w:lvl w:ilvl="5" w:tentative="1">
+      <w:start w:val="1"/>
+      <w:numFmt w:val="bullet"/>
+      <w:lvlText w:val=""/>
+      <w:lvlJc w:val="left"/>
+      <w:pPr>
+        <w:tabs>
+          <w:tab w:val="num" w:pos="4320"/>
+        </w:tabs>
+        <w:ind w:left="4320" w:hanging="360"/>
+      </w:pPr>
+      <w:rPr>
+        <w:rFonts w:ascii="Wingdings" w:hAnsi="Wingdings" w:hint="default"/>
+        <w:sz w:val="20"/>
+      </w:rPr>
+    </w:lvl>
+    <w:lvl w:ilvl="6" w:tentative="1">
+      <w:start w:val="1"/>
+      <w:numFmt w:val="bullet"/>
+      <w:lvlText w:val=""/>
+      <w:lvlJc w:val="left"/>
+      <w:pPr>
+        <w:tabs>
+          <w:tab w:val="num" w:pos="5040"/>
+        </w:tabs>
+        <w:ind w:left="5040" w:hanging="360"/>
+      </w:pPr>
+      <w:rPr>
+        <w:rFonts w:ascii="Wingdings" w:hAnsi="Wingdings" w:hint="default"/>
+        <w:sz w:val="20"/>
+      </w:rPr>
+    </w:lvl>
+    <w:lvl w:ilvl="7" w:tentative="1">
+      <w:start w:val="1"/>
+      <w:numFmt w:val="bullet"/>
+      <w:lvlText w:val=""/>
+      <w:lvlJc w:val="left"/>
+      <w:pPr>
+        <w:tabs>
+          <w:tab w:val="num" w:pos="5760"/>
+        </w:tabs>
+        <w:ind w:left="5760" w:hanging="360"/>
+      </w:pPr>
+      <w:rPr>
+        <w:rFonts w:ascii="Wingdings" w:hAnsi="Wingdings" w:hint="default"/>
+        <w:sz w:val="20"/>
+      </w:rPr>
+    </w:lvl>
+    <w:lvl w:ilvl="8" w:tentative="1">
+      <w:start w:val="1"/>
+      <w:numFmt w:val="bullet"/>
+      <w:lvlText w:val=""/>
+      <w:lvlJc w:val="left"/>
+      <w:pPr>
+        <w:tabs>
+          <w:tab w:val="num" w:pos="6480"/>
+        </w:tabs>
+        <w:ind w:left="6480" w:hanging="360"/>
+      </w:pPr>
+      <w:rPr>
+        <w:rFonts w:ascii="Wingdings" w:hAnsi="Wingdings" w:hint="default"/>
+        <w:sz w:val="20"/>
+      </w:rPr>
+    </w:lvl>
+  </w:abstractNum>
+  <w:abstractNum w:abstractNumId="27" w15:restartNumberingAfterBreak="0">
+    <w:nsid w:val="6A03389C"/>
+    <w:multiLevelType w:val="multilevel"/>
+    <w:tmpl w:val="E662DDFC"/>
+    <w:lvl w:ilvl="0">
+      <w:start w:val="1"/>
+      <w:numFmt w:val="decimal"/>
+      <w:lvlText w:val="%1."/>
+      <w:lvlJc w:val="left"/>
+      <w:pPr>
+        <w:tabs>
+          <w:tab w:val="num" w:pos="720"/>
+        </w:tabs>
+        <w:ind w:left="720" w:hanging="360"/>
+      </w:pPr>
+    </w:lvl>
+    <w:lvl w:ilvl="1" w:tentative="1">
+      <w:start w:val="1"/>
+      <w:numFmt w:val="decimal"/>
+      <w:lvlText w:val="%2."/>
+      <w:lvlJc w:val="left"/>
+      <w:pPr>
+        <w:tabs>
+          <w:tab w:val="num" w:pos="1440"/>
+        </w:tabs>
+        <w:ind w:left="1440" w:hanging="360"/>
+      </w:pPr>
+    </w:lvl>
+    <w:lvl w:ilvl="2" w:tentative="1">
+      <w:start w:val="1"/>
+      <w:numFmt w:val="decimal"/>
+      <w:lvlText w:val="%3."/>
+      <w:lvlJc w:val="left"/>
+      <w:pPr>
+        <w:tabs>
+          <w:tab w:val="num" w:pos="2160"/>
+        </w:tabs>
+        <w:ind w:left="2160" w:hanging="360"/>
+      </w:pPr>
+    </w:lvl>
+    <w:lvl w:ilvl="3" w:tentative="1">
+      <w:start w:val="1"/>
+      <w:numFmt w:val="decimal"/>
+      <w:lvlText w:val="%4."/>
+      <w:lvlJc w:val="left"/>
+      <w:pPr>
+        <w:tabs>
+          <w:tab w:val="num" w:pos="2880"/>
+        </w:tabs>
+        <w:ind w:left="2880" w:hanging="360"/>
+      </w:pPr>
+    </w:lvl>
+    <w:lvl w:ilvl="4" w:tentative="1">
+      <w:start w:val="1"/>
+      <w:numFmt w:val="decimal"/>
+      <w:lvlText w:val="%5."/>
+      <w:lvlJc w:val="left"/>
+      <w:pPr>
+        <w:tabs>
+          <w:tab w:val="num" w:pos="3600"/>
+        </w:tabs>
+        <w:ind w:left="3600" w:hanging="360"/>
+      </w:pPr>
+    </w:lvl>
+    <w:lvl w:ilvl="5" w:tentative="1">
+      <w:start w:val="1"/>
+      <w:numFmt w:val="decimal"/>
+      <w:lvlText w:val="%6."/>
+      <w:lvlJc w:val="left"/>
+      <w:pPr>
+        <w:tabs>
+          <w:tab w:val="num" w:pos="4320"/>
+        </w:tabs>
+        <w:ind w:left="4320" w:hanging="360"/>
+      </w:pPr>
+    </w:lvl>
+    <w:lvl w:ilvl="6" w:tentative="1">
+      <w:start w:val="1"/>
+      <w:numFmt w:val="decimal"/>
+      <w:lvlText w:val="%7."/>
+      <w:lvlJc w:val="left"/>
+      <w:pPr>
+        <w:tabs>
+          <w:tab w:val="num" w:pos="5040"/>
+        </w:tabs>
+        <w:ind w:left="5040" w:hanging="360"/>
+      </w:pPr>
+    </w:lvl>
+    <w:lvl w:ilvl="7" w:tentative="1">
+      <w:start w:val="1"/>
+      <w:numFmt w:val="decimal"/>
+      <w:lvlText w:val="%8."/>
+      <w:lvlJc w:val="left"/>
+      <w:pPr>
+        <w:tabs>
+          <w:tab w:val="num" w:pos="5760"/>
+        </w:tabs>
+        <w:ind w:left="5760" w:hanging="360"/>
+      </w:pPr>
+    </w:lvl>
+    <w:lvl w:ilvl="8" w:tentative="1">
+      <w:start w:val="1"/>
+      <w:numFmt w:val="decimal"/>
+      <w:lvlText w:val="%9."/>
+      <w:lvlJc w:val="left"/>
+      <w:pPr>
+        <w:tabs>
+          <w:tab w:val="num" w:pos="6480"/>
+        </w:tabs>
+        <w:ind w:left="6480" w:hanging="360"/>
+      </w:pPr>
+    </w:lvl>
+  </w:abstractNum>
+  <w:abstractNum w:abstractNumId="28" w15:restartNumberingAfterBreak="0">
     <w:nsid w:val="6AC13D9D"/>
     <w:multiLevelType w:val="hybridMultilevel"/>
     <w:tmpl w:val="DCF6825C"/>
@@ -10876,7 +12701,7 @@
       </w:rPr>
     </w:lvl>
   </w:abstractNum>
-  <w:abstractNum w:abstractNumId="20" w15:restartNumberingAfterBreak="0">
+  <w:abstractNum w:abstractNumId="29" w15:restartNumberingAfterBreak="0">
     <w:nsid w:val="71BE6108"/>
     <w:multiLevelType w:val="multilevel"/>
     <w:tmpl w:val="9D5440D8"/>
@@ -11025,7 +12850,156 @@
       </w:rPr>
     </w:lvl>
   </w:abstractNum>
-  <w:abstractNum w:abstractNumId="21" w15:restartNumberingAfterBreak="0">
+  <w:abstractNum w:abstractNumId="30" w15:restartNumberingAfterBreak="0">
+    <w:nsid w:val="752D7E41"/>
+    <w:multiLevelType w:val="multilevel"/>
+    <w:tmpl w:val="BE2E71A2"/>
+    <w:lvl w:ilvl="0">
+      <w:start w:val="1"/>
+      <w:numFmt w:val="bullet"/>
+      <w:lvlText w:val=""/>
+      <w:lvlJc w:val="left"/>
+      <w:pPr>
+        <w:tabs>
+          <w:tab w:val="num" w:pos="720"/>
+        </w:tabs>
+        <w:ind w:left="720" w:hanging="360"/>
+      </w:pPr>
+      <w:rPr>
+        <w:rFonts w:ascii="Symbol" w:hAnsi="Symbol" w:hint="default"/>
+        <w:sz w:val="20"/>
+      </w:rPr>
+    </w:lvl>
+    <w:lvl w:ilvl="1" w:tentative="1">
+      <w:start w:val="1"/>
+      <w:numFmt w:val="bullet"/>
+      <w:lvlText w:val="o"/>
+      <w:lvlJc w:val="left"/>
+      <w:pPr>
+        <w:tabs>
+          <w:tab w:val="num" w:pos="1440"/>
+        </w:tabs>
+        <w:ind w:left="1440" w:hanging="360"/>
+      </w:pPr>
+      <w:rPr>
+        <w:rFonts w:ascii="Courier New" w:hAnsi="Courier New" w:hint="default"/>
+        <w:sz w:val="20"/>
+      </w:rPr>
+    </w:lvl>
+    <w:lvl w:ilvl="2" w:tentative="1">
+      <w:start w:val="1"/>
+      <w:numFmt w:val="bullet"/>
+      <w:lvlText w:val=""/>
+      <w:lvlJc w:val="left"/>
+      <w:pPr>
+        <w:tabs>
+          <w:tab w:val="num" w:pos="2160"/>
+        </w:tabs>
+        <w:ind w:left="2160" w:hanging="360"/>
+      </w:pPr>
+      <w:rPr>
+        <w:rFonts w:ascii="Wingdings" w:hAnsi="Wingdings" w:hint="default"/>
+        <w:sz w:val="20"/>
+      </w:rPr>
+    </w:lvl>
+    <w:lvl w:ilvl="3" w:tentative="1">
+      <w:start w:val="1"/>
+      <w:numFmt w:val="bullet"/>
+      <w:lvlText w:val=""/>
+      <w:lvlJc w:val="left"/>
+      <w:pPr>
+        <w:tabs>
+          <w:tab w:val="num" w:pos="2880"/>
+        </w:tabs>
+        <w:ind w:left="2880" w:hanging="360"/>
+      </w:pPr>
+      <w:rPr>
+        <w:rFonts w:ascii="Wingdings" w:hAnsi="Wingdings" w:hint="default"/>
+        <w:sz w:val="20"/>
+      </w:rPr>
+    </w:lvl>
+    <w:lvl w:ilvl="4" w:tentative="1">
+      <w:start w:val="1"/>
+      <w:numFmt w:val="bullet"/>
+      <w:lvlText w:val=""/>
+      <w:lvlJc w:val="left"/>
+      <w:pPr>
+        <w:tabs>
+          <w:tab w:val="num" w:pos="3600"/>
+        </w:tabs>
+        <w:ind w:left="3600" w:hanging="360"/>
+      </w:pPr>
+      <w:rPr>
+        <w:rFonts w:ascii="Wingdings" w:hAnsi="Wingdings" w:hint="default"/>
+        <w:sz w:val="20"/>
+      </w:rPr>
+    </w:lvl>
+    <w:lvl w:ilvl="5" w:tentative="1">
+      <w:start w:val="1"/>
+      <w:numFmt w:val="bullet"/>
+      <w:lvlText w:val=""/>
+      <w:lvlJc w:val="left"/>
+      <w:pPr>
+        <w:tabs>
+          <w:tab w:val="num" w:pos="4320"/>
+        </w:tabs>
+        <w:ind w:left="4320" w:hanging="360"/>
+      </w:pPr>
+      <w:rPr>
+        <w:rFonts w:ascii="Wingdings" w:hAnsi="Wingdings" w:hint="default"/>
+        <w:sz w:val="20"/>
+      </w:rPr>
+    </w:lvl>
+    <w:lvl w:ilvl="6" w:tentative="1">
+      <w:start w:val="1"/>
+      <w:numFmt w:val="bullet"/>
+      <w:lvlText w:val=""/>
+      <w:lvlJc w:val="left"/>
+      <w:pPr>
+        <w:tabs>
+          <w:tab w:val="num" w:pos="5040"/>
+        </w:tabs>
+        <w:ind w:left="5040" w:hanging="360"/>
+      </w:pPr>
+      <w:rPr>
+        <w:rFonts w:ascii="Wingdings" w:hAnsi="Wingdings" w:hint="default"/>
+        <w:sz w:val="20"/>
+      </w:rPr>
+    </w:lvl>
+    <w:lvl w:ilvl="7" w:tentative="1">
+      <w:start w:val="1"/>
+      <w:numFmt w:val="bullet"/>
+      <w:lvlText w:val=""/>
+      <w:lvlJc w:val="left"/>
+      <w:pPr>
+        <w:tabs>
+          <w:tab w:val="num" w:pos="5760"/>
+        </w:tabs>
+        <w:ind w:left="5760" w:hanging="360"/>
+      </w:pPr>
+      <w:rPr>
+        <w:rFonts w:ascii="Wingdings" w:hAnsi="Wingdings" w:hint="default"/>
+        <w:sz w:val="20"/>
+      </w:rPr>
+    </w:lvl>
+    <w:lvl w:ilvl="8" w:tentative="1">
+      <w:start w:val="1"/>
+      <w:numFmt w:val="bullet"/>
+      <w:lvlText w:val=""/>
+      <w:lvlJc w:val="left"/>
+      <w:pPr>
+        <w:tabs>
+          <w:tab w:val="num" w:pos="6480"/>
+        </w:tabs>
+        <w:ind w:left="6480" w:hanging="360"/>
+      </w:pPr>
+      <w:rPr>
+        <w:rFonts w:ascii="Wingdings" w:hAnsi="Wingdings" w:hint="default"/>
+        <w:sz w:val="20"/>
+      </w:rPr>
+    </w:lvl>
+  </w:abstractNum>
+  <w:abstractNum w:abstractNumId="31" w15:restartNumberingAfterBreak="0">
     <w:nsid w:val="7CF811A5"/>
     <w:multiLevelType w:val="hybridMultilevel"/>
     <w:tmpl w:val="D21E5BCA"/>
@@ -11138,7 +13112,7 @@
       </w:rPr>
     </w:lvl>
   </w:abstractNum>
-  <w:abstractNum w:abstractNumId="22" w15:restartNumberingAfterBreak="0">
+  <w:abstractNum w:abstractNumId="32" w15:restartNumberingAfterBreak="0">
     <w:nsid w:val="7E985D6B"/>
     <w:multiLevelType w:val="hybridMultilevel"/>
     <w:tmpl w:val="4AA046AE"/>
@@ -11251,7 +13225,7 @@
       </w:rPr>
     </w:lvl>
   </w:abstractNum>
-  <w:abstractNum w:abstractNumId="23" w15:restartNumberingAfterBreak="0">
+  <w:abstractNum w:abstractNumId="33" w15:restartNumberingAfterBreak="0">
     <w:nsid w:val="7EAC6A5C"/>
     <w:multiLevelType w:val="multilevel"/>
     <w:tmpl w:val="53045616"/>
@@ -11364,80 +13338,262 @@
       </w:rPr>
     </w:lvl>
   </w:abstractNum>
+  <w:abstractNum w:abstractNumId="34" w15:restartNumberingAfterBreak="0">
+    <w:nsid w:val="7EB40216"/>
+    <w:multiLevelType w:val="multilevel"/>
+    <w:tmpl w:val="71FAE2EE"/>
+    <w:lvl w:ilvl="0">
+      <w:start w:val="1"/>
+      <w:numFmt w:val="bullet"/>
+      <w:lvlText w:val=""/>
+      <w:lvlJc w:val="left"/>
+      <w:pPr>
+        <w:tabs>
+          <w:tab w:val="num" w:pos="720"/>
+        </w:tabs>
+        <w:ind w:left="720" w:hanging="360"/>
+      </w:pPr>
+      <w:rPr>
+        <w:rFonts w:ascii="Symbol" w:hAnsi="Symbol" w:hint="default"/>
+        <w:sz w:val="20"/>
+      </w:rPr>
+    </w:lvl>
+    <w:lvl w:ilvl="1" w:tentative="1">
+      <w:start w:val="1"/>
+      <w:numFmt w:val="bullet"/>
+      <w:lvlText w:val="o"/>
+      <w:lvlJc w:val="left"/>
+      <w:pPr>
+        <w:tabs>
+          <w:tab w:val="num" w:pos="1440"/>
+        </w:tabs>
+        <w:ind w:left="1440" w:hanging="360"/>
+      </w:pPr>
+      <w:rPr>
+        <w:rFonts w:ascii="Courier New" w:hAnsi="Courier New" w:hint="default"/>
+        <w:sz w:val="20"/>
+      </w:rPr>
+    </w:lvl>
+    <w:lvl w:ilvl="2" w:tentative="1">
+      <w:start w:val="1"/>
+      <w:numFmt w:val="bullet"/>
+      <w:lvlText w:val=""/>
+      <w:lvlJc w:val="left"/>
+      <w:pPr>
+        <w:tabs>
+          <w:tab w:val="num" w:pos="2160"/>
+        </w:tabs>
+        <w:ind w:left="2160" w:hanging="360"/>
+      </w:pPr>
+      <w:rPr>
+        <w:rFonts w:ascii="Wingdings" w:hAnsi="Wingdings" w:hint="default"/>
+        <w:sz w:val="20"/>
+      </w:rPr>
+    </w:lvl>
+    <w:lvl w:ilvl="3" w:tentative="1">
+      <w:start w:val="1"/>
+      <w:numFmt w:val="bullet"/>
+      <w:lvlText w:val=""/>
+      <w:lvlJc w:val="left"/>
+      <w:pPr>
+        <w:tabs>
+          <w:tab w:val="num" w:pos="2880"/>
+        </w:tabs>
+        <w:ind w:left="2880" w:hanging="360"/>
+      </w:pPr>
+      <w:rPr>
+        <w:rFonts w:ascii="Wingdings" w:hAnsi="Wingdings" w:hint="default"/>
+        <w:sz w:val="20"/>
+      </w:rPr>
+    </w:lvl>
+    <w:lvl w:ilvl="4" w:tentative="1">
+      <w:start w:val="1"/>
+      <w:numFmt w:val="bullet"/>
+      <w:lvlText w:val=""/>
+      <w:lvlJc w:val="left"/>
+      <w:pPr>
+        <w:tabs>
+          <w:tab w:val="num" w:pos="3600"/>
+        </w:tabs>
+        <w:ind w:left="3600" w:hanging="360"/>
+      </w:pPr>
+      <w:rPr>
+        <w:rFonts w:ascii="Wingdings" w:hAnsi="Wingdings" w:hint="default"/>
+        <w:sz w:val="20"/>
+      </w:rPr>
+    </w:lvl>
+    <w:lvl w:ilvl="5" w:tentative="1">
+      <w:start w:val="1"/>
+      <w:numFmt w:val="bullet"/>
+      <w:lvlText w:val=""/>
+      <w:lvlJc w:val="left"/>
+      <w:pPr>
+        <w:tabs>
+          <w:tab w:val="num" w:pos="4320"/>
+        </w:tabs>
+        <w:ind w:left="4320" w:hanging="360"/>
+      </w:pPr>
+      <w:rPr>
+        <w:rFonts w:ascii="Wingdings" w:hAnsi="Wingdings" w:hint="default"/>
+        <w:sz w:val="20"/>
+      </w:rPr>
+    </w:lvl>
+    <w:lvl w:ilvl="6" w:tentative="1">
+      <w:start w:val="1"/>
+      <w:numFmt w:val="bullet"/>
+      <w:lvlText w:val=""/>
+      <w:lvlJc w:val="left"/>
+      <w:pPr>
+        <w:tabs>
+          <w:tab w:val="num" w:pos="5040"/>
+        </w:tabs>
+        <w:ind w:left="5040" w:hanging="360"/>
+      </w:pPr>
+      <w:rPr>
+        <w:rFonts w:ascii="Wingdings" w:hAnsi="Wingdings" w:hint="default"/>
+        <w:sz w:val="20"/>
+      </w:rPr>
+    </w:lvl>
+    <w:lvl w:ilvl="7" w:tentative="1">
+      <w:start w:val="1"/>
+      <w:numFmt w:val="bullet"/>
+      <w:lvlText w:val=""/>
+      <w:lvlJc w:val="left"/>
+      <w:pPr>
+        <w:tabs>
+          <w:tab w:val="num" w:pos="5760"/>
+        </w:tabs>
+        <w:ind w:left="5760" w:hanging="360"/>
+      </w:pPr>
+      <w:rPr>
+        <w:rFonts w:ascii="Wingdings" w:hAnsi="Wingdings" w:hint="default"/>
+        <w:sz w:val="20"/>
+      </w:rPr>
+    </w:lvl>
+    <w:lvl w:ilvl="8" w:tentative="1">
+      <w:start w:val="1"/>
+      <w:numFmt w:val="bullet"/>
+      <w:lvlText w:val=""/>
+      <w:lvlJc w:val="left"/>
+      <w:pPr>
+        <w:tabs>
+          <w:tab w:val="num" w:pos="6480"/>
+        </w:tabs>
+        <w:ind w:left="6480" w:hanging="360"/>
+      </w:pPr>
+      <w:rPr>
+        <w:rFonts w:ascii="Wingdings" w:hAnsi="Wingdings" w:hint="default"/>
+        <w:sz w:val="20"/>
+      </w:rPr>
+    </w:lvl>
+  </w:abstractNum>
   <w:num w:numId="1" w16cid:durableId="175922415">
-    <w:abstractNumId w:val="9"/>
+    <w:abstractNumId w:val="15"/>
   </w:num>
   <w:num w:numId="2" w16cid:durableId="1726442119">
-    <w:abstractNumId w:val="21"/>
+    <w:abstractNumId w:val="31"/>
   </w:num>
   <w:num w:numId="3" w16cid:durableId="461657596">
-    <w:abstractNumId w:val="22"/>
+    <w:abstractNumId w:val="32"/>
   </w:num>
   <w:num w:numId="4" w16cid:durableId="531646460">
-    <w:abstractNumId w:val="6"/>
+    <w:abstractNumId w:val="11"/>
   </w:num>
   <w:num w:numId="5" w16cid:durableId="932133179">
-    <w:abstractNumId w:val="10"/>
+    <w:abstractNumId w:val="16"/>
   </w:num>
   <w:num w:numId="6" w16cid:durableId="45841172">
-    <w:abstractNumId w:val="3"/>
+    <w:abstractNumId w:val="4"/>
   </w:num>
   <w:num w:numId="7" w16cid:durableId="1264386997">
-    <w:abstractNumId w:val="17"/>
+    <w:abstractNumId w:val="24"/>
   </w:num>
   <w:num w:numId="8" w16cid:durableId="64226689">
-    <w:abstractNumId w:val="12"/>
+    <w:abstractNumId w:val="18"/>
   </w:num>
   <w:num w:numId="9" w16cid:durableId="1044908837">
-    <w:abstractNumId w:val="20"/>
+    <w:abstractNumId w:val="29"/>
   </w:num>
   <w:num w:numId="10" w16cid:durableId="792408488">
     <w:abstractNumId w:val="1"/>
   </w:num>
   <w:num w:numId="11" w16cid:durableId="144441432">
-    <w:abstractNumId w:val="16"/>
+    <w:abstractNumId w:val="23"/>
   </w:num>
   <w:num w:numId="12" w16cid:durableId="952907690">
-    <w:abstractNumId w:val="18"/>
+    <w:abstractNumId w:val="25"/>
   </w:num>
   <w:num w:numId="13" w16cid:durableId="955022580">
     <w:abstractNumId w:val="0"/>
   </w:num>
   <w:num w:numId="14" w16cid:durableId="362825111">
+    <w:abstractNumId w:val="28"/>
+  </w:num>
+  <w:num w:numId="15" w16cid:durableId="291600163">
+    <w:abstractNumId w:val="8"/>
+  </w:num>
+  <w:num w:numId="16" w16cid:durableId="923614134">
+    <w:abstractNumId w:val="8"/>
+  </w:num>
+  <w:num w:numId="17" w16cid:durableId="1428958800">
+    <w:abstractNumId w:val="7"/>
+  </w:num>
+  <w:num w:numId="18" w16cid:durableId="900016542">
+    <w:abstractNumId w:val="14"/>
+  </w:num>
+  <w:num w:numId="19" w16cid:durableId="82262952">
+    <w:abstractNumId w:val="17"/>
+  </w:num>
+  <w:num w:numId="20" w16cid:durableId="1874003613">
+    <w:abstractNumId w:val="33"/>
+  </w:num>
+  <w:num w:numId="21" w16cid:durableId="634680109">
+    <w:abstractNumId w:val="22"/>
+  </w:num>
+  <w:num w:numId="22" w16cid:durableId="60058465">
+    <w:abstractNumId w:val="21"/>
+  </w:num>
+  <w:num w:numId="23" w16cid:durableId="1642422152">
+    <w:abstractNumId w:val="12"/>
+  </w:num>
+  <w:num w:numId="24" w16cid:durableId="1348024468">
+    <w:abstractNumId w:val="20"/>
+  </w:num>
+  <w:num w:numId="25" w16cid:durableId="1469200549">
+    <w:abstractNumId w:val="3"/>
+  </w:num>
+  <w:num w:numId="26" w16cid:durableId="816074559">
+    <w:abstractNumId w:val="34"/>
+  </w:num>
+  <w:num w:numId="27" w16cid:durableId="1610430204">
+    <w:abstractNumId w:val="30"/>
+  </w:num>
+  <w:num w:numId="28" w16cid:durableId="109277301">
+    <w:abstractNumId w:val="13"/>
+  </w:num>
+  <w:num w:numId="29" w16cid:durableId="1682123250">
+    <w:abstractNumId w:val="5"/>
+  </w:num>
+  <w:num w:numId="30" w16cid:durableId="775641236">
+    <w:abstractNumId w:val="26"/>
+  </w:num>
+  <w:num w:numId="31" w16cid:durableId="1671522755">
+    <w:abstractNumId w:val="27"/>
+  </w:num>
+  <w:num w:numId="32" w16cid:durableId="808011220">
+    <w:abstractNumId w:val="6"/>
+  </w:num>
+  <w:num w:numId="33" w16cid:durableId="212932172">
+    <w:abstractNumId w:val="2"/>
+  </w:num>
+  <w:num w:numId="34" w16cid:durableId="331951541">
     <w:abstractNumId w:val="19"/>
   </w:num>
-  <w:num w:numId="15" w16cid:durableId="291600163">
-    <w:abstractNumId w:val="5"/>
+  <w:num w:numId="35" w16cid:durableId="1193572610">
+    <w:abstractNumId w:val="9"/>
   </w:num>
-  <w:num w:numId="16" w16cid:durableId="923614134">
-    <w:abstractNumId w:val="5"/>
-  </w:num>
-  <w:num w:numId="17" w16cid:durableId="1428958800">
-    <w:abstractNumId w:val="4"/>
-  </w:num>
-  <w:num w:numId="18" w16cid:durableId="900016542">
-    <w:abstractNumId w:val="8"/>
-  </w:num>
-  <w:num w:numId="19" w16cid:durableId="82262952">
-    <w:abstractNumId w:val="11"/>
-  </w:num>
-  <w:num w:numId="20" w16cid:durableId="1874003613">
-    <w:abstractNumId w:val="23"/>
-  </w:num>
-  <w:num w:numId="21" w16cid:durableId="634680109">
-    <w:abstractNumId w:val="15"/>
-  </w:num>
-  <w:num w:numId="22" w16cid:durableId="60058465">
-    <w:abstractNumId w:val="14"/>
-  </w:num>
-  <w:num w:numId="23" w16cid:durableId="1642422152">
-    <w:abstractNumId w:val="7"/>
-  </w:num>
-  <w:num w:numId="24" w16cid:durableId="1348024468">
-    <w:abstractNumId w:val="13"/>
-  </w:num>
-  <w:num w:numId="25" w16cid:durableId="1469200549">
-    <w:abstractNumId w:val="2"/>
+  <w:num w:numId="36" w16cid:durableId="692995310">
+    <w:abstractNumId w:val="10"/>
   </w:num>
   <w:numIdMacAtCleanup w:val="15"/>
 </w:numbering>
@@ -12049,7 +14205,6 @@
   <w:style w:type="character" w:default="1" w:styleId="DefaultParagraphFont">
     <w:name w:val="Default Paragraph Font"/>
     <w:uiPriority w:val="1"/>
-    <w:semiHidden/>
     <w:unhideWhenUsed/>
   </w:style>
   <w:style w:type="table" w:default="1" w:styleId="TableNormal">
@@ -12526,6 +14681,23 @@
       </w:tblBorders>
     </w:tblPr>
   </w:style>
+  <w:style w:type="paragraph" w:customStyle="1" w:styleId="font-claude-response-body">
+    <w:name w:val="font-claude-response-body"/>
+    <w:basedOn w:val="Normal"/>
+    <w:rsid w:val="00032F9D"/>
+    <w:pPr>
+      <w:spacing w:before="100" w:beforeAutospacing="1" w:after="100" w:afterAutospacing="1" w:line="240" w:lineRule="auto"/>
+    </w:pPr>
+    <w:rPr>
+      <w:rFonts w:ascii="Times New Roman" w:eastAsia="Times New Roman" w:hAnsi="Times New Roman" w:cs="Times New Roman"/>
+      <w:noProof w:val="0"/>
+      <w:kern w:val="0"/>
+      <w:sz w:val="24"/>
+      <w:szCs w:val="24"/>
+      <w:lang w:val="en"/>
+      <w14:ligatures w14:val="none"/>
+    </w:rPr>
+  </w:style>
 </w:styles>
 </file>
 

</xml_diff>

<commit_message>
Sửa lại báo cáo
</commit_message>
<xml_diff>
--- a/File docs/Báo cáo dự án.docx
+++ b/File docs/Báo cáo dự án.docx
@@ -1048,7 +1048,23 @@
           <w:sz w:val="24"/>
           <w:szCs w:val="24"/>
         </w:rPr>
-        <w:t xml:space="preserve">Bộ dữ liệu mô phỏng hoạt động của một doanh nghiệp bán lẻ đa quốc gia, bao gồm hơn 51.252 bản ghi giao dịch trong giai đoạn từ năm 2011 đến 2014. Dữ liệu bao phủ nhiều khu vực thị trường trên toàn cầu như Mỹ, Châu Âu, Châu Á - Thái Bình Dương và Châu Mỹ Latinh. </w:t>
+        <w:t>Bộ dữ liệu mô phỏng hoạt động của một doanh nghiệp bán lẻ đa quốc gia, bao gồm hơn 51.</w:t>
+      </w:r>
+      <w:r>
+        <w:rPr>
+          <w:rFonts w:ascii="Times New Roman" w:hAnsi="Times New Roman" w:cs="Times New Roman"/>
+          <w:sz w:val="24"/>
+          <w:szCs w:val="24"/>
+        </w:rPr>
+        <w:t>290</w:t>
+      </w:r>
+      <w:r>
+        <w:rPr>
+          <w:rFonts w:ascii="Times New Roman" w:hAnsi="Times New Roman" w:cs="Times New Roman"/>
+          <w:sz w:val="24"/>
+          <w:szCs w:val="24"/>
+        </w:rPr>
+        <w:t xml:space="preserve"> bản ghi giao dịch trong giai đoạn từ năm 2011 đến 2014. Dữ liệu bao phủ nhiều khu vực thị trường trên toàn cầu như Mỹ, Châu Âu, Châu Á - Thái Bình Dương và Châu Mỹ Latinh. </w:t>
       </w:r>
     </w:p>
     <w:p>
@@ -15271,6 +15287,7 @@
   <w:style w:type="character" w:default="1" w:styleId="DefaultParagraphFont">
     <w:name w:val="Default Paragraph Font"/>
     <w:uiPriority w:val="1"/>
+    <w:semiHidden/>
     <w:unhideWhenUsed/>
   </w:style>
   <w:style w:type="table" w:default="1" w:styleId="TableNormal">

</xml_diff>